<commit_message>
v2.2: base científica pública en PDF, cifosis severa y cirugía torácica
- Base Científica v0.2: sección 13 de fármacos (VALIDADA) integrada,
  bibliografía ampliada, secciones renumeradas; Word regenerado para
  la revisión de Enrique (portadas configurables por documento)
- Edición PÚBLICA de la base científica: docs/herramientas/
  publicar-base.sh genera base-cientifica.pdf sin la cocina interna de
  revisión (formulario de decisiones, correcciones y referencias D-x),
  enlazado desde Docencia → Bibliografía y la FAQ — transparencia
- Modificadores anatómicos nuevos: cifosis severa (CPT reducida: IPAP
  altas, Ti largo, vía aérea difícil) y cirugía torácica previa (Vt
  bajo, asimetría, umbral bajo para neumotórax), con tests (25/25)
- Changelog v2.2; SW a v2.2.0 (el PDF se cachea para uso offline)

Co-Authored-By: Claude Fable 5 <noreply@anthropic.com>
</commit_message>
<xml_diff>
--- a/docs/BASE_CIENTIFICA.docx
+++ b/docs/BASE_CIENTIFICA.docx
@@ -49,7 +49,7 @@
           <w:sz w:val="24"/>
           <w:szCs w:val="24"/>
         </w:rPr>
-        <w:t xml:space="preserve">Ventilación Mecánica No Invasiva: diagnóstico, indicación, programación, seguimiento y resolución de problemas</w:t>
+        <w:t xml:space="preserve">Ventilación Mecánica No Invasiva: diagnóstico, indicación, programación, fármacos, seguimiento y resolución de problemas</w:t>
       </w:r>
     </w:p>
     <w:p>
@@ -65,7 +65,7 @@
           <w:sz w:val="24"/>
           <w:szCs w:val="24"/>
         </w:rPr>
-        <w:t xml:space="preserve">Versión 0.1 — borrador para revisión científica</w:t>
+        <w:t xml:space="preserve">Versión 0.2 — sección de fármacos VALIDADA (27-10-2026); decisiones D-1 a D-16 pendientes de revisión</w:t>
       </w:r>
     </w:p>
     <w:p>
@@ -147,7 +147,7 @@
           <w:sz w:val="19"/>
           <w:szCs w:val="19"/>
         </w:rPr>
-        <w:t xml:space="preserve">Documento de apoyo a la decisión clínica. No sustituye el criterio del profesional ni los protocolos del centro. Fuente de verdad del motor de decisión de la app VMNI Urgencias: ninguna recomendación entra en la app sin estar validada aquí.</w:t>
+        <w:t xml:space="preserve">Documento de apoyo a la decisión clínica. No sustituye el criterio del profesional ni los protocolos del centro. Fuente de verdad del motor de decisión de la app VMNI Urgencias: ninguna recomendación entra en la app sin estar validada aquí. El formulario de las 16 decisiones (sección 14) espera la revisión de Enrique Fernández Romero.</w:t>
       </w:r>
     </w:p>
     <w:p>
@@ -176,6 +176,10 @@
     <w:sdt>
       <w:sdtPr>
         <w:alias w:val="Índice"/>
+        <w:docPartObj>
+          <w:docPartGallery w:val="Table of Contents"/>
+          <w:docPartUnique/>
+        </w:docPartObj>
       </w:sdtPr>
       <w:sdtContent>
         <w:p>
@@ -456,7 +460,7 @@
           </w:pPr>
           <w:hyperlink w:history="1" w:anchor="_Toc13">
             <w:r>
-              <w:t xml:space="preserve">13. Decisiones abiertas para revisión (Carlos + Enrique)</w:t>
+              <w:t xml:space="preserve">13. Tratamiento farmacológico por escenario — VALIDADO (27-10-2026)</w:t>
             </w:r>
             <w:r>
               <w:tab/>
@@ -478,7 +482,7 @@
           </w:pPr>
           <w:hyperlink w:history="1" w:anchor="_Toc14">
             <w:r>
-              <w:t xml:space="preserve">14. Bibliografía</w:t>
+              <w:t xml:space="preserve">14. Decisiones abiertas para revisión (Carlos + Enrique)</w:t>
             </w:r>
             <w:r>
               <w:tab/>
@@ -500,7 +504,7 @@
           </w:pPr>
           <w:hyperlink w:history="1" w:anchor="_Toc15">
             <w:r>
-              <w:t xml:space="preserve">15. Correcciones al borrador inicial</w:t>
+              <w:t xml:space="preserve">15. Bibliografía</w:t>
             </w:r>
             <w:r>
               <w:tab/>
@@ -522,7 +526,7 @@
           </w:pPr>
           <w:hyperlink w:history="1" w:anchor="_Toc16">
             <w:r>
-              <w:t xml:space="preserve">Anexo A. Glosario de siglas y acrónimos</w:t>
+              <w:t xml:space="preserve">16. Correcciones al borrador inicial</w:t>
             </w:r>
             <w:r>
               <w:tab/>
@@ -530,6 +534,28 @@
             <w:r>
               <w:fldChar w:fldCharType="begin" w:dirty="true"/>
               <w:instrText xml:space="preserve">PAGEREF _Toc16 \h</w:instrText>
+              <w:fldChar w:fldCharType="separate"/>
+              <w:fldChar w:fldCharType="end"/>
+            </w:r>
+          </w:hyperlink>
+        </w:p>
+        <w:p>
+          <w:pPr>
+            <w:pStyle w:val="TOC2"/>
+            <w:tabs>
+              <w:tab w:val="right" w:pos="9638" w:leader="dot"/>
+            </w:tabs>
+          </w:pPr>
+          <w:hyperlink w:history="1" w:anchor="_Toc17">
+            <w:r>
+              <w:t xml:space="preserve">Anexo A. Glosario de siglas y acrónimos</w:t>
+            </w:r>
+            <w:r>
+              <w:tab/>
+            </w:r>
+            <w:r>
+              <w:fldChar w:fldCharType="begin" w:dirty="true"/>
+              <w:instrText xml:space="preserve">PAGEREF _Toc17 \h</w:instrText>
               <w:fldChar w:fldCharType="separate"/>
               <w:fldChar w:fldCharType="end"/>
             </w:r>
@@ -13668,9 +13694,386 @@
       </w:pPr>
       <w:bookmarkStart w:name="_Toc13" w:id="13"/>
       <w:r>
-        <w:t xml:space="preserve">13. Decisiones abiertas para revisión (Carlos + Enrique)</w:t>
+        <w:t xml:space="preserve">13. Tratamiento farmacológico por escenario — VALIDADO (27-10-2026)</w:t>
       </w:r>
       <w:bookmarkEnd w:id="13"/>
+    </w:p>
+    <w:p>
+      <w:pPr>
+        <w:pBdr>
+          <w:left w:val="single" w:color="2A7F8E" w:sz="24"/>
+        </w:pBdr>
+        <w:shd w:fill="EAF3F5" w:val="clear"/>
+        <w:spacing w:after="60" w:before="60"/>
+        <w:ind w:left="360"/>
+      </w:pPr>
+      <w:r>
+        <w:rPr>
+          <w:b/>
+          <w:bCs/>
+          <w:color w:val="333333"/>
+          <w:sz w:val="19"/>
+          <w:szCs w:val="19"/>
+        </w:rPr>
+        <w:t xml:space="preserve">Recomendaciones generales</w:t>
+      </w:r>
+      <w:r>
+        <w:rPr>
+          <w:color w:val="333333"/>
+          <w:sz w:val="19"/>
+          <w:szCs w:val="19"/>
+        </w:rPr>
+        <w:t xml:space="preserve"> según guías aceptadas (GesEPOC 2021, GOLD, ESC 2021, GINA/GEMA, BTS). </w:t>
+      </w:r>
+      <w:r>
+        <w:rPr>
+          <w:b/>
+          <w:bCs/>
+          <w:color w:val="333333"/>
+          <w:sz w:val="19"/>
+          <w:szCs w:val="19"/>
+        </w:rPr>
+        <w:t xml:space="preserve">No sustituyen la valoración individual</w:t>
+      </w:r>
+      <w:r>
+        <w:rPr>
+          <w:color w:val="333333"/>
+          <w:sz w:val="19"/>
+          <w:szCs w:val="19"/>
+        </w:rPr>
+        <w:t xml:space="preserve">: alergias, antecedentes, enfermedades concomitantes, interacciones, función renal/hepática, embarazo, y los protocolos y mapa de resistencias del centro. Dosis orientativas de adulto. </w:t>
+      </w:r>
+      <w:r>
+        <w:rPr>
+          <w:b/>
+          <w:bCs/>
+          <w:color w:val="333333"/>
+          <w:sz w:val="19"/>
+          <w:szCs w:val="19"/>
+        </w:rPr>
+        <w:t xml:space="preserve">La app aconseja: la decisión de prescribir, ajustar o retirar es siempre del profesional.</w:t>
+      </w:r>
+      <w:r>
+        <w:rPr>
+          <w:color w:val="333333"/>
+          <w:sz w:val="19"/>
+          <w:szCs w:val="19"/>
+        </w:rPr>
+        <w:t xml:space="preserve"> Detalle completo en </w:t>
+      </w:r>
+      <w:r>
+        <w:rPr>
+          <w:rFonts w:ascii="Menlo" w:cs="Menlo" w:eastAsia="Menlo" w:hAnsi="Menlo"/>
+          <w:color w:val="16697A"/>
+          <w:sz w:val="18"/>
+          <w:szCs w:val="18"/>
+        </w:rPr>
+        <w:t xml:space="preserve">docs/FARMACOS.md</w:t>
+      </w:r>
+      <w:r>
+        <w:rPr>
+          <w:color w:val="333333"/>
+          <w:sz w:val="19"/>
+          <w:szCs w:val="19"/>
+        </w:rPr>
+        <w:t xml:space="preserve">.</w:t>
+      </w:r>
+    </w:p>
+    <w:p>
+      <w:pPr>
+        <w:pStyle w:val="Heading3"/>
+        <w:spacing w:after="140" w:before="280"/>
+      </w:pPr>
+      <w:r>
+        <w:t xml:space="preserve">13.1 Agudización de EPOC </w:t>
+      </w:r>
+      <w:r>
+        <w:rPr>
+          <w:i/>
+          <w:iCs/>
+        </w:rPr>
+        <w:t xml:space="preserve">(GOLD · GesEPOC)</w:t>
+      </w:r>
+    </w:p>
+    <w:p>
+      <w:pPr>
+        <w:spacing w:after="100"/>
+      </w:pPr>
+      <w:r>
+        <w:t xml:space="preserve">Salbutamol ± ipratropio nebulizado (2,5–5 mg + 0,5 mg cada 20–30 min la 1.ª hora, luego /4–6 h; </w:t>
+      </w:r>
+      <w:r>
+        <w:rPr>
+          <w:b/>
+          <w:bCs/>
+        </w:rPr>
+        <w:t xml:space="preserve">sin interrumpir la VNI</w:t>
+      </w:r>
+      <w:r>
+        <w:t xml:space="preserve">: malla en T) · </w:t>
+      </w:r>
+      <w:r>
+        <w:rPr>
+          <w:b/>
+          <w:bCs/>
+        </w:rPr>
+        <w:t xml:space="preserve">Prednisona 40 mg vo 5 días</w:t>
+      </w:r>
+      <w:r>
+        <w:t xml:space="preserve"> (metilprednisolona IV si no vo; mayor eficacia con eosinófilos ≥300) · Antibiótico si purulencia (Anthonisen ≥2), PCR ≥20 </w:t>
+      </w:r>
+      <w:r>
+        <w:rPr>
+          <w:b/>
+          <w:bCs/>
+        </w:rPr>
+        <w:t xml:space="preserve">o necesidad de VNI</w:t>
+      </w:r>
+      <w:r>
+        <w:t xml:space="preserve"> (que por sí sola lo indica): amoxicilina-clavulánico 875/125 /8 h 5–7 días, ajustado al mapa local · HBPM profiláctica. </w:t>
+      </w:r>
+      <w:r>
+        <w:rPr>
+          <w:b/>
+          <w:bCs/>
+        </w:rPr>
+        <w:t xml:space="preserve">Evitar:</w:t>
+      </w:r>
+      <w:r>
+        <w:t xml:space="preserve"> metilxantinas de rutina, O₂ sin control.</w:t>
+      </w:r>
+    </w:p>
+    <w:p>
+      <w:pPr>
+        <w:pStyle w:val="Heading3"/>
+        <w:spacing w:after="140" w:before="280"/>
+      </w:pPr>
+      <w:r>
+        <w:t xml:space="preserve">13.2 EAP / IC aguda </w:t>
+      </w:r>
+      <w:r>
+        <w:rPr>
+          <w:i/>
+          <w:iCs/>
+        </w:rPr>
+        <w:t xml:space="preserve">(ESC 2021)</w:t>
+      </w:r>
+    </w:p>
+    <w:p>
+      <w:pPr>
+        <w:spacing w:after="100"/>
+      </w:pPr>
+      <w:r>
+        <w:rPr>
+          <w:b/>
+          <w:bCs/>
+        </w:rPr>
+        <w:t xml:space="preserve">Furosemida IV 20–40 mg en bolo</w:t>
+      </w:r>
+      <w:r>
+        <w:t xml:space="preserve"> (o 1–2× su dosis oral), repetir/perfusión según respuesta · NTG sl/IV (10–20 µg/min titulando) </w:t>
+      </w:r>
+      <w:r>
+        <w:rPr>
+          <w:b/>
+          <w:bCs/>
+        </w:rPr>
+        <w:t xml:space="preserve">solo si TAS &gt;110</w:t>
+      </w:r>
+      <w:r>
+        <w:t xml:space="preserve"> (evitar en TAS &lt;100, estenosis aórtica grave, IAM de VD) · </w:t>
+      </w:r>
+      <w:r>
+        <w:rPr>
+          <w:b/>
+          <w:bCs/>
+        </w:rPr>
+        <w:t xml:space="preserve">Morfina NO rutinaria</w:t>
+      </w:r>
+      <w:r>
+        <w:t xml:space="preserve"> (2,5–5 mg solo disnea/ansiedad refractarias: su uso rutinario se asocia a peor pronóstico) · tratar el desencadenante (SCA, arritmia, crisis HTA) · HBPM.</w:t>
+      </w:r>
+    </w:p>
+    <w:p>
+      <w:pPr>
+        <w:pStyle w:val="Heading3"/>
+        <w:spacing w:after="140" w:before="280"/>
+      </w:pPr>
+      <w:r>
+        <w:t xml:space="preserve">13.3 Crisis asmática grave </w:t>
+      </w:r>
+      <w:r>
+        <w:rPr>
+          <w:i/>
+          <w:iCs/>
+        </w:rPr>
+        <w:t xml:space="preserve">(GINA · GEMA)</w:t>
+      </w:r>
+    </w:p>
+    <w:p>
+      <w:pPr>
+        <w:spacing w:after="100"/>
+      </w:pPr>
+      <w:r>
+        <w:t xml:space="preserve">SpO₂ objetivo </w:t>
+      </w:r>
+      <w:r>
+        <w:rPr>
+          <w:b/>
+          <w:bCs/>
+        </w:rPr>
+        <w:t xml:space="preserve">93–95%</w:t>
+      </w:r>
+      <w:r>
+        <w:t xml:space="preserve"> · salbutamol 4–10 puls./20 min la 1.ª hora (o neb 2,5–5 mg ×3) </w:t>
+      </w:r>
+      <w:r>
+        <w:rPr>
+          <w:b/>
+          <w:bCs/>
+        </w:rPr>
+        <w:t xml:space="preserve">+ ipratropio 0,5 mg en la grave</w:t>
+      </w:r>
+      <w:r>
+        <w:t xml:space="preserve"> · </w:t>
+      </w:r>
+      <w:r>
+        <w:rPr>
+          <w:b/>
+          <w:bCs/>
+        </w:rPr>
+        <w:t xml:space="preserve">corticoide sistémico en la 1.ª hora</w:t>
+      </w:r>
+      <w:r>
+        <w:t xml:space="preserve"> (prednisona 40–50 mg vo o hidrocortisona 100–200 mg IV) · </w:t>
+      </w:r>
+      <w:r>
+        <w:rPr>
+          <w:b/>
+          <w:bCs/>
+        </w:rPr>
+        <w:t xml:space="preserve">sulfato de magnesio 2 g IV en 20 min</w:t>
+      </w:r>
+      <w:r>
+        <w:t xml:space="preserve"> solo en la grave sin respuesta. </w:t>
+      </w:r>
+      <w:r>
+        <w:rPr>
+          <w:b/>
+          <w:bCs/>
+        </w:rPr>
+        <w:t xml:space="preserve">Evitar:</w:t>
+      </w:r>
+      <w:r>
+        <w:t xml:space="preserve"> sedantes fuera de la UCI.</w:t>
+      </w:r>
+    </w:p>
+    <w:p>
+      <w:pPr>
+        <w:pStyle w:val="Heading3"/>
+        <w:spacing w:after="140" w:before="280"/>
+      </w:pPr>
+      <w:r>
+        <w:t xml:space="preserve">13.4 Sobredosis de depresores </w:t>
+      </w:r>
+      <w:r>
+        <w:rPr>
+          <w:i/>
+          <w:iCs/>
+        </w:rPr>
+        <w:t xml:space="preserve">(rama A)</w:t>
+      </w:r>
+    </w:p>
+    <w:p>
+      <w:pPr>
+        <w:spacing w:after="100"/>
+      </w:pPr>
+      <w:r>
+        <w:rPr>
+          <w:b/>
+          <w:bCs/>
+        </w:rPr>
+        <w:t xml:space="preserve">Primero ventilar.</w:t>
+      </w:r>
+      <w:r>
+        <w:t xml:space="preserve"> Naloxona 0,04–0,1 mg IV cada 2–3 min </w:t>
+      </w:r>
+      <w:r>
+        <w:rPr>
+          <w:b/>
+          <w:bCs/>
+        </w:rPr>
+        <w:t xml:space="preserve">titulando hasta FR ≥10</w:t>
+      </w:r>
+      <w:r>
+        <w:t xml:space="preserve"> (no hasta despertar); opioides largos → perfusión (~2/3 de la dosis eficaz/h); vigilancia prolongada · Flumazenilo de uso </w:t>
+      </w:r>
+      <w:r>
+        <w:rPr>
+          <w:b/>
+          <w:bCs/>
+        </w:rPr>
+        <w:t xml:space="preserve">excepcional</w:t>
+      </w:r>
+      <w:r>
+        <w:t xml:space="preserve"> (0,2 mg IV lentos, máx. 1–2 mg): </w:t>
+      </w:r>
+      <w:r>
+        <w:rPr>
+          <w:b/>
+          <w:bCs/>
+        </w:rPr>
+        <w:t xml:space="preserve">contraindicado</w:t>
+      </w:r>
+      <w:r>
+        <w:t xml:space="preserve"> en dependencia de BZD, coingesta proconvulsivante o epilepsia.</w:t>
+      </w:r>
+    </w:p>
+    <w:p>
+      <w:pPr>
+        <w:pStyle w:val="Heading3"/>
+        <w:spacing w:after="140" w:before="280"/>
+      </w:pPr>
+      <w:r>
+        <w:t xml:space="preserve">13.5 Coadyuvantes durante la VNI</w:t>
+      </w:r>
+    </w:p>
+    <w:p>
+      <w:pPr>
+        <w:spacing w:after="100"/>
+      </w:pPr>
+      <w:r>
+        <w:t xml:space="preserve">Nebulización sin interrumpir la VNI · morfina 2,5–5 mg IV titulada en intolerancia (BTS, solo entorno monitorizado) · HBPM en el encamado · los cuidados de confort de la §10.</w:t>
+      </w:r>
+    </w:p>
+    <w:p>
+      <w:pPr>
+        <w:pStyle w:val="Heading3"/>
+        <w:spacing w:after="140" w:before="280"/>
+      </w:pPr>
+      <w:r>
+        <w:t xml:space="preserve">13.6 Ajustes locales pendientes</w:t>
+      </w:r>
+    </w:p>
+    <w:p>
+      <w:pPr>
+        <w:spacing w:after="100"/>
+      </w:pPr>
+      <w:r>
+        <w:t xml:space="preserve">Antibiótico empírico según el mapa de resistencias del área (F-1) y cotejo fino de las clases ESC (F-2); el resto de decisiones F-3…F-7 quedaron resueltas con la validación del documento de fármacos.</w:t>
+      </w:r>
+    </w:p>
+    <w:p>
+      <w:pPr>
+        <w:pStyle w:val="Heading2"/>
+        <w:pageBreakBefore/>
+        <w:spacing w:after="140" w:before="280"/>
+      </w:pPr>
+      <w:bookmarkStart w:name="_Toc14" w:id="14"/>
+      <w:r>
+        <w:t xml:space="preserve">14. Decisiones abiertas para revisión (Carlos + Enrique)</w:t>
+      </w:r>
+      <w:bookmarkEnd w:id="14"/>
     </w:p>
     <w:p>
       <w:pPr>
@@ -16697,313 +17100,9 @@
         <w:pageBreakBefore/>
         <w:spacing w:after="140" w:before="280"/>
       </w:pPr>
-      <w:bookmarkStart w:name="_Toc14" w:id="14"/>
-      <w:r>
-        <w:t xml:space="preserve">14. Bibliografía</w:t>
-      </w:r>
-      <w:bookmarkEnd w:id="14"/>
-    </w:p>
-    <w:p>
-      <w:pPr>
-        <w:pStyle w:val="ListParagraph"/>
-        <w:numPr>
-          <w:ilvl w:val="0"/>
-          <w:numId w:val="2"/>
-        </w:numPr>
-        <w:spacing w:after="60"/>
-      </w:pPr>
-      <w:r>
-        <w:t xml:space="preserve">ATS. Noninvasive Respiratory Support for Adult Patients with Acute Respiratory Failure: An Official American Thoracic Society Clinical Practice Guideline. Am J Respir Crit Care Med 2026;212:2135. doi:10.1093/ajrccm/aamag302.</w:t>
-      </w:r>
-    </w:p>
-    <w:p>
-      <w:pPr>
-        <w:pStyle w:val="ListParagraph"/>
-        <w:numPr>
-          <w:ilvl w:val="0"/>
-          <w:numId w:val="2"/>
-        </w:numPr>
-        <w:spacing w:after="60"/>
-      </w:pPr>
-      <w:r>
-        <w:t xml:space="preserve">Rochwerg B et al. Official ERS/ATS clinical practice guidelines: noninvasive ventilation for acute respiratory failure. Eur Respir J 2017;50:1602426.</w:t>
-      </w:r>
-    </w:p>
-    <w:p>
-      <w:pPr>
-        <w:pStyle w:val="ListParagraph"/>
-        <w:numPr>
-          <w:ilvl w:val="0"/>
-          <w:numId w:val="2"/>
-        </w:numPr>
-        <w:spacing w:after="60"/>
-      </w:pPr>
-      <w:r>
-        <w:t xml:space="preserve">Davidson AC et al. BTS/ICS guideline for the ventilatory management of acute hypercapnic respiratory failure in adults. Thorax 2016;71(Supl 2):ii1–ii35.</w:t>
-      </w:r>
-    </w:p>
-    <w:p>
-      <w:pPr>
-        <w:pStyle w:val="ListParagraph"/>
-        <w:numPr>
-          <w:ilvl w:val="0"/>
-          <w:numId w:val="2"/>
-        </w:numPr>
-        <w:spacing w:after="60"/>
-      </w:pPr>
-      <w:r>
-        <w:t xml:space="preserve">Luján M, Peñuelas Ó, Cinesi C et al. Sumario de recomendaciones… VNI y TAFCN en IRA grave (SEPAR/SEMICYUC/SEMES/SECIP/SENeo/SEDAR/SENP). Med Intensiva 2021;45:298-312 (+ documento extenso).</w:t>
-      </w:r>
-    </w:p>
-    <w:p>
-      <w:pPr>
-        <w:pStyle w:val="ListParagraph"/>
-        <w:numPr>
-          <w:ilvl w:val="0"/>
-          <w:numId w:val="2"/>
-        </w:numPr>
-        <w:spacing w:after="60"/>
-      </w:pPr>
-      <w:r>
-        <w:t xml:space="preserve">GOLD. Global Strategy for the Diagnosis, Management, and Prevention of COPD. Report 2026. goldcopd.org. </w:t>
-      </w:r>
-      <w:r>
-        <w:rPr>
-          <w:i/>
-          <w:iCs/>
-        </w:rPr>
-        <w:t xml:space="preserve">(Umbral NIV: pH ≤7,35 y/o PaCO2 ≥45 mmHg + disnea con fatiga/↑trabajo — verificar texto 2026.)</w:t>
-      </w:r>
-    </w:p>
-    <w:p>
-      <w:pPr>
-        <w:pStyle w:val="ListParagraph"/>
-        <w:numPr>
-          <w:ilvl w:val="0"/>
-          <w:numId w:val="2"/>
-        </w:numPr>
-        <w:spacing w:after="60"/>
-      </w:pPr>
-      <w:r>
-        <w:t xml:space="preserve">McDonagh TA et al. 2021 ESC Guidelines for the diagnosis and treatment of acute and chronic heart failure. Eur Heart J 2021;42:3599-3726.</w:t>
-      </w:r>
-    </w:p>
-    <w:p>
-      <w:pPr>
-        <w:pStyle w:val="ListParagraph"/>
-        <w:numPr>
-          <w:ilvl w:val="0"/>
-          <w:numId w:val="2"/>
-        </w:numPr>
-        <w:spacing w:after="60"/>
-      </w:pPr>
-      <w:r>
-        <w:t xml:space="preserve">Osadnik CR et al. Cochrane Database Syst Rev 2017;7:CD004104 (VNI en EPOC).</w:t>
-      </w:r>
-    </w:p>
-    <w:p>
-      <w:pPr>
-        <w:pStyle w:val="ListParagraph"/>
-        <w:numPr>
-          <w:ilvl w:val="0"/>
-          <w:numId w:val="2"/>
-        </w:numPr>
-        <w:spacing w:after="60"/>
-      </w:pPr>
-      <w:r>
-        <w:t xml:space="preserve">Berbenetz N et al. Cochrane Database Syst Rev 2019:CD005351 (CPAP/binivel en EAP).</w:t>
-      </w:r>
-    </w:p>
-    <w:p>
-      <w:pPr>
-        <w:pStyle w:val="ListParagraph"/>
-        <w:numPr>
-          <w:ilvl w:val="0"/>
-          <w:numId w:val="2"/>
-        </w:numPr>
-        <w:spacing w:after="60"/>
-      </w:pPr>
-      <w:r>
-        <w:t xml:space="preserve">Lim WJ et al. Cochrane Database Syst Rev 2012:CD004360 (VNI en asma).</w:t>
-      </w:r>
-    </w:p>
-    <w:p>
-      <w:pPr>
-        <w:pStyle w:val="ListParagraph"/>
-        <w:numPr>
-          <w:ilvl w:val="0"/>
-          <w:numId w:val="2"/>
-        </w:numPr>
-        <w:spacing w:after="60"/>
-      </w:pPr>
-      <w:r>
-        <w:t xml:space="preserve">Homer-Bouthiette C, Wilson KC. Noninvasive Ventilation in Acute Asthma Exacerbations: A Systematic Review. Ann Am Thorac Soc 2025;22:776-784.</w:t>
-      </w:r>
-    </w:p>
-    <w:p>
-      <w:pPr>
-        <w:pStyle w:val="ListParagraph"/>
-        <w:numPr>
-          <w:ilvl w:val="0"/>
-          <w:numId w:val="2"/>
-        </w:numPr>
-        <w:spacing w:after="60"/>
-      </w:pPr>
-      <w:r>
-        <w:t xml:space="preserve">Sellarés J et al. Discontinuing noninvasive ventilation in severe COPD exacerbations: a randomised controlled trial. Eur Respir J 2017;50:1601448.</w:t>
-      </w:r>
-    </w:p>
-    <w:p>
-      <w:pPr>
-        <w:pStyle w:val="ListParagraph"/>
-        <w:numPr>
-          <w:ilvl w:val="0"/>
-          <w:numId w:val="2"/>
-        </w:numPr>
-        <w:spacing w:after="60"/>
-      </w:pPr>
-      <w:r>
-        <w:t xml:space="preserve">Duan J et al. HACOR score (derivación y validaciones, 2017-2022). Intensive Care Med 2017;43:192-199; Ann Intensive Care 2019;9:108.</w:t>
-      </w:r>
-    </w:p>
-    <w:p>
-      <w:pPr>
-        <w:pStyle w:val="ListParagraph"/>
-        <w:numPr>
-          <w:ilvl w:val="0"/>
-          <w:numId w:val="2"/>
-        </w:numPr>
-        <w:spacing w:after="60"/>
-      </w:pPr>
-      <w:r>
-        <w:t xml:space="preserve">Mal S et al. Out-of-hospital NIPPV in severe respiratory distress: systematic review and meta-analysis. Ann Emerg Med 2014;63:600-607.</w:t>
-      </w:r>
-    </w:p>
-    <w:p>
-      <w:pPr>
-        <w:pStyle w:val="ListParagraph"/>
-        <w:numPr>
-          <w:ilvl w:val="0"/>
-          <w:numId w:val="2"/>
-        </w:numPr>
-        <w:spacing w:after="60"/>
-      </w:pPr>
-      <w:r>
-        <w:t xml:space="preserve">Rice TW et al. Comparison of the SpO2/FiO2 ratio and the PaO2/FiO2 ratio (ARDSNet). Chest 2007;132:410-417.</w:t>
-      </w:r>
-    </w:p>
-    <w:p>
-      <w:pPr>
-        <w:pStyle w:val="ListParagraph"/>
-        <w:numPr>
-          <w:ilvl w:val="0"/>
-          <w:numId w:val="2"/>
-        </w:numPr>
-        <w:spacing w:after="60"/>
-      </w:pPr>
-      <w:r>
-        <w:t xml:space="preserve">Kelly AM et al. Agreement between arterial and venous blood gases (pH/HCO3) en agudos; Razi E et al. (pCO2 venosa, 2007).</w:t>
-      </w:r>
-    </w:p>
-    <w:p>
-      <w:pPr>
-        <w:pStyle w:val="ListParagraph"/>
-        <w:numPr>
-          <w:ilvl w:val="0"/>
-          <w:numId w:val="2"/>
-        </w:numPr>
-        <w:spacing w:after="60"/>
-      </w:pPr>
-      <w:r>
-        <w:t xml:space="preserve">Masip J et al. Indications and practical approach to non-invasive ventilation in acute heart failure. Eur Heart J 2018;39:17-25.</w:t>
-      </w:r>
-    </w:p>
-    <w:p>
-      <w:pPr>
-        <w:pStyle w:val="ListParagraph"/>
-        <w:numPr>
-          <w:ilvl w:val="0"/>
-          <w:numId w:val="2"/>
-        </w:numPr>
-        <w:spacing w:after="60"/>
-      </w:pPr>
-      <w:r>
-        <w:t xml:space="preserve">Artacho R et al. Manual de Soporte Respiratorio (cap. VMNI en fallo respiratorio agudo) y material didáctico asociado (Inicio VMNI; VMNI en EPOC: corrección de problemas).</w:t>
-      </w:r>
-    </w:p>
-    <w:p>
-      <w:pPr>
-        <w:pStyle w:val="ListParagraph"/>
-        <w:numPr>
-          <w:ilvl w:val="0"/>
-          <w:numId w:val="2"/>
-        </w:numPr>
-        <w:spacing w:after="60"/>
-      </w:pPr>
-      <w:r>
-        <w:t xml:space="preserve">Carratalá JM (coord.). Foster: Manual de ventilación mecánica no invasiva y alto flujo. 2020.</w:t>
-      </w:r>
-    </w:p>
-    <w:p>
-      <w:pPr>
-        <w:pStyle w:val="ListParagraph"/>
-        <w:numPr>
-          <w:ilvl w:val="0"/>
-          <w:numId w:val="2"/>
-        </w:numPr>
-        <w:spacing w:after="60"/>
-      </w:pPr>
-      <w:r>
-        <w:t xml:space="preserve">Manual de VMNI del HUGCR; Fundamentos de VMNI (grupo VNI de SEMES); Neumosur (caps. 13-14, 3ª ed.).</w:t>
-      </w:r>
-    </w:p>
-    <w:p>
-      <w:pPr>
-        <w:pStyle w:val="ListParagraph"/>
-        <w:numPr>
-          <w:ilvl w:val="0"/>
-          <w:numId w:val="2"/>
-        </w:numPr>
-        <w:spacing w:after="60"/>
-      </w:pPr>
-      <w:r>
-        <w:t xml:space="preserve">Thys F, Liistro G et al. FiO2 estimada en ventiladores sin mezclador (tabla reproducida en Rev Am Med Resp 2021).</w:t>
-      </w:r>
-    </w:p>
-    <w:p>
-      <w:pPr>
-        <w:pStyle w:val="ListParagraph"/>
-        <w:numPr>
-          <w:ilvl w:val="0"/>
-          <w:numId w:val="2"/>
-        </w:numPr>
-        <w:spacing w:after="60"/>
-      </w:pPr>
-      <w:r>
-        <w:t xml:space="preserve">Cano Ballesteros JC. VNI en la IRA en urgencias: aplicabilidad y pronóstico. Tesis doctoral UCM, 2019.</w:t>
-      </w:r>
-    </w:p>
-    <w:p>
-      <w:pPr>
-        <w:pStyle w:val="ListParagraph"/>
-        <w:numPr>
-          <w:ilvl w:val="0"/>
-          <w:numId w:val="2"/>
-        </w:numPr>
-        <w:spacing w:after="60"/>
-      </w:pPr>
-      <w:r>
-        <w:t xml:space="preserve">Carrera Cueva C et al. Cap. 1309 Ventilación Mecánica No Invasiva (manual de urgencias, "RespVMNI").</w:t>
-      </w:r>
-    </w:p>
-    <w:p>
-      <w:pPr>
-        <w:pStyle w:val="Heading2"/>
-        <w:spacing w:after="140" w:before="280"/>
-      </w:pPr>
       <w:bookmarkStart w:name="_Toc15" w:id="15"/>
       <w:r>
-        <w:t xml:space="preserve">15. Correcciones al borrador inicial</w:t>
+        <w:t xml:space="preserve">15. Bibliografía</w:t>
       </w:r>
       <w:bookmarkEnd w:id="15"/>
     </w:p>
@@ -17017,24 +17116,7 @@
         <w:spacing w:after="60"/>
       </w:pPr>
       <w:r>
-        <w:rPr>
-          <w:b/>
-          <w:bCs/>
-        </w:rPr>
-        <w:t xml:space="preserve">FiO2 gafas nasales:</w:t>
-      </w:r>
-      <w:r>
-        <w:t xml:space="preserve"> «0,21 + 0,3×L/min» → </w:t>
-      </w:r>
-      <w:r>
-        <w:rPr>
-          <w:b/>
-          <w:bCs/>
-        </w:rPr>
-        <w:t xml:space="preserve">0,21 + 0,03–0,04×L/min</w:t>
-      </w:r>
-      <w:r>
-        <w:t xml:space="preserve"> (D-2).</w:t>
+        <w:t xml:space="preserve">ATS. Noninvasive Respiratory Support for Adult Patients with Acute Respiratory Failure: An Official American Thoracic Society Clinical Practice Guideline. Am J Respir Crit Care Med 2026;212:2135. doi:10.1093/ajrccm/aamag302.</w:t>
       </w:r>
     </w:p>
     <w:p>
@@ -17047,24 +17129,7 @@
         <w:spacing w:after="60"/>
       </w:pPr>
       <w:r>
-        <w:rPr>
-          <w:b/>
-          <w:bCs/>
-        </w:rPr>
-        <w:t xml:space="preserve">HCO3:</w:t>
-      </w:r>
-      <w:r>
-        <w:t xml:space="preserve"> se pedía decidir categorías vs absoluto → </w:t>
-      </w:r>
-      <w:r>
-        <w:rPr>
-          <w:b/>
-          <w:bCs/>
-        </w:rPr>
-        <w:t xml:space="preserve">valor absoluto</w:t>
-      </w:r>
-      <w:r>
-        <w:t xml:space="preserve"> (necesario para pH esperado/Winter), con categorías solo visuales.</w:t>
+        <w:t xml:space="preserve">Rochwerg B et al. Official ERS/ATS clinical practice guidelines: noninvasive ventilation for acute respiratory failure. Eur Respir J 2017;50:1602426.</w:t>
       </w:r>
     </w:p>
     <w:p>
@@ -17077,24 +17142,7 @@
         <w:spacing w:after="60"/>
       </w:pPr>
       <w:r>
-        <w:rPr>
-          <w:b/>
-          <w:bCs/>
-        </w:rPr>
-        <w:t xml:space="preserve">«Sat O2 mayor o menor de 98»</w:t>
-      </w:r>
-      <w:r>
-        <w:t xml:space="preserve"> → el umbral operativo es </w:t>
-      </w:r>
-      <w:r>
-        <w:rPr>
-          <w:b/>
-          <w:bCs/>
-        </w:rPr>
-        <w:t xml:space="preserve">SpO2 ≤97%</w:t>
-      </w:r>
-      <w:r>
-        <w:t xml:space="preserve"> para que la SaFi sea válida (por encima, la curva de la hemoglobina se aplana y la SaFi infraestima la gravedad).</w:t>
+        <w:t xml:space="preserve">Davidson AC et al. BTS/ICS guideline for the ventilatory management of acute hypercapnic respiratory failure in adults. Thorax 2016;71(Supl 2):ii1–ii35.</w:t>
       </w:r>
     </w:p>
     <w:p>
@@ -17107,7 +17155,287 @@
         <w:spacing w:after="60"/>
       </w:pPr>
       <w:r>
-        <w:t xml:space="preserve">Añadidos a las entradas: GCS numérico, FC/TA (los exigen HACOR y los criterios de IOT), inmunodepresión, VMNI/CPAP domiciliaria previa.</w:t>
+        <w:t xml:space="preserve">Luján M, Peñuelas Ó, Cinesi C et al. Sumario de recomendaciones… VNI y TAFCN en IRA grave (SEPAR/SEMICYUC/SEMES/SECIP/SENeo/SEDAR/SENP). Med Intensiva 2021;45:298-312 (+ documento extenso).</w:t>
+      </w:r>
+    </w:p>
+    <w:p>
+      <w:pPr>
+        <w:pStyle w:val="ListParagraph"/>
+        <w:numPr>
+          <w:ilvl w:val="0"/>
+          <w:numId w:val="2"/>
+        </w:numPr>
+        <w:spacing w:after="60"/>
+      </w:pPr>
+      <w:r>
+        <w:t xml:space="preserve">GOLD. Global Strategy for the Diagnosis, Management, and Prevention of COPD. Report 2026. goldcopd.org. </w:t>
+      </w:r>
+      <w:r>
+        <w:rPr>
+          <w:i/>
+          <w:iCs/>
+        </w:rPr>
+        <w:t xml:space="preserve">(Umbral NIV: pH ≤7,35 y/o PaCO2 ≥45 mmHg + disnea con fatiga/↑trabajo — verificar texto 2026.)</w:t>
+      </w:r>
+    </w:p>
+    <w:p>
+      <w:pPr>
+        <w:pStyle w:val="ListParagraph"/>
+        <w:numPr>
+          <w:ilvl w:val="0"/>
+          <w:numId w:val="2"/>
+        </w:numPr>
+        <w:spacing w:after="60"/>
+      </w:pPr>
+      <w:r>
+        <w:t xml:space="preserve">McDonagh TA et al. 2021 ESC Guidelines for the diagnosis and treatment of acute and chronic heart failure. Eur Heart J 2021;42:3599-3726.</w:t>
+      </w:r>
+    </w:p>
+    <w:p>
+      <w:pPr>
+        <w:pStyle w:val="ListParagraph"/>
+        <w:numPr>
+          <w:ilvl w:val="0"/>
+          <w:numId w:val="2"/>
+        </w:numPr>
+        <w:spacing w:after="60"/>
+      </w:pPr>
+      <w:r>
+        <w:t xml:space="preserve">Osadnik CR et al. Cochrane Database Syst Rev 2017;7:CD004104 (VNI en EPOC).</w:t>
+      </w:r>
+    </w:p>
+    <w:p>
+      <w:pPr>
+        <w:pStyle w:val="ListParagraph"/>
+        <w:numPr>
+          <w:ilvl w:val="0"/>
+          <w:numId w:val="2"/>
+        </w:numPr>
+        <w:spacing w:after="60"/>
+      </w:pPr>
+      <w:r>
+        <w:t xml:space="preserve">Berbenetz N et al. Cochrane Database Syst Rev 2019:CD005351 (CPAP/binivel en EAP).</w:t>
+      </w:r>
+    </w:p>
+    <w:p>
+      <w:pPr>
+        <w:pStyle w:val="ListParagraph"/>
+        <w:numPr>
+          <w:ilvl w:val="0"/>
+          <w:numId w:val="2"/>
+        </w:numPr>
+        <w:spacing w:after="60"/>
+      </w:pPr>
+      <w:r>
+        <w:t xml:space="preserve">Lim WJ et al. Cochrane Database Syst Rev 2012:CD004360 (VNI en asma).</w:t>
+      </w:r>
+    </w:p>
+    <w:p>
+      <w:pPr>
+        <w:pStyle w:val="ListParagraph"/>
+        <w:numPr>
+          <w:ilvl w:val="0"/>
+          <w:numId w:val="2"/>
+        </w:numPr>
+        <w:spacing w:after="60"/>
+      </w:pPr>
+      <w:r>
+        <w:t xml:space="preserve">Homer-Bouthiette C, Wilson KC. Noninvasive Ventilation in Acute Asthma Exacerbations: A Systematic Review. Ann Am Thorac Soc 2025;22:776-784.</w:t>
+      </w:r>
+    </w:p>
+    <w:p>
+      <w:pPr>
+        <w:pStyle w:val="ListParagraph"/>
+        <w:numPr>
+          <w:ilvl w:val="0"/>
+          <w:numId w:val="2"/>
+        </w:numPr>
+        <w:spacing w:after="60"/>
+      </w:pPr>
+      <w:r>
+        <w:t xml:space="preserve">Sellarés J et al. Discontinuing noninvasive ventilation in severe COPD exacerbations: a randomised controlled trial. Eur Respir J 2017;50:1601448.</w:t>
+      </w:r>
+    </w:p>
+    <w:p>
+      <w:pPr>
+        <w:pStyle w:val="ListParagraph"/>
+        <w:numPr>
+          <w:ilvl w:val="0"/>
+          <w:numId w:val="2"/>
+        </w:numPr>
+        <w:spacing w:after="60"/>
+      </w:pPr>
+      <w:r>
+        <w:t xml:space="preserve">Duan J et al. HACOR score (derivación y validaciones, 2017-2022). Intensive Care Med 2017;43:192-199; Ann Intensive Care 2019;9:108.</w:t>
+      </w:r>
+    </w:p>
+    <w:p>
+      <w:pPr>
+        <w:pStyle w:val="ListParagraph"/>
+        <w:numPr>
+          <w:ilvl w:val="0"/>
+          <w:numId w:val="2"/>
+        </w:numPr>
+        <w:spacing w:after="60"/>
+      </w:pPr>
+      <w:r>
+        <w:t xml:space="preserve">Mal S et al. Out-of-hospital NIPPV in severe respiratory distress: systematic review and meta-analysis. Ann Emerg Med 2014;63:600-607.</w:t>
+      </w:r>
+    </w:p>
+    <w:p>
+      <w:pPr>
+        <w:pStyle w:val="ListParagraph"/>
+        <w:numPr>
+          <w:ilvl w:val="0"/>
+          <w:numId w:val="2"/>
+        </w:numPr>
+        <w:spacing w:after="60"/>
+      </w:pPr>
+      <w:r>
+        <w:t xml:space="preserve">Rice TW et al. Comparison of the SpO2/FiO2 ratio and the PaO2/FiO2 ratio (ARDSNet). Chest 2007;132:410-417.</w:t>
+      </w:r>
+    </w:p>
+    <w:p>
+      <w:pPr>
+        <w:pStyle w:val="ListParagraph"/>
+        <w:numPr>
+          <w:ilvl w:val="0"/>
+          <w:numId w:val="2"/>
+        </w:numPr>
+        <w:spacing w:after="60"/>
+      </w:pPr>
+      <w:r>
+        <w:t xml:space="preserve">Kelly AM et al. Agreement between arterial and venous blood gases (pH/HCO3) en agudos; Razi E et al. (pCO2 venosa, 2007).</w:t>
+      </w:r>
+    </w:p>
+    <w:p>
+      <w:pPr>
+        <w:pStyle w:val="ListParagraph"/>
+        <w:numPr>
+          <w:ilvl w:val="0"/>
+          <w:numId w:val="2"/>
+        </w:numPr>
+        <w:spacing w:after="60"/>
+      </w:pPr>
+      <w:r>
+        <w:t xml:space="preserve">Masip J et al. Indications and practical approach to non-invasive ventilation in acute heart failure. Eur Heart J 2018;39:17-25.</w:t>
+      </w:r>
+    </w:p>
+    <w:p>
+      <w:pPr>
+        <w:pStyle w:val="ListParagraph"/>
+        <w:numPr>
+          <w:ilvl w:val="0"/>
+          <w:numId w:val="2"/>
+        </w:numPr>
+        <w:spacing w:after="60"/>
+      </w:pPr>
+      <w:r>
+        <w:t xml:space="preserve">Artacho R et al. Manual de Soporte Respiratorio (cap. VMNI en fallo respiratorio agudo) y material didáctico asociado (Inicio VMNI; VMNI en EPOC: corrección de problemas).</w:t>
+      </w:r>
+    </w:p>
+    <w:p>
+      <w:pPr>
+        <w:pStyle w:val="ListParagraph"/>
+        <w:numPr>
+          <w:ilvl w:val="0"/>
+          <w:numId w:val="2"/>
+        </w:numPr>
+        <w:spacing w:after="60"/>
+      </w:pPr>
+      <w:r>
+        <w:t xml:space="preserve">Carratalá JM (coord.). Foster: Manual de ventilación mecánica no invasiva y alto flujo. 2020.</w:t>
+      </w:r>
+    </w:p>
+    <w:p>
+      <w:pPr>
+        <w:pStyle w:val="ListParagraph"/>
+        <w:numPr>
+          <w:ilvl w:val="0"/>
+          <w:numId w:val="2"/>
+        </w:numPr>
+        <w:spacing w:after="60"/>
+      </w:pPr>
+      <w:r>
+        <w:t xml:space="preserve">Manual de VMNI del HUGCR; Fundamentos de VMNI (grupo VNI de SEMES); Neumosur (caps. 13-14, 3ª ed.).</w:t>
+      </w:r>
+    </w:p>
+    <w:p>
+      <w:pPr>
+        <w:pStyle w:val="ListParagraph"/>
+        <w:numPr>
+          <w:ilvl w:val="0"/>
+          <w:numId w:val="2"/>
+        </w:numPr>
+        <w:spacing w:after="60"/>
+      </w:pPr>
+      <w:r>
+        <w:t xml:space="preserve">Thys F, Liistro G et al. FiO2 estimada en ventiladores sin mezclador (tabla reproducida en Rev Am Med Resp 2021).</w:t>
+      </w:r>
+    </w:p>
+    <w:p>
+      <w:pPr>
+        <w:pStyle w:val="ListParagraph"/>
+        <w:numPr>
+          <w:ilvl w:val="0"/>
+          <w:numId w:val="2"/>
+        </w:numPr>
+        <w:spacing w:after="60"/>
+      </w:pPr>
+      <w:r>
+        <w:t xml:space="preserve">GesEPOC 2021 — síndrome de agudización de la EPOC. Arch Bronconeumol 2022;58:159-170.</w:t>
+      </w:r>
+    </w:p>
+    <w:p>
+      <w:pPr>
+        <w:pStyle w:val="ListParagraph"/>
+        <w:numPr>
+          <w:ilvl w:val="0"/>
+          <w:numId w:val="2"/>
+        </w:numPr>
+        <w:spacing w:after="60"/>
+      </w:pPr>
+      <w:r>
+        <w:t xml:space="preserve">GINA. Global Strategy for Asthma Management and Prevention (edición vigente). ginasthma.org.</w:t>
+      </w:r>
+    </w:p>
+    <w:p>
+      <w:pPr>
+        <w:pStyle w:val="ListParagraph"/>
+        <w:numPr>
+          <w:ilvl w:val="0"/>
+          <w:numId w:val="2"/>
+        </w:numPr>
+        <w:spacing w:after="60"/>
+      </w:pPr>
+      <w:r>
+        <w:t xml:space="preserve">GEMA — Guía Española para el Manejo del Asma (edición vigente). gemasma.org.</w:t>
+      </w:r>
+    </w:p>
+    <w:p>
+      <w:pPr>
+        <w:pStyle w:val="ListParagraph"/>
+        <w:numPr>
+          <w:ilvl w:val="0"/>
+          <w:numId w:val="2"/>
+        </w:numPr>
+        <w:spacing w:after="60"/>
+      </w:pPr>
+      <w:r>
+        <w:t xml:space="preserve">Cano Ballesteros JC. VNI en la IRA en urgencias: aplicabilidad y pronóstico. Tesis doctoral UCM, 2019.</w:t>
+      </w:r>
+    </w:p>
+    <w:p>
+      <w:pPr>
+        <w:pStyle w:val="ListParagraph"/>
+        <w:numPr>
+          <w:ilvl w:val="0"/>
+          <w:numId w:val="2"/>
+        </w:numPr>
+        <w:spacing w:after="60"/>
+      </w:pPr>
+      <w:r>
+        <w:t xml:space="preserve">Carrera Cueva C et al. Cap. 1309 Ventilación Mecánica No Invasiva (manual de urgencias, "RespVMNI").</w:t>
       </w:r>
     </w:p>
     <w:p>
@@ -17117,9 +17445,123 @@
       </w:pPr>
       <w:bookmarkStart w:name="_Toc16" w:id="16"/>
       <w:r>
+        <w:t xml:space="preserve">16. Correcciones al borrador inicial</w:t>
+      </w:r>
+      <w:bookmarkEnd w:id="16"/>
+    </w:p>
+    <w:p>
+      <w:pPr>
+        <w:pStyle w:val="ListParagraph"/>
+        <w:numPr>
+          <w:ilvl w:val="0"/>
+          <w:numId w:val="2"/>
+        </w:numPr>
+        <w:spacing w:after="60"/>
+      </w:pPr>
+      <w:r>
+        <w:rPr>
+          <w:b/>
+          <w:bCs/>
+        </w:rPr>
+        <w:t xml:space="preserve">FiO2 gafas nasales:</w:t>
+      </w:r>
+      <w:r>
+        <w:t xml:space="preserve"> «0,21 + 0,3×L/min» → </w:t>
+      </w:r>
+      <w:r>
+        <w:rPr>
+          <w:b/>
+          <w:bCs/>
+        </w:rPr>
+        <w:t xml:space="preserve">0,21 + 0,03–0,04×L/min</w:t>
+      </w:r>
+      <w:r>
+        <w:t xml:space="preserve"> (D-2).</w:t>
+      </w:r>
+    </w:p>
+    <w:p>
+      <w:pPr>
+        <w:pStyle w:val="ListParagraph"/>
+        <w:numPr>
+          <w:ilvl w:val="0"/>
+          <w:numId w:val="2"/>
+        </w:numPr>
+        <w:spacing w:after="60"/>
+      </w:pPr>
+      <w:r>
+        <w:rPr>
+          <w:b/>
+          <w:bCs/>
+        </w:rPr>
+        <w:t xml:space="preserve">HCO3:</w:t>
+      </w:r>
+      <w:r>
+        <w:t xml:space="preserve"> se pedía decidir categorías vs absoluto → </w:t>
+      </w:r>
+      <w:r>
+        <w:rPr>
+          <w:b/>
+          <w:bCs/>
+        </w:rPr>
+        <w:t xml:space="preserve">valor absoluto</w:t>
+      </w:r>
+      <w:r>
+        <w:t xml:space="preserve"> (necesario para pH esperado/Winter), con categorías solo visuales.</w:t>
+      </w:r>
+    </w:p>
+    <w:p>
+      <w:pPr>
+        <w:pStyle w:val="ListParagraph"/>
+        <w:numPr>
+          <w:ilvl w:val="0"/>
+          <w:numId w:val="2"/>
+        </w:numPr>
+        <w:spacing w:after="60"/>
+      </w:pPr>
+      <w:r>
+        <w:rPr>
+          <w:b/>
+          <w:bCs/>
+        </w:rPr>
+        <w:t xml:space="preserve">«Sat O2 mayor o menor de 98»</w:t>
+      </w:r>
+      <w:r>
+        <w:t xml:space="preserve"> → el umbral operativo es </w:t>
+      </w:r>
+      <w:r>
+        <w:rPr>
+          <w:b/>
+          <w:bCs/>
+        </w:rPr>
+        <w:t xml:space="preserve">SpO2 ≤97%</w:t>
+      </w:r>
+      <w:r>
+        <w:t xml:space="preserve"> para que la SaFi sea válida (por encima, la curva de la hemoglobina se aplana y la SaFi infraestima la gravedad).</w:t>
+      </w:r>
+    </w:p>
+    <w:p>
+      <w:pPr>
+        <w:pStyle w:val="ListParagraph"/>
+        <w:numPr>
+          <w:ilvl w:val="0"/>
+          <w:numId w:val="2"/>
+        </w:numPr>
+        <w:spacing w:after="60"/>
+      </w:pPr>
+      <w:r>
+        <w:t xml:space="preserve">Añadidos a las entradas: GCS numérico, FC/TA (los exigen HACOR y los criterios de IOT), inmunodepresión, VMNI/CPAP domiciliaria previa.</w:t>
+      </w:r>
+    </w:p>
+    <w:p>
+      <w:pPr>
+        <w:pStyle w:val="Heading2"/>
+        <w:spacing w:after="140" w:before="280"/>
+      </w:pPr>
+      <w:bookmarkStart w:name="_Toc17" w:id="17"/>
+      <w:r>
         <w:t xml:space="preserve">Anexo A. Glosario de siglas y acrónimos</w:t>
       </w:r>
-      <w:bookmarkEnd w:id="16"/>
+      <w:bookmarkEnd w:id="17"/>
     </w:p>
     <w:tbl>
       <w:tblPr>

</xml_diff>

<commit_message>
D-12 reformulada (sin fórmulas propias del Vivo) y vídeos de Artacho descartados
- No existen fórmulas de FiO2 propias del Breas Vivo (ni del fabricante:
  su manual solo limita el O2 a 15 L/min y recomienda monitorizar).
  La app mantiene la tabla de banco (Thys & Liistro) como estimación
  orientativa, con aviso de titular por SpO2 y usar la célula de FiO2
  si el equipo la monta. D-12 queda así para la validación de Enrique.
- Vídeos de Artacho descartados por decisión de Carlos (origen y
  permisos desconocidos): fuera de la hoja de ruta.
- Regenerados BASE_CIENTIFICA.docx (formulario de Enrique) y la
  edición pública base-cientifica.pdf (0 referencias internas).
- SW v2.3.1.

Co-Authored-By: Claude Fable 5 <noreply@anthropic.com>
</commit_message>
<xml_diff>
--- a/docs/BASE_CIENTIFICA.docx
+++ b/docs/BASE_CIENTIFICA.docx
@@ -4455,7 +4455,7 @@
                 <w:sz w:val="18"/>
                 <w:szCs w:val="18"/>
               </w:rPr>
-              <w:t xml:space="preserve">Tabla Thys &amp; Liistro (abajo) + </w:t>
+              <w:t xml:space="preserve">Tabla Thys &amp; Liistro (abajo). </w:t>
             </w:r>
             <w:r>
               <w:rPr>
@@ -4465,7 +4465,15 @@
                 <w:sz w:val="18"/>
                 <w:szCs w:val="18"/>
               </w:rPr>
-              <w:t xml:space="preserve">fórmulas propias de Carlos para Vivo (pendientes de incorporar)</w:t>
+              <w:t xml:space="preserve">No existen fórmulas propias del Vivo</w:t>
+            </w:r>
+            <w:r>
+              <w:rPr>
+                <w:color w:val="222222"/>
+                <w:sz w:val="18"/>
+                <w:szCs w:val="18"/>
+              </w:rPr>
+              <w:t xml:space="preserve">: el fabricante no las publica (su manual solo limita el O2 a 15 L/min y recomienda monitorizar)</w:t>
             </w:r>
           </w:p>
         </w:tc>
@@ -4495,7 +4503,7 @@
                 <w:sz w:val="18"/>
                 <w:szCs w:val="18"/>
               </w:rPr>
-              <w:t xml:space="preserve">La FiO2 real depende de IPAP, flujo de O2, punto de conexión, fuga y patrón ventilatorio</w:t>
+              <w:t xml:space="preserve">La FiO2 real depende de IPAP, flujo de O2, punto de conexión, fuga y patrón ventilatorio → la estimación es orientativa; titular por SpO2 y, si el equipo monta célula de FiO2, usar el valor medido</w:t>
             </w:r>
           </w:p>
         </w:tc>
@@ -13351,25 +13359,7 @@
                 <w:sz w:val="18"/>
                 <w:szCs w:val="18"/>
               </w:rPr>
-              <w:t xml:space="preserve">Modos PSV/PCV/CPAP (± volumen asegurado). O2 por caudalímetro de serie → FiO2 estimada (tabla §2.4 + </w:t>
-            </w:r>
-            <w:r>
-              <w:rPr>
-                <w:b/>
-                <w:bCs/>
-                <w:color w:val="222222"/>
-                <w:sz w:val="18"/>
-                <w:szCs w:val="18"/>
-              </w:rPr>
-              <w:t xml:space="preserve">fórmulas de Carlos, pendientes</w:t>
-            </w:r>
-            <w:r>
-              <w:rPr>
-                <w:color w:val="222222"/>
-                <w:sz w:val="18"/>
-                <w:szCs w:val="18"/>
-              </w:rPr>
-              <w:t xml:space="preserve">)</w:t>
+              <w:t xml:space="preserve">Modos PSV/PCV/CPAP (± volumen asegurado). O2 por caudalímetro de serie → FiO2 estimada con la tabla de banco §2.4 (orientativa); O2 máx. 15 L/min según fabricante; si monta célula de FiO2, prevalece el valor medido</w:t>
             </w:r>
           </w:p>
         </w:tc>
@@ -16207,7 +16197,7 @@
                 <w:sz w:val="21"/>
                 <w:szCs w:val="21"/>
               </w:rPr>
-              <w:t xml:space="preserve">Fórmulas FiO2 del Vivo</w:t>
+              <w:t xml:space="preserve">FiO2 estimada en el Vivo</w:t>
             </w:r>
           </w:p>
         </w:tc>
@@ -16250,14 +16240,14 @@
                 <w:sz w:val="19"/>
                 <w:szCs w:val="19"/>
               </w:rPr>
-              <w:t xml:space="preserve">Carlos las aporta</w:t>
+              <w:t xml:space="preserve">Reformulada (27-10-2026):</w:t>
             </w:r>
             <w:r>
               <w:rPr>
                 <w:sz w:val="19"/>
                 <w:szCs w:val="19"/>
               </w:rPr>
-              <w:t xml:space="preserve"> y sustituyen/complementan la tabla genérica §2.4</w:t>
+              <w:t xml:space="preserve"> no existen fórmulas propias (ni de Carlos ni del fabricante). Propuesta: mantener la tabla de banco §2.4 como estimación orientativa, titular siempre por SpO2 objetivo y, si el equipo monta célula de FiO2, usar el valor medido. ¿Se valida este enfoque?</w:t>
             </w:r>
           </w:p>
           <w:p>
@@ -17550,6 +17540,46 @@
       </w:pPr>
       <w:r>
         <w:t xml:space="preserve">Añadidos a las entradas: GCS numérico, FC/TA (los exigen HACOR y los criterios de IOT), inmunodepresión, VMNI/CPAP domiciliaria previa.</w:t>
+      </w:r>
+    </w:p>
+    <w:p>
+      <w:pPr>
+        <w:pStyle w:val="ListParagraph"/>
+        <w:numPr>
+          <w:ilvl w:val="0"/>
+          <w:numId w:val="2"/>
+        </w:numPr>
+        <w:spacing w:after="60"/>
+      </w:pPr>
+      <w:r>
+        <w:rPr>
+          <w:b/>
+          <w:bCs/>
+        </w:rPr>
+        <w:t xml:space="preserve">D-12 reformulada (27-10-2026):</w:t>
+      </w:r>
+      <w:r>
+        <w:t xml:space="preserve"> las «fórmulas propias del Vivo» no existen — el fabricante no publica ninguna (el manual del Vivo 50 solo limita el O2 a 15 L/min y recomienda monitorizar la concentración) y los estudios de banco confirman que la FiO2 real varía con presiones, fuga y patrón del paciente. La app mantiene la tabla de Thys &amp; Liistro como estimación orientativa con aviso explícito.</w:t>
+      </w:r>
+    </w:p>
+    <w:p>
+      <w:pPr>
+        <w:pStyle w:val="ListParagraph"/>
+        <w:numPr>
+          <w:ilvl w:val="0"/>
+          <w:numId w:val="2"/>
+        </w:numPr>
+        <w:spacing w:after="60"/>
+      </w:pPr>
+      <w:r>
+        <w:rPr>
+          <w:b/>
+          <w:bCs/>
+        </w:rPr>
+        <w:t xml:space="preserve">Vídeos de Artacho descartados (27-10-2026, decisión de Carlos):</w:t>
+      </w:r>
+      <w:r>
+        <w:t xml:space="preserve"> no se conoce el origen ni los permisos del material, así que no se enlazarán en la app.</w:t>
       </w:r>
     </w:p>
     <w:p>

</xml_diff>

<commit_message>
Base científica: sección de modos ventilatorios (§5) con D-17..D-19 y refs 29-32
Pilares (CPAP/S/S\/T/T/PCV) con parque real, avanzados (AVAPS/iVAPS, PAV,
NAVA, PRVC, ASV con aviso SERVE-HF), tabla de modo por escenario y reglas
de cambio según evolución. Word de revisión y PDF público regenerados
(sin fugas D-nn).

Co-Authored-By: Claude Fable 5 <noreply@anthropic.com>
</commit_message>
<xml_diff>
--- a/docs/BASE_CIENTIFICA.docx
+++ b/docs/BASE_CIENTIFICA.docx
@@ -284,7 +284,7 @@
           </w:pPr>
           <w:hyperlink w:history="1" w:anchor="_Toc5">
             <w:r>
-              <w:t xml:space="preserve">5. Elección de modo</w:t>
+              <w:t xml:space="preserve">5. Modos ventilatorios en VMNI</w:t>
             </w:r>
             <w:r>
               <w:tab/>
@@ -8988,9 +8988,72 @@
       </w:pPr>
       <w:bookmarkStart w:name="_Toc5" w:id="5"/>
       <w:r>
-        <w:t xml:space="preserve">5. Elección de modo</w:t>
+        <w:t xml:space="preserve">5. Modos ventilatorios en VMNI</w:t>
       </w:r>
       <w:bookmarkEnd w:id="5"/>
+    </w:p>
+    <w:p>
+      <w:pPr>
+        <w:pBdr>
+          <w:left w:val="single" w:color="2A7F8E" w:sz="24"/>
+        </w:pBdr>
+        <w:shd w:fill="EAF3F5" w:val="clear"/>
+        <w:spacing w:after="60" w:before="60"/>
+        <w:ind w:left="360"/>
+      </w:pPr>
+      <w:r>
+        <w:rPr>
+          <w:color w:val="333333"/>
+          <w:sz w:val="19"/>
+          <w:szCs w:val="19"/>
+        </w:rPr>
+        <w:t xml:space="preserve">Añadido el 27-10-2026. La recomendación de modo por escenario (§5.3) y las reglas de cambio</w:t>
+      </w:r>
+    </w:p>
+    <w:p>
+      <w:pPr>
+        <w:pBdr>
+          <w:left w:val="single" w:color="2A7F8E" w:sz="24"/>
+        </w:pBdr>
+        <w:shd w:fill="EAF3F5" w:val="clear"/>
+        <w:spacing w:after="60" w:before="60"/>
+        <w:ind w:left="360"/>
+      </w:pPr>
+      <w:r>
+        <w:rPr>
+          <w:color w:val="333333"/>
+          <w:sz w:val="19"/>
+          <w:szCs w:val="19"/>
+        </w:rPr>
+        <w:t xml:space="preserve">según evolución (§5.4) alimentan el motor de la app → decisiones abiertas </w:t>
+      </w:r>
+      <w:r>
+        <w:rPr>
+          <w:b/>
+          <w:bCs/>
+          <w:color w:val="333333"/>
+          <w:sz w:val="19"/>
+          <w:szCs w:val="19"/>
+        </w:rPr>
+        <w:t xml:space="preserve">D-17, D-18 y D-19</w:t>
+      </w:r>
+      <w:r>
+        <w:rPr>
+          <w:color w:val="333333"/>
+          <w:sz w:val="19"/>
+          <w:szCs w:val="19"/>
+        </w:rPr>
+        <w:t xml:space="preserve"> (§14).</w:t>
+      </w:r>
+    </w:p>
+    <w:p>
+      <w:pPr>
+        <w:pStyle w:val="Heading3"/>
+        <w:spacing w:after="140" w:before="280"/>
+      </w:pPr>
+      <w:r>
+        <w:t xml:space="preserve">5.1 Los pilares (los modos del día a día)</w:t>
+      </w:r>
     </w:p>
     <w:tbl>
       <w:tblPr>
@@ -9005,9 +9068,10 @@
         </w:tblBorders>
       </w:tblPr>
       <w:tblGrid>
-        <w:gridCol w:w="2691"/>
-        <w:gridCol w:w="3755"/>
-        <w:gridCol w:w="3192"/>
+        <w:gridCol w:w="1455"/>
+        <w:gridCol w:w="2728"/>
+        <w:gridCol w:w="2728"/>
+        <w:gridCol w:w="2727"/>
       </w:tblGrid>
       <w:tr>
         <w:trPr>
@@ -9015,7 +9079,7 @@
         </w:trPr>
         <w:tc>
           <w:tcPr>
-            <w:tcW w:type="dxa" w:w="2691"/>
+            <w:tcW w:type="dxa" w:w="1455"/>
             <w:tcBorders>
               <w:top w:val="single" w:color="C9D6DA" w:sz="4"/>
               <w:left w:val="single" w:color="C9D6DA" w:sz="4"/>
@@ -9042,13 +9106,13 @@
                 <w:sz w:val="18"/>
                 <w:szCs w:val="18"/>
               </w:rPr>
-              <w:t xml:space="preserve">Situación</w:t>
-            </w:r>
-          </w:p>
-        </w:tc>
-        <w:tc>
-          <w:tcPr>
-            <w:tcW w:type="dxa" w:w="3755"/>
+              <w:t xml:space="preserve">Modo</w:t>
+            </w:r>
+          </w:p>
+        </w:tc>
+        <w:tc>
+          <w:tcPr>
+            <w:tcW w:type="dxa" w:w="2728"/>
             <w:tcBorders>
               <w:top w:val="single" w:color="C9D6DA" w:sz="4"/>
               <w:left w:val="single" w:color="C9D6DA" w:sz="4"/>
@@ -9075,13 +9139,13 @@
                 <w:sz w:val="18"/>
                 <w:szCs w:val="18"/>
               </w:rPr>
-              <w:t xml:space="preserve">Modo de elección</w:t>
-            </w:r>
-          </w:p>
-        </w:tc>
-        <w:tc>
-          <w:tcPr>
-            <w:tcW w:type="dxa" w:w="3192"/>
+              <w:t xml:space="preserve">Qué hace</w:t>
+            </w:r>
+          </w:p>
+        </w:tc>
+        <w:tc>
+          <w:tcPr>
+            <w:tcW w:type="dxa" w:w="2728"/>
             <w:tcBorders>
               <w:top w:val="single" w:color="C9D6DA" w:sz="4"/>
               <w:left w:val="single" w:color="C9D6DA" w:sz="4"/>
@@ -9108,7 +9172,40 @@
                 <w:sz w:val="18"/>
                 <w:szCs w:val="18"/>
               </w:rPr>
-              <w:t xml:space="preserve">Razón</w:t>
+              <w:t xml:space="preserve">Indicación típica</w:t>
+            </w:r>
+          </w:p>
+        </w:tc>
+        <w:tc>
+          <w:tcPr>
+            <w:tcW w:type="dxa" w:w="2727"/>
+            <w:tcBorders>
+              <w:top w:val="single" w:color="C9D6DA" w:sz="4"/>
+              <w:left w:val="single" w:color="C9D6DA" w:sz="4"/>
+              <w:bottom w:val="single" w:color="C9D6DA" w:sz="4"/>
+              <w:right w:val="single" w:color="C9D6DA" w:sz="4"/>
+            </w:tcBorders>
+            <w:shd w:fill="0F4C5C" w:val="clear"/>
+            <w:tcMar>
+              <w:top w:type="dxa" w:w="60"/>
+              <w:left w:type="dxa" w:w="100"/>
+              <w:bottom w:type="dxa" w:w="60"/>
+              <w:right w:type="dxa" w:w="100"/>
+            </w:tcMar>
+          </w:tcPr>
+          <w:p>
+            <w:pPr>
+              <w:spacing w:after="0" w:before="0"/>
+            </w:pPr>
+            <w:r>
+              <w:rPr>
+                <w:b/>
+                <w:bCs/>
+                <w:color w:val="FFFFFF"/>
+                <w:sz w:val="18"/>
+                <w:szCs w:val="18"/>
+              </w:rPr>
+              <w:t xml:space="preserve">En el parque del área</w:t>
             </w:r>
           </w:p>
         </w:tc>
@@ -9116,37 +9213,7 @@
       <w:tr>
         <w:tc>
           <w:tcPr>
-            <w:tcW w:type="dxa" w:w="2691"/>
-            <w:tcBorders>
-              <w:top w:val="single" w:color="C9D6DA" w:sz="4"/>
-              <w:left w:val="single" w:color="C9D6DA" w:sz="4"/>
-              <w:bottom w:val="single" w:color="C9D6DA" w:sz="4"/>
-              <w:right w:val="single" w:color="C9D6DA" w:sz="4"/>
-            </w:tcBorders>
-            <w:tcMar>
-              <w:top w:type="dxa" w:w="60"/>
-              <w:left w:type="dxa" w:w="100"/>
-              <w:bottom w:type="dxa" w:w="60"/>
-              <w:right w:type="dxa" w:w="100"/>
-            </w:tcMar>
-          </w:tcPr>
-          <w:p>
-            <w:pPr>
-              <w:spacing w:after="0" w:before="0"/>
-            </w:pPr>
-            <w:r>
-              <w:rPr>
-                <w:color w:val="222222"/>
-                <w:sz w:val="18"/>
-                <w:szCs w:val="18"/>
-              </w:rPr>
-              <w:t xml:space="preserve">Fallo hipercápnico (EPOC, SHO, restrictivo)</w:t>
-            </w:r>
-          </w:p>
-        </w:tc>
-        <w:tc>
-          <w:tcPr>
-            <w:tcW w:type="dxa" w:w="3755"/>
+            <w:tcW w:type="dxa" w:w="1455"/>
             <w:tcBorders>
               <w:top w:val="single" w:color="C9D6DA" w:sz="4"/>
               <w:left w:val="single" w:color="C9D6DA" w:sz="4"/>
@@ -9172,45 +9239,97 @@
                 <w:sz w:val="18"/>
                 <w:szCs w:val="18"/>
               </w:rPr>
-              <w:t xml:space="preserve">Binivel S/T</w:t>
-            </w:r>
-            <w:r>
-              <w:rPr>
-                <w:color w:val="222222"/>
-                <w:sz w:val="18"/>
-                <w:szCs w:val="18"/>
-              </w:rPr>
-              <w:t xml:space="preserve"> (presión de soporte + EPAP, con FR de respaldo)</w:t>
-            </w:r>
-          </w:p>
-        </w:tc>
-        <w:tc>
-          <w:tcPr>
-            <w:tcW w:type="dxa" w:w="3192"/>
-            <w:tcBorders>
-              <w:top w:val="single" w:color="C9D6DA" w:sz="4"/>
-              <w:left w:val="single" w:color="C9D6DA" w:sz="4"/>
-              <w:bottom w:val="single" w:color="C9D6DA" w:sz="4"/>
-              <w:right w:val="single" w:color="C9D6DA" w:sz="4"/>
-            </w:tcBorders>
-            <w:tcMar>
-              <w:top w:type="dxa" w:w="60"/>
-              <w:left w:type="dxa" w:w="100"/>
-              <w:bottom w:type="dxa" w:w="60"/>
-              <w:right w:type="dxa" w:w="100"/>
-            </w:tcMar>
-          </w:tcPr>
-          <w:p>
-            <w:pPr>
-              <w:spacing w:after="0" w:before="0"/>
-            </w:pPr>
-            <w:r>
-              <w:rPr>
-                <w:color w:val="222222"/>
-                <w:sz w:val="18"/>
-                <w:szCs w:val="18"/>
-              </w:rPr>
-              <w:t xml:space="preserve">Descarga musculatura y barre CO2 (consenso p.81-82)</w:t>
+              <w:t xml:space="preserve">CPAP</w:t>
+            </w:r>
+          </w:p>
+        </w:tc>
+        <w:tc>
+          <w:tcPr>
+            <w:tcW w:type="dxa" w:w="2728"/>
+            <w:tcBorders>
+              <w:top w:val="single" w:color="C9D6DA" w:sz="4"/>
+              <w:left w:val="single" w:color="C9D6DA" w:sz="4"/>
+              <w:bottom w:val="single" w:color="C9D6DA" w:sz="4"/>
+              <w:right w:val="single" w:color="C9D6DA" w:sz="4"/>
+            </w:tcBorders>
+            <w:tcMar>
+              <w:top w:type="dxa" w:w="60"/>
+              <w:left w:type="dxa" w:w="100"/>
+              <w:bottom w:type="dxa" w:w="60"/>
+              <w:right w:type="dxa" w:w="100"/>
+            </w:tcMar>
+          </w:tcPr>
+          <w:p>
+            <w:pPr>
+              <w:spacing w:after="0" w:before="0"/>
+            </w:pPr>
+            <w:r>
+              <w:rPr>
+                <w:color w:val="222222"/>
+                <w:sz w:val="18"/>
+                <w:szCs w:val="18"/>
+              </w:rPr>
+              <w:t xml:space="preserve">Una sola presión continua. No ventila: recluta alveolos, oxigena y descarga el ventrículo izquierdo</w:t>
+            </w:r>
+          </w:p>
+        </w:tc>
+        <w:tc>
+          <w:tcPr>
+            <w:tcW w:type="dxa" w:w="2728"/>
+            <w:tcBorders>
+              <w:top w:val="single" w:color="C9D6DA" w:sz="4"/>
+              <w:left w:val="single" w:color="C9D6DA" w:sz="4"/>
+              <w:bottom w:val="single" w:color="C9D6DA" w:sz="4"/>
+              <w:right w:val="single" w:color="C9D6DA" w:sz="4"/>
+            </w:tcBorders>
+            <w:tcMar>
+              <w:top w:type="dxa" w:w="60"/>
+              <w:left w:type="dxa" w:w="100"/>
+              <w:bottom w:type="dxa" w:w="60"/>
+              <w:right w:type="dxa" w:w="100"/>
+            </w:tcMar>
+          </w:tcPr>
+          <w:p>
+            <w:pPr>
+              <w:spacing w:after="0" w:before="0"/>
+            </w:pPr>
+            <w:r>
+              <w:rPr>
+                <w:color w:val="222222"/>
+                <w:sz w:val="18"/>
+                <w:szCs w:val="18"/>
+              </w:rPr>
+              <w:t xml:space="preserve">EAP (equivalente a binivel en mortalidad e intubación); hipoxemia con shunt reclutable</w:t>
+            </w:r>
+          </w:p>
+        </w:tc>
+        <w:tc>
+          <w:tcPr>
+            <w:tcW w:type="dxa" w:w="2727"/>
+            <w:tcBorders>
+              <w:top w:val="single" w:color="C9D6DA" w:sz="4"/>
+              <w:left w:val="single" w:color="C9D6DA" w:sz="4"/>
+              <w:bottom w:val="single" w:color="C9D6DA" w:sz="4"/>
+              <w:right w:val="single" w:color="C9D6DA" w:sz="4"/>
+            </w:tcBorders>
+            <w:tcMar>
+              <w:top w:type="dxa" w:w="60"/>
+              <w:left w:type="dxa" w:w="100"/>
+              <w:bottom w:type="dxa" w:w="60"/>
+              <w:right w:type="dxa" w:w="100"/>
+            </w:tcMar>
+          </w:tcPr>
+          <w:p>
+            <w:pPr>
+              <w:spacing w:after="0" w:before="0"/>
+            </w:pPr>
+            <w:r>
+              <w:rPr>
+                <w:color w:val="222222"/>
+                <w:sz w:val="18"/>
+                <w:szCs w:val="18"/>
+              </w:rPr>
+              <w:t xml:space="preserve">V60 · Vivo 50/60 · VITAE 40 · Boussignac</w:t>
             </w:r>
           </w:p>
         </w:tc>
@@ -9218,38 +9337,7 @@
       <w:tr>
         <w:tc>
           <w:tcPr>
-            <w:tcW w:type="dxa" w:w="2691"/>
-            <w:tcBorders>
-              <w:top w:val="single" w:color="C9D6DA" w:sz="4"/>
-              <w:left w:val="single" w:color="C9D6DA" w:sz="4"/>
-              <w:bottom w:val="single" w:color="C9D6DA" w:sz="4"/>
-              <w:right w:val="single" w:color="C9D6DA" w:sz="4"/>
-            </w:tcBorders>
-            <w:shd w:fill="F5FAFB" w:val="clear"/>
-            <w:tcMar>
-              <w:top w:type="dxa" w:w="60"/>
-              <w:left w:type="dxa" w:w="100"/>
-              <w:bottom w:type="dxa" w:w="60"/>
-              <w:right w:type="dxa" w:w="100"/>
-            </w:tcMar>
-          </w:tcPr>
-          <w:p>
-            <w:pPr>
-              <w:spacing w:after="0" w:before="0"/>
-            </w:pPr>
-            <w:r>
-              <w:rPr>
-                <w:color w:val="222222"/>
-                <w:sz w:val="18"/>
-                <w:szCs w:val="18"/>
-              </w:rPr>
-              <w:t xml:space="preserve">EAP</w:t>
-            </w:r>
-          </w:p>
-        </w:tc>
-        <w:tc>
-          <w:tcPr>
-            <w:tcW w:type="dxa" w:w="3755"/>
+            <w:tcW w:type="dxa" w:w="1455"/>
             <w:tcBorders>
               <w:top w:val="single" w:color="C9D6DA" w:sz="4"/>
               <w:left w:val="single" w:color="C9D6DA" w:sz="4"/>
@@ -9276,21 +9364,13 @@
                 <w:sz w:val="18"/>
                 <w:szCs w:val="18"/>
               </w:rPr>
-              <w:t xml:space="preserve">CPAP</w:t>
-            </w:r>
-            <w:r>
-              <w:rPr>
-                <w:color w:val="222222"/>
-                <w:sz w:val="18"/>
-                <w:szCs w:val="18"/>
-              </w:rPr>
-              <w:t xml:space="preserve"> (equivalente a binivel; más simple y barata); binivel si hipercapnia/fatiga</w:t>
-            </w:r>
-          </w:p>
-        </w:tc>
-        <w:tc>
-          <w:tcPr>
-            <w:tcW w:type="dxa" w:w="3192"/>
+              <w:t xml:space="preserve">S (espontáneo)</w:t>
+            </w:r>
+          </w:p>
+        </w:tc>
+        <w:tc>
+          <w:tcPr>
+            <w:tcW w:type="dxa" w:w="2728"/>
             <w:tcBorders>
               <w:top w:val="single" w:color="C9D6DA" w:sz="4"/>
               <w:left w:val="single" w:color="C9D6DA" w:sz="4"/>
@@ -9315,7 +9395,69 @@
                 <w:sz w:val="18"/>
                 <w:szCs w:val="18"/>
               </w:rPr>
-              <w:t xml:space="preserve">ERS/ATS Q2a; Masip 2018</w:t>
+              <w:t xml:space="preserve">Binivel puro: el paciente dispara y cicla todos los ciclos (presión de soporte sobre EPAP)</w:t>
+            </w:r>
+          </w:p>
+        </w:tc>
+        <w:tc>
+          <w:tcPr>
+            <w:tcW w:type="dxa" w:w="2728"/>
+            <w:tcBorders>
+              <w:top w:val="single" w:color="C9D6DA" w:sz="4"/>
+              <w:left w:val="single" w:color="C9D6DA" w:sz="4"/>
+              <w:bottom w:val="single" w:color="C9D6DA" w:sz="4"/>
+              <w:right w:val="single" w:color="C9D6DA" w:sz="4"/>
+            </w:tcBorders>
+            <w:shd w:fill="F5FAFB" w:val="clear"/>
+            <w:tcMar>
+              <w:top w:type="dxa" w:w="60"/>
+              <w:left w:type="dxa" w:w="100"/>
+              <w:bottom w:type="dxa" w:w="60"/>
+              <w:right w:type="dxa" w:w="100"/>
+            </w:tcMar>
+          </w:tcPr>
+          <w:p>
+            <w:pPr>
+              <w:spacing w:after="0" w:before="0"/>
+            </w:pPr>
+            <w:r>
+              <w:rPr>
+                <w:color w:val="222222"/>
+                <w:sz w:val="18"/>
+                <w:szCs w:val="18"/>
+              </w:rPr>
+              <w:t xml:space="preserve">Paciente con estímulo respiratorio fiable; en agudos casi siempre se prefiere S/T (respaldo)</w:t>
+            </w:r>
+          </w:p>
+        </w:tc>
+        <w:tc>
+          <w:tcPr>
+            <w:tcW w:type="dxa" w:w="2727"/>
+            <w:tcBorders>
+              <w:top w:val="single" w:color="C9D6DA" w:sz="4"/>
+              <w:left w:val="single" w:color="C9D6DA" w:sz="4"/>
+              <w:bottom w:val="single" w:color="C9D6DA" w:sz="4"/>
+              <w:right w:val="single" w:color="C9D6DA" w:sz="4"/>
+            </w:tcBorders>
+            <w:shd w:fill="F5FAFB" w:val="clear"/>
+            <w:tcMar>
+              <w:top w:type="dxa" w:w="60"/>
+              <w:left w:type="dxa" w:w="100"/>
+              <w:bottom w:type="dxa" w:w="60"/>
+              <w:right w:type="dxa" w:w="100"/>
+            </w:tcMar>
+          </w:tcPr>
+          <w:p>
+            <w:pPr>
+              <w:spacing w:after="0" w:before="0"/>
+            </w:pPr>
+            <w:r>
+              <w:rPr>
+                <w:color w:val="222222"/>
+                <w:sz w:val="18"/>
+                <w:szCs w:val="18"/>
+              </w:rPr>
+              <w:t xml:space="preserve">V60 (S) · Vivo 50/60 (PSV sin respaldo)</w:t>
             </w:r>
           </w:p>
         </w:tc>
@@ -9323,91 +9465,133 @@
       <w:tr>
         <w:tc>
           <w:tcPr>
-            <w:tcW w:type="dxa" w:w="2691"/>
-            <w:tcBorders>
-              <w:top w:val="single" w:color="C9D6DA" w:sz="4"/>
-              <w:left w:val="single" w:color="C9D6DA" w:sz="4"/>
-              <w:bottom w:val="single" w:color="C9D6DA" w:sz="4"/>
-              <w:right w:val="single" w:color="C9D6DA" w:sz="4"/>
-            </w:tcBorders>
-            <w:tcMar>
-              <w:top w:type="dxa" w:w="60"/>
-              <w:left w:type="dxa" w:w="100"/>
-              <w:bottom w:type="dxa" w:w="60"/>
-              <w:right w:type="dxa" w:w="100"/>
-            </w:tcMar>
-          </w:tcPr>
-          <w:p>
-            <w:pPr>
-              <w:spacing w:after="0" w:before="0"/>
-            </w:pPr>
-            <w:r>
-              <w:rPr>
-                <w:color w:val="222222"/>
-                <w:sz w:val="18"/>
-                <w:szCs w:val="18"/>
-              </w:rPr>
-              <w:t xml:space="preserve">Hipoxemia de novo</w:t>
-            </w:r>
-          </w:p>
-        </w:tc>
-        <w:tc>
-          <w:tcPr>
-            <w:tcW w:type="dxa" w:w="3755"/>
-            <w:tcBorders>
-              <w:top w:val="single" w:color="C9D6DA" w:sz="4"/>
-              <w:left w:val="single" w:color="C9D6DA" w:sz="4"/>
-              <w:bottom w:val="single" w:color="C9D6DA" w:sz="4"/>
-              <w:right w:val="single" w:color="C9D6DA" w:sz="4"/>
-            </w:tcBorders>
-            <w:tcMar>
-              <w:top w:type="dxa" w:w="60"/>
-              <w:left w:type="dxa" w:w="100"/>
-              <w:bottom w:type="dxa" w:w="60"/>
-              <w:right w:type="dxa" w:w="100"/>
-            </w:tcMar>
-          </w:tcPr>
-          <w:p>
-            <w:pPr>
-              <w:spacing w:after="0" w:before="0"/>
-            </w:pPr>
-            <w:r>
-              <w:rPr>
-                <w:color w:val="222222"/>
-                <w:sz w:val="18"/>
-                <w:szCs w:val="18"/>
-              </w:rPr>
-              <w:t xml:space="preserve">TAFCN 1ª línea; CPAP/VNI (mascarilla o helmet) como alternativa</w:t>
-            </w:r>
-          </w:p>
-        </w:tc>
-        <w:tc>
-          <w:tcPr>
-            <w:tcW w:type="dxa" w:w="3192"/>
-            <w:tcBorders>
-              <w:top w:val="single" w:color="C9D6DA" w:sz="4"/>
-              <w:left w:val="single" w:color="C9D6DA" w:sz="4"/>
-              <w:bottom w:val="single" w:color="C9D6DA" w:sz="4"/>
-              <w:right w:val="single" w:color="C9D6DA" w:sz="4"/>
-            </w:tcBorders>
-            <w:tcMar>
-              <w:top w:type="dxa" w:w="60"/>
-              <w:left w:type="dxa" w:w="100"/>
-              <w:bottom w:type="dxa" w:w="60"/>
-              <w:right w:type="dxa" w:w="100"/>
-            </w:tcMar>
-          </w:tcPr>
-          <w:p>
-            <w:pPr>
-              <w:spacing w:after="0" w:before="0"/>
-            </w:pPr>
-            <w:r>
-              <w:rPr>
-                <w:color w:val="222222"/>
-                <w:sz w:val="18"/>
-                <w:szCs w:val="18"/>
-              </w:rPr>
-              <w:t xml:space="preserve">ATS 2026 PICO1</w:t>
+            <w:tcW w:type="dxa" w:w="1455"/>
+            <w:tcBorders>
+              <w:top w:val="single" w:color="C9D6DA" w:sz="4"/>
+              <w:left w:val="single" w:color="C9D6DA" w:sz="4"/>
+              <w:bottom w:val="single" w:color="C9D6DA" w:sz="4"/>
+              <w:right w:val="single" w:color="C9D6DA" w:sz="4"/>
+            </w:tcBorders>
+            <w:tcMar>
+              <w:top w:type="dxa" w:w="60"/>
+              <w:left w:type="dxa" w:w="100"/>
+              <w:bottom w:type="dxa" w:w="60"/>
+              <w:right w:type="dxa" w:w="100"/>
+            </w:tcMar>
+          </w:tcPr>
+          <w:p>
+            <w:pPr>
+              <w:spacing w:after="0" w:before="0"/>
+            </w:pPr>
+            <w:r>
+              <w:rPr>
+                <w:b/>
+                <w:bCs/>
+                <w:color w:val="222222"/>
+                <w:sz w:val="18"/>
+                <w:szCs w:val="18"/>
+              </w:rPr>
+              <w:t xml:space="preserve">S/T (espontáneo-programado)</w:t>
+            </w:r>
+          </w:p>
+        </w:tc>
+        <w:tc>
+          <w:tcPr>
+            <w:tcW w:type="dxa" w:w="2728"/>
+            <w:tcBorders>
+              <w:top w:val="single" w:color="C9D6DA" w:sz="4"/>
+              <w:left w:val="single" w:color="C9D6DA" w:sz="4"/>
+              <w:bottom w:val="single" w:color="C9D6DA" w:sz="4"/>
+              <w:right w:val="single" w:color="C9D6DA" w:sz="4"/>
+            </w:tcBorders>
+            <w:tcMar>
+              <w:top w:type="dxa" w:w="60"/>
+              <w:left w:type="dxa" w:w="100"/>
+              <w:bottom w:type="dxa" w:w="60"/>
+              <w:right w:type="dxa" w:w="100"/>
+            </w:tcMar>
+          </w:tcPr>
+          <w:p>
+            <w:pPr>
+              <w:spacing w:after="0" w:before="0"/>
+            </w:pPr>
+            <w:r>
+              <w:rPr>
+                <w:color w:val="222222"/>
+                <w:sz w:val="18"/>
+                <w:szCs w:val="18"/>
+              </w:rPr>
+              <w:t xml:space="preserve">Como S, pero con FR de respaldo: si el paciente no dispara en el tiempo programado, la máquina entrega un ciclo controlado por tiempo</w:t>
+            </w:r>
+          </w:p>
+        </w:tc>
+        <w:tc>
+          <w:tcPr>
+            <w:tcW w:type="dxa" w:w="2728"/>
+            <w:tcBorders>
+              <w:top w:val="single" w:color="C9D6DA" w:sz="4"/>
+              <w:left w:val="single" w:color="C9D6DA" w:sz="4"/>
+              <w:bottom w:val="single" w:color="C9D6DA" w:sz="4"/>
+              <w:right w:val="single" w:color="C9D6DA" w:sz="4"/>
+            </w:tcBorders>
+            <w:tcMar>
+              <w:top w:type="dxa" w:w="60"/>
+              <w:left w:type="dxa" w:w="100"/>
+              <w:bottom w:type="dxa" w:w="60"/>
+              <w:right w:type="dxa" w:w="100"/>
+            </w:tcMar>
+          </w:tcPr>
+          <w:p>
+            <w:pPr>
+              <w:spacing w:after="0" w:before="0"/>
+            </w:pPr>
+            <w:r>
+              <w:rPr>
+                <w:b/>
+                <w:bCs/>
+                <w:color w:val="222222"/>
+                <w:sz w:val="18"/>
+                <w:szCs w:val="18"/>
+              </w:rPr>
+              <w:t xml:space="preserve">El caballo de batalla del fallo hipercápnico</w:t>
+            </w:r>
+            <w:r>
+              <w:rPr>
+                <w:color w:val="222222"/>
+                <w:sz w:val="18"/>
+                <w:szCs w:val="18"/>
+              </w:rPr>
+              <w:t xml:space="preserve"> (EPOC, SHO, restrictivo) — consenso 2021 p.81-82; BTS 2016</w:t>
+            </w:r>
+          </w:p>
+        </w:tc>
+        <w:tc>
+          <w:tcPr>
+            <w:tcW w:type="dxa" w:w="2727"/>
+            <w:tcBorders>
+              <w:top w:val="single" w:color="C9D6DA" w:sz="4"/>
+              <w:left w:val="single" w:color="C9D6DA" w:sz="4"/>
+              <w:bottom w:val="single" w:color="C9D6DA" w:sz="4"/>
+              <w:right w:val="single" w:color="C9D6DA" w:sz="4"/>
+            </w:tcBorders>
+            <w:tcMar>
+              <w:top w:type="dxa" w:w="60"/>
+              <w:left w:type="dxa" w:w="100"/>
+              <w:bottom w:type="dxa" w:w="60"/>
+              <w:right w:type="dxa" w:w="100"/>
+            </w:tcMar>
+          </w:tcPr>
+          <w:p>
+            <w:pPr>
+              <w:spacing w:after="0" w:before="0"/>
+            </w:pPr>
+            <w:r>
+              <w:rPr>
+                <w:color w:val="222222"/>
+                <w:sz w:val="18"/>
+                <w:szCs w:val="18"/>
+              </w:rPr>
+              <w:t xml:space="preserve">V60 (S/T) · Vivo 50/60 (PSV con FR de respaldo) · VITAE 40 (binivel)</w:t>
             </w:r>
           </w:p>
         </w:tc>
@@ -9415,7 +9599,7 @@
       <w:tr>
         <w:tc>
           <w:tcPr>
-            <w:tcW w:type="dxa" w:w="2691"/>
+            <w:tcW w:type="dxa" w:w="1455"/>
             <w:tcBorders>
               <w:top w:val="single" w:color="C9D6DA" w:sz="4"/>
               <w:left w:val="single" w:color="C9D6DA" w:sz="4"/>
@@ -9436,17 +9620,19 @@
             </w:pPr>
             <w:r>
               <w:rPr>
-                <w:color w:val="222222"/>
-                <w:sz w:val="18"/>
-                <w:szCs w:val="18"/>
-              </w:rPr>
-              <w:t xml:space="preserve">Vt insuficiente pese a IPAP alta (SHO, ENM)</w:t>
-            </w:r>
-          </w:p>
-        </w:tc>
-        <w:tc>
-          <w:tcPr>
-            <w:tcW w:type="dxa" w:w="3755"/>
+                <w:b/>
+                <w:bCs/>
+                <w:color w:val="222222"/>
+                <w:sz w:val="18"/>
+                <w:szCs w:val="18"/>
+              </w:rPr>
+              <w:t xml:space="preserve">T (programado)</w:t>
+            </w:r>
+          </w:p>
+        </w:tc>
+        <w:tc>
+          <w:tcPr>
+            <w:tcW w:type="dxa" w:w="2728"/>
             <w:tcBorders>
               <w:top w:val="single" w:color="C9D6DA" w:sz="4"/>
               <w:left w:val="single" w:color="C9D6DA" w:sz="4"/>
@@ -9471,13 +9657,13 @@
                 <w:sz w:val="18"/>
                 <w:szCs w:val="18"/>
               </w:rPr>
-              <w:t xml:space="preserve">Modos con volumen asegurado (AVAPS / volumen garantizado) o PCV</w:t>
-            </w:r>
-          </w:p>
-        </w:tc>
-        <w:tc>
-          <w:tcPr>
-            <w:tcW w:type="dxa" w:w="3192"/>
+              <w:t xml:space="preserve">Todos los ciclos los inicia y cicla la máquina (FR y Ti fijos); ignora el esfuerzo del paciente</w:t>
+            </w:r>
+          </w:p>
+        </w:tc>
+        <w:tc>
+          <w:tcPr>
+            <w:tcW w:type="dxa" w:w="2728"/>
             <w:tcBorders>
               <w:top w:val="single" w:color="C9D6DA" w:sz="4"/>
               <w:left w:val="single" w:color="C9D6DA" w:sz="4"/>
@@ -9502,7 +9688,38 @@
                 <w:sz w:val="18"/>
                 <w:szCs w:val="18"/>
               </w:rPr>
-              <w:t xml:space="preserve">Artacho p.102</w:t>
+              <w:t xml:space="preserve">Sin estímulo respiratorio (sedación, encefalopatía profunda) cuando se decide mantener VNI; puente mientras se prepara otra cosa</w:t>
+            </w:r>
+          </w:p>
+        </w:tc>
+        <w:tc>
+          <w:tcPr>
+            <w:tcW w:type="dxa" w:w="2727"/>
+            <w:tcBorders>
+              <w:top w:val="single" w:color="C9D6DA" w:sz="4"/>
+              <w:left w:val="single" w:color="C9D6DA" w:sz="4"/>
+              <w:bottom w:val="single" w:color="C9D6DA" w:sz="4"/>
+              <w:right w:val="single" w:color="C9D6DA" w:sz="4"/>
+            </w:tcBorders>
+            <w:shd w:fill="F5FAFB" w:val="clear"/>
+            <w:tcMar>
+              <w:top w:type="dxa" w:w="60"/>
+              <w:left w:type="dxa" w:w="100"/>
+              <w:bottom w:type="dxa" w:w="60"/>
+              <w:right w:type="dxa" w:w="100"/>
+            </w:tcMar>
+          </w:tcPr>
+          <w:p>
+            <w:pPr>
+              <w:spacing w:after="0" w:before="0"/>
+            </w:pPr>
+            <w:r>
+              <w:rPr>
+                <w:color w:val="222222"/>
+                <w:sz w:val="18"/>
+                <w:szCs w:val="18"/>
+              </w:rPr>
+              <w:t xml:space="preserve">V60 (PCV con FR fija) · Vivo 50/60 (PCV)</w:t>
             </w:r>
           </w:p>
         </w:tc>
@@ -9510,91 +9727,141 @@
       <w:tr>
         <w:tc>
           <w:tcPr>
-            <w:tcW w:type="dxa" w:w="2691"/>
-            <w:tcBorders>
-              <w:top w:val="single" w:color="C9D6DA" w:sz="4"/>
-              <w:left w:val="single" w:color="C9D6DA" w:sz="4"/>
-              <w:bottom w:val="single" w:color="C9D6DA" w:sz="4"/>
-              <w:right w:val="single" w:color="C9D6DA" w:sz="4"/>
-            </w:tcBorders>
-            <w:tcMar>
-              <w:top w:type="dxa" w:w="60"/>
-              <w:left w:type="dxa" w:w="100"/>
-              <w:bottom w:type="dxa" w:w="60"/>
-              <w:right w:type="dxa" w:w="100"/>
-            </w:tcMar>
-          </w:tcPr>
-          <w:p>
-            <w:pPr>
-              <w:spacing w:after="0" w:before="0"/>
-            </w:pPr>
-            <w:r>
-              <w:rPr>
-                <w:color w:val="222222"/>
-                <w:sz w:val="18"/>
-                <w:szCs w:val="18"/>
-              </w:rPr>
-              <w:t xml:space="preserve">ENM con disparo débil</w:t>
-            </w:r>
-          </w:p>
-        </w:tc>
-        <w:tc>
-          <w:tcPr>
-            <w:tcW w:type="dxa" w:w="3755"/>
-            <w:tcBorders>
-              <w:top w:val="single" w:color="C9D6DA" w:sz="4"/>
-              <w:left w:val="single" w:color="C9D6DA" w:sz="4"/>
-              <w:bottom w:val="single" w:color="C9D6DA" w:sz="4"/>
-              <w:right w:val="single" w:color="C9D6DA" w:sz="4"/>
-            </w:tcBorders>
-            <w:tcMar>
-              <w:top w:type="dxa" w:w="60"/>
-              <w:left w:type="dxa" w:w="100"/>
-              <w:bottom w:type="dxa" w:w="60"/>
-              <w:right w:type="dxa" w:w="100"/>
-            </w:tcMar>
-          </w:tcPr>
-          <w:p>
-            <w:pPr>
-              <w:spacing w:after="0" w:before="0"/>
-            </w:pPr>
-            <w:r>
-              <w:rPr>
-                <w:color w:val="222222"/>
-                <w:sz w:val="18"/>
-                <w:szCs w:val="18"/>
-              </w:rPr>
-              <w:t xml:space="preserve">PCV/controlada (el trigger falla)</w:t>
-            </w:r>
-          </w:p>
-        </w:tc>
-        <w:tc>
-          <w:tcPr>
-            <w:tcW w:type="dxa" w:w="3192"/>
-            <w:tcBorders>
-              <w:top w:val="single" w:color="C9D6DA" w:sz="4"/>
-              <w:left w:val="single" w:color="C9D6DA" w:sz="4"/>
-              <w:bottom w:val="single" w:color="C9D6DA" w:sz="4"/>
-              <w:right w:val="single" w:color="C9D6DA" w:sz="4"/>
-            </w:tcBorders>
-            <w:tcMar>
-              <w:top w:type="dxa" w:w="60"/>
-              <w:left w:type="dxa" w:w="100"/>
-              <w:bottom w:type="dxa" w:w="60"/>
-              <w:right w:type="dxa" w:w="100"/>
-            </w:tcMar>
-          </w:tcPr>
-          <w:p>
-            <w:pPr>
-              <w:spacing w:after="0" w:before="0"/>
-            </w:pPr>
-            <w:r>
-              <w:rPr>
-                <w:color w:val="222222"/>
-                <w:sz w:val="18"/>
-                <w:szCs w:val="18"/>
-              </w:rPr>
-              <w:t xml:space="preserve">BTS rec. 52</w:t>
+            <w:tcW w:type="dxa" w:w="1455"/>
+            <w:tcBorders>
+              <w:top w:val="single" w:color="C9D6DA" w:sz="4"/>
+              <w:left w:val="single" w:color="C9D6DA" w:sz="4"/>
+              <w:bottom w:val="single" w:color="C9D6DA" w:sz="4"/>
+              <w:right w:val="single" w:color="C9D6DA" w:sz="4"/>
+            </w:tcBorders>
+            <w:tcMar>
+              <w:top w:type="dxa" w:w="60"/>
+              <w:left w:type="dxa" w:w="100"/>
+              <w:bottom w:type="dxa" w:w="60"/>
+              <w:right w:type="dxa" w:w="100"/>
+            </w:tcMar>
+          </w:tcPr>
+          <w:p>
+            <w:pPr>
+              <w:spacing w:after="0" w:before="0"/>
+            </w:pPr>
+            <w:r>
+              <w:rPr>
+                <w:b/>
+                <w:bCs/>
+                <w:color w:val="222222"/>
+                <w:sz w:val="18"/>
+                <w:szCs w:val="18"/>
+              </w:rPr>
+              <w:t xml:space="preserve">PCV (controlada por presión)</w:t>
+            </w:r>
+          </w:p>
+        </w:tc>
+        <w:tc>
+          <w:tcPr>
+            <w:tcW w:type="dxa" w:w="2728"/>
+            <w:tcBorders>
+              <w:top w:val="single" w:color="C9D6DA" w:sz="4"/>
+              <w:left w:val="single" w:color="C9D6DA" w:sz="4"/>
+              <w:bottom w:val="single" w:color="C9D6DA" w:sz="4"/>
+              <w:right w:val="single" w:color="C9D6DA" w:sz="4"/>
+            </w:tcBorders>
+            <w:tcMar>
+              <w:top w:type="dxa" w:w="60"/>
+              <w:left w:type="dxa" w:w="100"/>
+              <w:bottom w:type="dxa" w:w="60"/>
+              <w:right w:type="dxa" w:w="100"/>
+            </w:tcMar>
+          </w:tcPr>
+          <w:p>
+            <w:pPr>
+              <w:spacing w:after="0" w:before="0"/>
+            </w:pPr>
+            <w:r>
+              <w:rPr>
+                <w:color w:val="222222"/>
+                <w:sz w:val="18"/>
+                <w:szCs w:val="18"/>
+              </w:rPr>
+              <w:t xml:space="preserve">Presión inspiratoria con </w:t>
+            </w:r>
+            <w:r>
+              <w:rPr>
+                <w:b/>
+                <w:bCs/>
+                <w:color w:val="222222"/>
+                <w:sz w:val="18"/>
+                <w:szCs w:val="18"/>
+              </w:rPr>
+              <w:t xml:space="preserve">Ti fijo</w:t>
+            </w:r>
+            <w:r>
+              <w:rPr>
+                <w:color w:val="222222"/>
+                <w:sz w:val="18"/>
+                <w:szCs w:val="18"/>
+              </w:rPr>
+              <w:t xml:space="preserve"> programado; asiste los esfuerzos y asegura ciclos si no los hay</w:t>
+            </w:r>
+          </w:p>
+        </w:tc>
+        <w:tc>
+          <w:tcPr>
+            <w:tcW w:type="dxa" w:w="2728"/>
+            <w:tcBorders>
+              <w:top w:val="single" w:color="C9D6DA" w:sz="4"/>
+              <w:left w:val="single" w:color="C9D6DA" w:sz="4"/>
+              <w:bottom w:val="single" w:color="C9D6DA" w:sz="4"/>
+              <w:right w:val="single" w:color="C9D6DA" w:sz="4"/>
+            </w:tcBorders>
+            <w:tcMar>
+              <w:top w:type="dxa" w:w="60"/>
+              <w:left w:type="dxa" w:w="100"/>
+              <w:bottom w:type="dxa" w:w="60"/>
+              <w:right w:type="dxa" w:w="100"/>
+            </w:tcMar>
+          </w:tcPr>
+          <w:p>
+            <w:pPr>
+              <w:spacing w:after="0" w:before="0"/>
+            </w:pPr>
+            <w:r>
+              <w:rPr>
+                <w:color w:val="222222"/>
+                <w:sz w:val="18"/>
+                <w:szCs w:val="18"/>
+              </w:rPr>
+              <w:t xml:space="preserve">ENM con disparo débil (BTS rec. 52); asincronía de ciclado refractaria (el Ti fijo elimina el ciclado por flujo, que la fuga pervierte); restrictivo que necesita Ti largo</w:t>
+            </w:r>
+          </w:p>
+        </w:tc>
+        <w:tc>
+          <w:tcPr>
+            <w:tcW w:type="dxa" w:w="2727"/>
+            <w:tcBorders>
+              <w:top w:val="single" w:color="C9D6DA" w:sz="4"/>
+              <w:left w:val="single" w:color="C9D6DA" w:sz="4"/>
+              <w:bottom w:val="single" w:color="C9D6DA" w:sz="4"/>
+              <w:right w:val="single" w:color="C9D6DA" w:sz="4"/>
+            </w:tcBorders>
+            <w:tcMar>
+              <w:top w:type="dxa" w:w="60"/>
+              <w:left w:type="dxa" w:w="100"/>
+              <w:bottom w:type="dxa" w:w="60"/>
+              <w:right w:type="dxa" w:w="100"/>
+            </w:tcMar>
+          </w:tcPr>
+          <w:p>
+            <w:pPr>
+              <w:spacing w:after="0" w:before="0"/>
+            </w:pPr>
+            <w:r>
+              <w:rPr>
+                <w:color w:val="222222"/>
+                <w:sz w:val="18"/>
+                <w:szCs w:val="18"/>
+              </w:rPr>
+              <w:t xml:space="preserve">V60 (PCV) · Vivo 50/60 (PCV)</w:t>
             </w:r>
           </w:p>
         </w:tc>
@@ -9604,6 +9871,1315 @@
       <w:pPr>
         <w:spacing w:after="120"/>
       </w:pPr>
+    </w:p>
+    <w:p>
+      <w:pPr>
+        <w:pStyle w:val="Heading3"/>
+        <w:spacing w:after="140" w:before="280"/>
+      </w:pPr>
+      <w:r>
+        <w:t xml:space="preserve">5.2 Modos avanzados: qué aportan y qué no</w:t>
+      </w:r>
+    </w:p>
+    <w:p>
+      <w:pPr>
+        <w:pStyle w:val="ListParagraph"/>
+        <w:numPr>
+          <w:ilvl w:val="0"/>
+          <w:numId w:val="3"/>
+        </w:numPr>
+        <w:spacing w:after="60"/>
+      </w:pPr>
+      <w:r>
+        <w:rPr>
+          <w:b/>
+          <w:bCs/>
+        </w:rPr>
+        <w:t xml:space="preserve">AVAPS / iVAPS (presión de soporte con objetivo de volumen).</w:t>
+      </w:r>
+      <w:r>
+        <w:t xml:space="preserve"> La IPAP «flota» automáticamente entre un mínimo y un máximo para alcanzar un </w:t>
+      </w:r>
+      <w:r>
+        <w:rPr>
+          <w:b/>
+          <w:bCs/>
+        </w:rPr>
+        <w:t xml:space="preserve">Vt medio objetivo</w:t>
+      </w:r>
+      <w:r>
+        <w:t xml:space="preserve"> (AVAPS, Philips) o una </w:t>
+      </w:r>
+      <w:r>
+        <w:rPr>
+          <w:b/>
+          <w:bCs/>
+        </w:rPr>
+        <w:t xml:space="preserve">ventilación alveolar objetivo</w:t>
+      </w:r>
+      <w:r>
+        <w:t xml:space="preserve"> con FR inteligente (iVAPS, ResMed). Matiz clave: el ajuste es </w:t>
+      </w:r>
+      <w:r>
+        <w:rPr>
+          <w:b/>
+          <w:bCs/>
+        </w:rPr>
+        <w:t xml:space="preserve">GRADUAL (~1 cmH2O/min en AVAPS), no respiración a respiración</w:t>
+      </w:r>
+      <w:r>
+        <w:t xml:space="preserve"> — por eso </w:t>
+      </w:r>
+      <w:r>
+        <w:rPr>
+          <w:b/>
+          <w:bCs/>
+        </w:rPr>
+        <w:t xml:space="preserve">no es un modo de rescate agudo</w:t>
+      </w:r>
+      <w:r>
+        <w:t xml:space="preserve">: ante un deterioro brusco responde tarde. Su sitio es la hipoventilación sostenida (SHO, restrictivo) y el soporte prolongado/nocturno. Evidencia: en superobesos con fallo hipercápnico, AVAPS </w:t>
+      </w:r>
+      <w:r>
+        <w:rPr>
+          <w:b/>
+          <w:bCs/>
+        </w:rPr>
+        <w:t xml:space="preserve">no mostró ventaja sobre una PS bien titulada</w:t>
+      </w:r>
+      <w:r>
+        <w:t xml:space="preserve"> (Murphy, Thorax 2012 [29]). Parque: AVAPS en el V60; «volumen asegurado» en Vivo 50/60; iVAPS no disponible (equipos ResMed).</w:t>
+      </w:r>
+    </w:p>
+    <w:p>
+      <w:pPr>
+        <w:pStyle w:val="ListParagraph"/>
+        <w:numPr>
+          <w:ilvl w:val="0"/>
+          <w:numId w:val="3"/>
+        </w:numPr>
+        <w:spacing w:after="60"/>
+      </w:pPr>
+      <w:r>
+        <w:rPr>
+          <w:b/>
+          <w:bCs/>
+        </w:rPr>
+        <w:t xml:space="preserve">PAV y NAVA (modos proporcionales al esfuerzo).</w:t>
+      </w:r>
+      <w:r>
+        <w:t xml:space="preserve"> Asisten en proporción al esfuerzo instantáneo del paciente (PAV por mecánica estimada; NAVA por la actividad eléctrica diafragmática, catéter Edi). </w:t>
+      </w:r>
+      <w:r>
+        <w:rPr>
+          <w:b/>
+          <w:bCs/>
+        </w:rPr>
+        <w:t xml:space="preserve">Mejoran la sincronía</w:t>
+      </w:r>
+      <w:r>
+        <w:t xml:space="preserve"> — NAVA reduce el índice de asincronías frente a PS en estudios fisiológicos de VMNI (Piquilloud 2012 [31]) — pero </w:t>
+      </w:r>
+      <w:r>
+        <w:rPr>
+          <w:b/>
+          <w:bCs/>
+        </w:rPr>
+        <w:t xml:space="preserve">sin beneficio demostrado en resultados duros</w:t>
+      </w:r>
+      <w:r>
+        <w:t xml:space="preserve"> (mortalidad, intubación). PAV+ es hoy casi exclusivo de la ventilación invasiva (la PAV no invasiva se probó en agudos: Gay 2001 [32]); NAVA exige catéter Edi y ventilador Servo (Getinge): </w:t>
+      </w:r>
+      <w:r>
+        <w:rPr>
+          <w:b/>
+          <w:bCs/>
+        </w:rPr>
+        <w:t xml:space="preserve">ninguno disponible en el área</w:t>
+      </w:r>
+      <w:r>
+        <w:t xml:space="preserve">. Valor en la app: docente.</w:t>
+      </w:r>
+    </w:p>
+    <w:p>
+      <w:pPr>
+        <w:pStyle w:val="ListParagraph"/>
+        <w:numPr>
+          <w:ilvl w:val="0"/>
+          <w:numId w:val="3"/>
+        </w:numPr>
+        <w:spacing w:after="60"/>
+      </w:pPr>
+      <w:r>
+        <w:rPr>
+          <w:b/>
+          <w:bCs/>
+        </w:rPr>
+        <w:t xml:space="preserve">PRVC (presión regulada con volumen garantizado).</w:t>
+      </w:r>
+      <w:r>
+        <w:t xml:space="preserve"> Controlada por presión que retitula la presión respiración a respiración para garantizar el Vt. Adaptación de la invasiva; </w:t>
+      </w:r>
+      <w:r>
+        <w:rPr>
+          <w:b/>
+          <w:bCs/>
+        </w:rPr>
+        <w:t xml:space="preserve">uso residual en VMNI aguda</w:t>
+      </w:r>
+      <w:r>
+        <w:t xml:space="preserve"> (la fuga hace poco fiable el Vt medido).</w:t>
+      </w:r>
+    </w:p>
+    <w:p>
+      <w:pPr>
+        <w:pStyle w:val="ListParagraph"/>
+        <w:numPr>
+          <w:ilvl w:val="0"/>
+          <w:numId w:val="3"/>
+        </w:numPr>
+        <w:spacing w:after="60"/>
+      </w:pPr>
+      <w:r>
+        <w:rPr>
+          <w:b/>
+          <w:bCs/>
+        </w:rPr>
+        <w:t xml:space="preserve">ASV (ventilación servoadaptativa).</w:t>
+      </w:r>
+      <w:r>
+        <w:t xml:space="preserve"> Presión de soporte anticíclica (asiste más cuando el paciente ventila menos) diseñada para la respiración periódica / apnea central. ⚠️ </w:t>
+      </w:r>
+      <w:r>
+        <w:rPr>
+          <w:b/>
+          <w:bCs/>
+        </w:rPr>
+        <w:t xml:space="preserve">Aviso de seguridad obligatorio en la app:</w:t>
+      </w:r>
+      <w:r>
+        <w:t xml:space="preserve"> </w:t>
+      </w:r>
+      <w:r>
+        <w:rPr>
+          <w:b/>
+          <w:bCs/>
+        </w:rPr>
+        <w:t xml:space="preserve">contraindicada en la insuficiencia cardiaca con FEVI ≤45% y apnea central predominante</w:t>
+      </w:r>
+      <w:r>
+        <w:t xml:space="preserve"> — el ensayo SERVE-HF (Cowie, NEJM 2015 [30]) mostró </w:t>
+      </w:r>
+      <w:r>
+        <w:rPr>
+          <w:b/>
+          <w:bCs/>
+        </w:rPr>
+        <w:t xml:space="preserve">exceso de mortalidad cardiovascular</w:t>
+      </w:r>
+      <w:r>
+        <w:t xml:space="preserve"> (HR 1,34) en ese grupo. No disponible en Urgencias del área, pero algunos pacientes la llevan domiciliaria (unidades de sueño): ante un EAP/IC descompensada, comprobarlo.</w:t>
+      </w:r>
+    </w:p>
+    <w:p>
+      <w:pPr>
+        <w:pStyle w:val="Heading3"/>
+        <w:spacing w:after="140" w:before="280"/>
+      </w:pPr>
+      <w:r>
+        <w:t xml:space="preserve">5.3 Modo recomendado por escenario clínico (→ decisión abierta D-17)</w:t>
+      </w:r>
+    </w:p>
+    <w:tbl>
+      <w:tblPr>
+        <w:tblW w:type="dxa" w:w="9638"/>
+        <w:tblBorders>
+          <w:top w:val="single" w:color="auto" w:sz="4"/>
+          <w:left w:val="single" w:color="auto" w:sz="4"/>
+          <w:bottom w:val="single" w:color="auto" w:sz="4"/>
+          <w:right w:val="single" w:color="auto" w:sz="4"/>
+          <w:insideH w:val="single" w:color="auto" w:sz="4"/>
+          <w:insideV w:val="single" w:color="auto" w:sz="4"/>
+        </w:tblBorders>
+      </w:tblPr>
+      <w:tblGrid>
+        <w:gridCol w:w="2342"/>
+        <w:gridCol w:w="2207"/>
+        <w:gridCol w:w="2702"/>
+        <w:gridCol w:w="2387"/>
+      </w:tblGrid>
+      <w:tr>
+        <w:trPr>
+          <w:tblHeader/>
+        </w:trPr>
+        <w:tc>
+          <w:tcPr>
+            <w:tcW w:type="dxa" w:w="2342"/>
+            <w:tcBorders>
+              <w:top w:val="single" w:color="C9D6DA" w:sz="4"/>
+              <w:left w:val="single" w:color="C9D6DA" w:sz="4"/>
+              <w:bottom w:val="single" w:color="C9D6DA" w:sz="4"/>
+              <w:right w:val="single" w:color="C9D6DA" w:sz="4"/>
+            </w:tcBorders>
+            <w:shd w:fill="0F4C5C" w:val="clear"/>
+            <w:tcMar>
+              <w:top w:type="dxa" w:w="60"/>
+              <w:left w:type="dxa" w:w="100"/>
+              <w:bottom w:type="dxa" w:w="60"/>
+              <w:right w:type="dxa" w:w="100"/>
+            </w:tcMar>
+          </w:tcPr>
+          <w:p>
+            <w:pPr>
+              <w:spacing w:after="0" w:before="0"/>
+            </w:pPr>
+            <w:r>
+              <w:rPr>
+                <w:b/>
+                <w:bCs/>
+                <w:color w:val="FFFFFF"/>
+                <w:sz w:val="18"/>
+                <w:szCs w:val="18"/>
+              </w:rPr>
+              <w:t xml:space="preserve">Escenario</w:t>
+            </w:r>
+          </w:p>
+        </w:tc>
+        <w:tc>
+          <w:tcPr>
+            <w:tcW w:type="dxa" w:w="2207"/>
+            <w:tcBorders>
+              <w:top w:val="single" w:color="C9D6DA" w:sz="4"/>
+              <w:left w:val="single" w:color="C9D6DA" w:sz="4"/>
+              <w:bottom w:val="single" w:color="C9D6DA" w:sz="4"/>
+              <w:right w:val="single" w:color="C9D6DA" w:sz="4"/>
+            </w:tcBorders>
+            <w:shd w:fill="0F4C5C" w:val="clear"/>
+            <w:tcMar>
+              <w:top w:type="dxa" w:w="60"/>
+              <w:left w:type="dxa" w:w="100"/>
+              <w:bottom w:type="dxa" w:w="60"/>
+              <w:right w:type="dxa" w:w="100"/>
+            </w:tcMar>
+          </w:tcPr>
+          <w:p>
+            <w:pPr>
+              <w:spacing w:after="0" w:before="0"/>
+            </w:pPr>
+            <w:r>
+              <w:rPr>
+                <w:b/>
+                <w:bCs/>
+                <w:color w:val="FFFFFF"/>
+                <w:sz w:val="18"/>
+                <w:szCs w:val="18"/>
+              </w:rPr>
+              <w:t xml:space="preserve">Modo recomendado</w:t>
+            </w:r>
+          </w:p>
+        </w:tc>
+        <w:tc>
+          <w:tcPr>
+            <w:tcW w:type="dxa" w:w="2702"/>
+            <w:tcBorders>
+              <w:top w:val="single" w:color="C9D6DA" w:sz="4"/>
+              <w:left w:val="single" w:color="C9D6DA" w:sz="4"/>
+              <w:bottom w:val="single" w:color="C9D6DA" w:sz="4"/>
+              <w:right w:val="single" w:color="C9D6DA" w:sz="4"/>
+            </w:tcBorders>
+            <w:shd w:fill="0F4C5C" w:val="clear"/>
+            <w:tcMar>
+              <w:top w:type="dxa" w:w="60"/>
+              <w:left w:type="dxa" w:w="100"/>
+              <w:bottom w:type="dxa" w:w="60"/>
+              <w:right w:type="dxa" w:w="100"/>
+            </w:tcMar>
+          </w:tcPr>
+          <w:p>
+            <w:pPr>
+              <w:spacing w:after="0" w:before="0"/>
+            </w:pPr>
+            <w:r>
+              <w:rPr>
+                <w:b/>
+                <w:bCs/>
+                <w:color w:val="FFFFFF"/>
+                <w:sz w:val="18"/>
+                <w:szCs w:val="18"/>
+              </w:rPr>
+              <w:t xml:space="preserve">Alternativas / matices</w:t>
+            </w:r>
+          </w:p>
+        </w:tc>
+        <w:tc>
+          <w:tcPr>
+            <w:tcW w:type="dxa" w:w="2387"/>
+            <w:tcBorders>
+              <w:top w:val="single" w:color="C9D6DA" w:sz="4"/>
+              <w:left w:val="single" w:color="C9D6DA" w:sz="4"/>
+              <w:bottom w:val="single" w:color="C9D6DA" w:sz="4"/>
+              <w:right w:val="single" w:color="C9D6DA" w:sz="4"/>
+            </w:tcBorders>
+            <w:shd w:fill="0F4C5C" w:val="clear"/>
+            <w:tcMar>
+              <w:top w:type="dxa" w:w="60"/>
+              <w:left w:type="dxa" w:w="100"/>
+              <w:bottom w:type="dxa" w:w="60"/>
+              <w:right w:type="dxa" w:w="100"/>
+            </w:tcMar>
+          </w:tcPr>
+          <w:p>
+            <w:pPr>
+              <w:spacing w:after="0" w:before="0"/>
+            </w:pPr>
+            <w:r>
+              <w:rPr>
+                <w:b/>
+                <w:bCs/>
+                <w:color w:val="FFFFFF"/>
+                <w:sz w:val="18"/>
+                <w:szCs w:val="18"/>
+              </w:rPr>
+              <w:t xml:space="preserve">Referencia</w:t>
+            </w:r>
+          </w:p>
+        </w:tc>
+      </w:tr>
+      <w:tr>
+        <w:tc>
+          <w:tcPr>
+            <w:tcW w:type="dxa" w:w="2342"/>
+            <w:tcBorders>
+              <w:top w:val="single" w:color="C9D6DA" w:sz="4"/>
+              <w:left w:val="single" w:color="C9D6DA" w:sz="4"/>
+              <w:bottom w:val="single" w:color="C9D6DA" w:sz="4"/>
+              <w:right w:val="single" w:color="C9D6DA" w:sz="4"/>
+            </w:tcBorders>
+            <w:tcMar>
+              <w:top w:type="dxa" w:w="60"/>
+              <w:left w:type="dxa" w:w="100"/>
+              <w:bottom w:type="dxa" w:w="60"/>
+              <w:right w:type="dxa" w:w="100"/>
+            </w:tcMar>
+          </w:tcPr>
+          <w:p>
+            <w:pPr>
+              <w:spacing w:after="0" w:before="0"/>
+            </w:pPr>
+            <w:r>
+              <w:rPr>
+                <w:color w:val="222222"/>
+                <w:sz w:val="18"/>
+                <w:szCs w:val="18"/>
+              </w:rPr>
+              <w:t xml:space="preserve">EAP / IC aguda</w:t>
+            </w:r>
+          </w:p>
+        </w:tc>
+        <w:tc>
+          <w:tcPr>
+            <w:tcW w:type="dxa" w:w="2207"/>
+            <w:tcBorders>
+              <w:top w:val="single" w:color="C9D6DA" w:sz="4"/>
+              <w:left w:val="single" w:color="C9D6DA" w:sz="4"/>
+              <w:bottom w:val="single" w:color="C9D6DA" w:sz="4"/>
+              <w:right w:val="single" w:color="C9D6DA" w:sz="4"/>
+            </w:tcBorders>
+            <w:tcMar>
+              <w:top w:type="dxa" w:w="60"/>
+              <w:left w:type="dxa" w:w="100"/>
+              <w:bottom w:type="dxa" w:w="60"/>
+              <w:right w:type="dxa" w:w="100"/>
+            </w:tcMar>
+          </w:tcPr>
+          <w:p>
+            <w:pPr>
+              <w:spacing w:after="0" w:before="0"/>
+            </w:pPr>
+            <w:r>
+              <w:rPr>
+                <w:b/>
+                <w:bCs/>
+                <w:color w:val="222222"/>
+                <w:sz w:val="18"/>
+                <w:szCs w:val="18"/>
+              </w:rPr>
+              <w:t xml:space="preserve">CPAP</w:t>
+            </w:r>
+          </w:p>
+        </w:tc>
+        <w:tc>
+          <w:tcPr>
+            <w:tcW w:type="dxa" w:w="2702"/>
+            <w:tcBorders>
+              <w:top w:val="single" w:color="C9D6DA" w:sz="4"/>
+              <w:left w:val="single" w:color="C9D6DA" w:sz="4"/>
+              <w:bottom w:val="single" w:color="C9D6DA" w:sz="4"/>
+              <w:right w:val="single" w:color="C9D6DA" w:sz="4"/>
+            </w:tcBorders>
+            <w:tcMar>
+              <w:top w:type="dxa" w:w="60"/>
+              <w:left w:type="dxa" w:w="100"/>
+              <w:bottom w:type="dxa" w:w="60"/>
+              <w:right w:type="dxa" w:w="100"/>
+            </w:tcMar>
+          </w:tcPr>
+          <w:p>
+            <w:pPr>
+              <w:spacing w:after="0" w:before="0"/>
+            </w:pPr>
+            <w:r>
+              <w:rPr>
+                <w:color w:val="222222"/>
+                <w:sz w:val="18"/>
+                <w:szCs w:val="18"/>
+              </w:rPr>
+              <w:t xml:space="preserve">Binivel S/T equivalente (preferirlo si hipercapnia, acidosis o fatiga)</w:t>
+            </w:r>
+          </w:p>
+        </w:tc>
+        <w:tc>
+          <w:tcPr>
+            <w:tcW w:type="dxa" w:w="2387"/>
+            <w:tcBorders>
+              <w:top w:val="single" w:color="C9D6DA" w:sz="4"/>
+              <w:left w:val="single" w:color="C9D6DA" w:sz="4"/>
+              <w:bottom w:val="single" w:color="C9D6DA" w:sz="4"/>
+              <w:right w:val="single" w:color="C9D6DA" w:sz="4"/>
+            </w:tcBorders>
+            <w:tcMar>
+              <w:top w:type="dxa" w:w="60"/>
+              <w:left w:type="dxa" w:w="100"/>
+              <w:bottom w:type="dxa" w:w="60"/>
+              <w:right w:type="dxa" w:w="100"/>
+            </w:tcMar>
+          </w:tcPr>
+          <w:p>
+            <w:pPr>
+              <w:spacing w:after="0" w:before="0"/>
+            </w:pPr>
+            <w:r>
+              <w:rPr>
+                <w:color w:val="222222"/>
+                <w:sz w:val="18"/>
+                <w:szCs w:val="18"/>
+              </w:rPr>
+              <w:t xml:space="preserve">ERS/ATS 2017 Q2a; ESC 2021; Masip 2018; Cochrane 2019</w:t>
+            </w:r>
+          </w:p>
+        </w:tc>
+      </w:tr>
+      <w:tr>
+        <w:tc>
+          <w:tcPr>
+            <w:tcW w:type="dxa" w:w="2342"/>
+            <w:tcBorders>
+              <w:top w:val="single" w:color="C9D6DA" w:sz="4"/>
+              <w:left w:val="single" w:color="C9D6DA" w:sz="4"/>
+              <w:bottom w:val="single" w:color="C9D6DA" w:sz="4"/>
+              <w:right w:val="single" w:color="C9D6DA" w:sz="4"/>
+            </w:tcBorders>
+            <w:shd w:fill="F5FAFB" w:val="clear"/>
+            <w:tcMar>
+              <w:top w:type="dxa" w:w="60"/>
+              <w:left w:type="dxa" w:w="100"/>
+              <w:bottom w:type="dxa" w:w="60"/>
+              <w:right w:type="dxa" w:w="100"/>
+            </w:tcMar>
+          </w:tcPr>
+          <w:p>
+            <w:pPr>
+              <w:spacing w:after="0" w:before="0"/>
+            </w:pPr>
+            <w:r>
+              <w:rPr>
+                <w:color w:val="222222"/>
+                <w:sz w:val="18"/>
+                <w:szCs w:val="18"/>
+              </w:rPr>
+              <w:t xml:space="preserve">EPOC hipercápnico (pH &lt;7,35)</w:t>
+            </w:r>
+          </w:p>
+        </w:tc>
+        <w:tc>
+          <w:tcPr>
+            <w:tcW w:type="dxa" w:w="2207"/>
+            <w:tcBorders>
+              <w:top w:val="single" w:color="C9D6DA" w:sz="4"/>
+              <w:left w:val="single" w:color="C9D6DA" w:sz="4"/>
+              <w:bottom w:val="single" w:color="C9D6DA" w:sz="4"/>
+              <w:right w:val="single" w:color="C9D6DA" w:sz="4"/>
+            </w:tcBorders>
+            <w:shd w:fill="F5FAFB" w:val="clear"/>
+            <w:tcMar>
+              <w:top w:type="dxa" w:w="60"/>
+              <w:left w:type="dxa" w:w="100"/>
+              <w:bottom w:type="dxa" w:w="60"/>
+              <w:right w:type="dxa" w:w="100"/>
+            </w:tcMar>
+          </w:tcPr>
+          <w:p>
+            <w:pPr>
+              <w:spacing w:after="0" w:before="0"/>
+            </w:pPr>
+            <w:r>
+              <w:rPr>
+                <w:b/>
+                <w:bCs/>
+                <w:color w:val="222222"/>
+                <w:sz w:val="18"/>
+                <w:szCs w:val="18"/>
+              </w:rPr>
+              <w:t xml:space="preserve">Binivel S/T</w:t>
+            </w:r>
+          </w:p>
+        </w:tc>
+        <w:tc>
+          <w:tcPr>
+            <w:tcW w:type="dxa" w:w="2702"/>
+            <w:tcBorders>
+              <w:top w:val="single" w:color="C9D6DA" w:sz="4"/>
+              <w:left w:val="single" w:color="C9D6DA" w:sz="4"/>
+              <w:bottom w:val="single" w:color="C9D6DA" w:sz="4"/>
+              <w:right w:val="single" w:color="C9D6DA" w:sz="4"/>
+            </w:tcBorders>
+            <w:shd w:fill="F5FAFB" w:val="clear"/>
+            <w:tcMar>
+              <w:top w:type="dxa" w:w="60"/>
+              <w:left w:type="dxa" w:w="100"/>
+              <w:bottom w:type="dxa" w:w="60"/>
+              <w:right w:type="dxa" w:w="100"/>
+            </w:tcMar>
+          </w:tcPr>
+          <w:p>
+            <w:pPr>
+              <w:spacing w:after="0" w:before="0"/>
+            </w:pPr>
+            <w:r>
+              <w:rPr>
+                <w:color w:val="222222"/>
+                <w:sz w:val="18"/>
+                <w:szCs w:val="18"/>
+              </w:rPr>
+              <w:t xml:space="preserve">TAFCN si acidemia leve (pH &gt;7,25) con monitorización (ATS 2026); PCV con Ti fijo si asincronía refractaria</w:t>
+            </w:r>
+          </w:p>
+        </w:tc>
+        <w:tc>
+          <w:tcPr>
+            <w:tcW w:type="dxa" w:w="2387"/>
+            <w:tcBorders>
+              <w:top w:val="single" w:color="C9D6DA" w:sz="4"/>
+              <w:left w:val="single" w:color="C9D6DA" w:sz="4"/>
+              <w:bottom w:val="single" w:color="C9D6DA" w:sz="4"/>
+              <w:right w:val="single" w:color="C9D6DA" w:sz="4"/>
+            </w:tcBorders>
+            <w:shd w:fill="F5FAFB" w:val="clear"/>
+            <w:tcMar>
+              <w:top w:type="dxa" w:w="60"/>
+              <w:left w:type="dxa" w:w="100"/>
+              <w:bottom w:type="dxa" w:w="60"/>
+              <w:right w:type="dxa" w:w="100"/>
+            </w:tcMar>
+          </w:tcPr>
+          <w:p>
+            <w:pPr>
+              <w:spacing w:after="0" w:before="0"/>
+            </w:pPr>
+            <w:r>
+              <w:rPr>
+                <w:color w:val="222222"/>
+                <w:sz w:val="18"/>
+                <w:szCs w:val="18"/>
+              </w:rPr>
+              <w:t xml:space="preserve">BTS 2016; ERS/ATS 2017 Q1b; consenso 2021; GOLD</w:t>
+            </w:r>
+          </w:p>
+        </w:tc>
+      </w:tr>
+      <w:tr>
+        <w:tc>
+          <w:tcPr>
+            <w:tcW w:type="dxa" w:w="2342"/>
+            <w:tcBorders>
+              <w:top w:val="single" w:color="C9D6DA" w:sz="4"/>
+              <w:left w:val="single" w:color="C9D6DA" w:sz="4"/>
+              <w:bottom w:val="single" w:color="C9D6DA" w:sz="4"/>
+              <w:right w:val="single" w:color="C9D6DA" w:sz="4"/>
+            </w:tcBorders>
+            <w:tcMar>
+              <w:top w:type="dxa" w:w="60"/>
+              <w:left w:type="dxa" w:w="100"/>
+              <w:bottom w:type="dxa" w:w="60"/>
+              <w:right w:type="dxa" w:w="100"/>
+            </w:tcMar>
+          </w:tcPr>
+          <w:p>
+            <w:pPr>
+              <w:spacing w:after="0" w:before="0"/>
+            </w:pPr>
+            <w:r>
+              <w:rPr>
+                <w:color w:val="222222"/>
+                <w:sz w:val="18"/>
+                <w:szCs w:val="18"/>
+              </w:rPr>
+              <w:t xml:space="preserve">SHO / restrictivo toracógeno</w:t>
+            </w:r>
+          </w:p>
+        </w:tc>
+        <w:tc>
+          <w:tcPr>
+            <w:tcW w:type="dxa" w:w="2207"/>
+            <w:tcBorders>
+              <w:top w:val="single" w:color="C9D6DA" w:sz="4"/>
+              <w:left w:val="single" w:color="C9D6DA" w:sz="4"/>
+              <w:bottom w:val="single" w:color="C9D6DA" w:sz="4"/>
+              <w:right w:val="single" w:color="C9D6DA" w:sz="4"/>
+            </w:tcBorders>
+            <w:tcMar>
+              <w:top w:type="dxa" w:w="60"/>
+              <w:left w:type="dxa" w:w="100"/>
+              <w:bottom w:type="dxa" w:w="60"/>
+              <w:right w:type="dxa" w:w="100"/>
+            </w:tcMar>
+          </w:tcPr>
+          <w:p>
+            <w:pPr>
+              <w:spacing w:after="0" w:before="0"/>
+            </w:pPr>
+            <w:r>
+              <w:rPr>
+                <w:b/>
+                <w:bCs/>
+                <w:color w:val="222222"/>
+                <w:sz w:val="18"/>
+                <w:szCs w:val="18"/>
+              </w:rPr>
+              <w:t xml:space="preserve">Binivel S/T</w:t>
+            </w:r>
+          </w:p>
+        </w:tc>
+        <w:tc>
+          <w:tcPr>
+            <w:tcW w:type="dxa" w:w="2702"/>
+            <w:tcBorders>
+              <w:top w:val="single" w:color="C9D6DA" w:sz="4"/>
+              <w:left w:val="single" w:color="C9D6DA" w:sz="4"/>
+              <w:bottom w:val="single" w:color="C9D6DA" w:sz="4"/>
+              <w:right w:val="single" w:color="C9D6DA" w:sz="4"/>
+            </w:tcBorders>
+            <w:tcMar>
+              <w:top w:type="dxa" w:w="60"/>
+              <w:left w:type="dxa" w:w="100"/>
+              <w:bottom w:type="dxa" w:w="60"/>
+              <w:right w:type="dxa" w:w="100"/>
+            </w:tcMar>
+          </w:tcPr>
+          <w:p>
+            <w:pPr>
+              <w:spacing w:after="0" w:before="0"/>
+            </w:pPr>
+            <w:r>
+              <w:rPr>
+                <w:color w:val="222222"/>
+                <w:sz w:val="18"/>
+                <w:szCs w:val="18"/>
+              </w:rPr>
+              <w:t xml:space="preserve">PCV con Ti largo (1,2–1,5 s); </w:t>
+            </w:r>
+            <w:r>
+              <w:rPr>
+                <w:b/>
+                <w:bCs/>
+                <w:color w:val="222222"/>
+                <w:sz w:val="18"/>
+                <w:szCs w:val="18"/>
+              </w:rPr>
+              <w:t xml:space="preserve">± volumen asegurado</w:t>
+            </w:r>
+            <w:r>
+              <w:rPr>
+                <w:color w:val="222222"/>
+                <w:sz w:val="18"/>
+                <w:szCs w:val="18"/>
+              </w:rPr>
+              <w:t xml:space="preserve"> si Vt insuficiente pese a IPAP alta o para soporte prolongado/nocturno (no como rescate: ajuste gradual)</w:t>
+            </w:r>
+          </w:p>
+        </w:tc>
+        <w:tc>
+          <w:tcPr>
+            <w:tcW w:type="dxa" w:w="2387"/>
+            <w:tcBorders>
+              <w:top w:val="single" w:color="C9D6DA" w:sz="4"/>
+              <w:left w:val="single" w:color="C9D6DA" w:sz="4"/>
+              <w:bottom w:val="single" w:color="C9D6DA" w:sz="4"/>
+              <w:right w:val="single" w:color="C9D6DA" w:sz="4"/>
+            </w:tcBorders>
+            <w:tcMar>
+              <w:top w:type="dxa" w:w="60"/>
+              <w:left w:type="dxa" w:w="100"/>
+              <w:bottom w:type="dxa" w:w="60"/>
+              <w:right w:type="dxa" w:w="100"/>
+            </w:tcMar>
+          </w:tcPr>
+          <w:p>
+            <w:pPr>
+              <w:spacing w:after="0" w:before="0"/>
+            </w:pPr>
+            <w:r>
+              <w:rPr>
+                <w:color w:val="222222"/>
+                <w:sz w:val="18"/>
+                <w:szCs w:val="18"/>
+              </w:rPr>
+              <w:t xml:space="preserve">BTS 2016 rec. 57; consenso 2021; Murphy 2012 [29]</w:t>
+            </w:r>
+          </w:p>
+        </w:tc>
+      </w:tr>
+      <w:tr>
+        <w:tc>
+          <w:tcPr>
+            <w:tcW w:type="dxa" w:w="2342"/>
+            <w:tcBorders>
+              <w:top w:val="single" w:color="C9D6DA" w:sz="4"/>
+              <w:left w:val="single" w:color="C9D6DA" w:sz="4"/>
+              <w:bottom w:val="single" w:color="C9D6DA" w:sz="4"/>
+              <w:right w:val="single" w:color="C9D6DA" w:sz="4"/>
+            </w:tcBorders>
+            <w:shd w:fill="F5FAFB" w:val="clear"/>
+            <w:tcMar>
+              <w:top w:type="dxa" w:w="60"/>
+              <w:left w:type="dxa" w:w="100"/>
+              <w:bottom w:type="dxa" w:w="60"/>
+              <w:right w:type="dxa" w:w="100"/>
+            </w:tcMar>
+          </w:tcPr>
+          <w:p>
+            <w:pPr>
+              <w:spacing w:after="0" w:before="0"/>
+            </w:pPr>
+            <w:r>
+              <w:rPr>
+                <w:color w:val="222222"/>
+                <w:sz w:val="18"/>
+                <w:szCs w:val="18"/>
+              </w:rPr>
+              <w:t xml:space="preserve">Neuromuscular</w:t>
+            </w:r>
+          </w:p>
+        </w:tc>
+        <w:tc>
+          <w:tcPr>
+            <w:tcW w:type="dxa" w:w="2207"/>
+            <w:tcBorders>
+              <w:top w:val="single" w:color="C9D6DA" w:sz="4"/>
+              <w:left w:val="single" w:color="C9D6DA" w:sz="4"/>
+              <w:bottom w:val="single" w:color="C9D6DA" w:sz="4"/>
+              <w:right w:val="single" w:color="C9D6DA" w:sz="4"/>
+            </w:tcBorders>
+            <w:shd w:fill="F5FAFB" w:val="clear"/>
+            <w:tcMar>
+              <w:top w:type="dxa" w:w="60"/>
+              <w:left w:type="dxa" w:w="100"/>
+              <w:bottom w:type="dxa" w:w="60"/>
+              <w:right w:type="dxa" w:w="100"/>
+            </w:tcMar>
+          </w:tcPr>
+          <w:p>
+            <w:pPr>
+              <w:spacing w:after="0" w:before="0"/>
+            </w:pPr>
+            <w:r>
+              <w:rPr>
+                <w:b/>
+                <w:bCs/>
+                <w:color w:val="222222"/>
+                <w:sz w:val="18"/>
+                <w:szCs w:val="18"/>
+              </w:rPr>
+              <w:t xml:space="preserve">S/T o PCV con Ti largo</w:t>
+            </w:r>
+            <w:r>
+              <w:rPr>
+                <w:color w:val="222222"/>
+                <w:sz w:val="18"/>
+                <w:szCs w:val="18"/>
+              </w:rPr>
+              <w:t xml:space="preserve"> (PCV si disparo débil)</w:t>
+            </w:r>
+          </w:p>
+        </w:tc>
+        <w:tc>
+          <w:tcPr>
+            <w:tcW w:type="dxa" w:w="2702"/>
+            <w:tcBorders>
+              <w:top w:val="single" w:color="C9D6DA" w:sz="4"/>
+              <w:left w:val="single" w:color="C9D6DA" w:sz="4"/>
+              <w:bottom w:val="single" w:color="C9D6DA" w:sz="4"/>
+              <w:right w:val="single" w:color="C9D6DA" w:sz="4"/>
+            </w:tcBorders>
+            <w:shd w:fill="F5FAFB" w:val="clear"/>
+            <w:tcMar>
+              <w:top w:type="dxa" w:w="60"/>
+              <w:left w:type="dxa" w:w="100"/>
+              <w:bottom w:type="dxa" w:w="60"/>
+              <w:right w:type="dxa" w:w="100"/>
+            </w:tcMar>
+          </w:tcPr>
+          <w:p>
+            <w:pPr>
+              <w:spacing w:after="0" w:before="0"/>
+            </w:pPr>
+            <w:r>
+              <w:rPr>
+                <w:color w:val="222222"/>
+                <w:sz w:val="18"/>
+                <w:szCs w:val="18"/>
+              </w:rPr>
+              <w:t xml:space="preserve">Volumen asegurado para soporte prolongado; no retrasar IOT si falla</w:t>
+            </w:r>
+          </w:p>
+        </w:tc>
+        <w:tc>
+          <w:tcPr>
+            <w:tcW w:type="dxa" w:w="2387"/>
+            <w:tcBorders>
+              <w:top w:val="single" w:color="C9D6DA" w:sz="4"/>
+              <w:left w:val="single" w:color="C9D6DA" w:sz="4"/>
+              <w:bottom w:val="single" w:color="C9D6DA" w:sz="4"/>
+              <w:right w:val="single" w:color="C9D6DA" w:sz="4"/>
+            </w:tcBorders>
+            <w:shd w:fill="F5FAFB" w:val="clear"/>
+            <w:tcMar>
+              <w:top w:type="dxa" w:w="60"/>
+              <w:left w:type="dxa" w:w="100"/>
+              <w:bottom w:type="dxa" w:w="60"/>
+              <w:right w:type="dxa" w:w="100"/>
+            </w:tcMar>
+          </w:tcPr>
+          <w:p>
+            <w:pPr>
+              <w:spacing w:after="0" w:before="0"/>
+            </w:pPr>
+            <w:r>
+              <w:rPr>
+                <w:color w:val="222222"/>
+                <w:sz w:val="18"/>
+                <w:szCs w:val="18"/>
+              </w:rPr>
+              <w:t xml:space="preserve">BTS 2016 rec. 50–53</w:t>
+            </w:r>
+          </w:p>
+        </w:tc>
+      </w:tr>
+      <w:tr>
+        <w:tc>
+          <w:tcPr>
+            <w:tcW w:type="dxa" w:w="2342"/>
+            <w:tcBorders>
+              <w:top w:val="single" w:color="C9D6DA" w:sz="4"/>
+              <w:left w:val="single" w:color="C9D6DA" w:sz="4"/>
+              <w:bottom w:val="single" w:color="C9D6DA" w:sz="4"/>
+              <w:right w:val="single" w:color="C9D6DA" w:sz="4"/>
+            </w:tcBorders>
+            <w:tcMar>
+              <w:top w:type="dxa" w:w="60"/>
+              <w:left w:type="dxa" w:w="100"/>
+              <w:bottom w:type="dxa" w:w="60"/>
+              <w:right w:type="dxa" w:w="100"/>
+            </w:tcMar>
+          </w:tcPr>
+          <w:p>
+            <w:pPr>
+              <w:spacing w:after="0" w:before="0"/>
+            </w:pPr>
+            <w:r>
+              <w:rPr>
+                <w:color w:val="222222"/>
+                <w:sz w:val="18"/>
+                <w:szCs w:val="18"/>
+              </w:rPr>
+              <w:t xml:space="preserve">Sin estímulo respiratorio / sedación (VNI mantenida)</w:t>
+            </w:r>
+          </w:p>
+        </w:tc>
+        <w:tc>
+          <w:tcPr>
+            <w:tcW w:type="dxa" w:w="2207"/>
+            <w:tcBorders>
+              <w:top w:val="single" w:color="C9D6DA" w:sz="4"/>
+              <w:left w:val="single" w:color="C9D6DA" w:sz="4"/>
+              <w:bottom w:val="single" w:color="C9D6DA" w:sz="4"/>
+              <w:right w:val="single" w:color="C9D6DA" w:sz="4"/>
+            </w:tcBorders>
+            <w:tcMar>
+              <w:top w:type="dxa" w:w="60"/>
+              <w:left w:type="dxa" w:w="100"/>
+              <w:bottom w:type="dxa" w:w="60"/>
+              <w:right w:type="dxa" w:w="100"/>
+            </w:tcMar>
+          </w:tcPr>
+          <w:p>
+            <w:pPr>
+              <w:spacing w:after="0" w:before="0"/>
+            </w:pPr>
+            <w:r>
+              <w:rPr>
+                <w:b/>
+                <w:bCs/>
+                <w:color w:val="222222"/>
+                <w:sz w:val="18"/>
+                <w:szCs w:val="18"/>
+              </w:rPr>
+              <w:t xml:space="preserve">T</w:t>
+            </w:r>
+            <w:r>
+              <w:rPr>
+                <w:color w:val="222222"/>
+                <w:sz w:val="18"/>
+                <w:szCs w:val="18"/>
+              </w:rPr>
+              <w:t xml:space="preserve"> (o PCV con FR fija)</w:t>
+            </w:r>
+          </w:p>
+        </w:tc>
+        <w:tc>
+          <w:tcPr>
+            <w:tcW w:type="dxa" w:w="2702"/>
+            <w:tcBorders>
+              <w:top w:val="single" w:color="C9D6DA" w:sz="4"/>
+              <w:left w:val="single" w:color="C9D6DA" w:sz="4"/>
+              <w:bottom w:val="single" w:color="C9D6DA" w:sz="4"/>
+              <w:right w:val="single" w:color="C9D6DA" w:sz="4"/>
+            </w:tcBorders>
+            <w:tcMar>
+              <w:top w:type="dxa" w:w="60"/>
+              <w:left w:type="dxa" w:w="100"/>
+              <w:bottom w:type="dxa" w:w="60"/>
+              <w:right w:type="dxa" w:w="100"/>
+            </w:tcMar>
+          </w:tcPr>
+          <w:p>
+            <w:pPr>
+              <w:spacing w:after="0" w:before="0"/>
+            </w:pPr>
+            <w:r>
+              <w:rPr>
+                <w:color w:val="222222"/>
+                <w:sz w:val="18"/>
+                <w:szCs w:val="18"/>
+              </w:rPr>
+              <w:t xml:space="preserve">Solo en entorno monitorizado con vía aérea vigilada; reevaluar indicación de IOT</w:t>
+            </w:r>
+          </w:p>
+        </w:tc>
+        <w:tc>
+          <w:tcPr>
+            <w:tcW w:type="dxa" w:w="2387"/>
+            <w:tcBorders>
+              <w:top w:val="single" w:color="C9D6DA" w:sz="4"/>
+              <w:left w:val="single" w:color="C9D6DA" w:sz="4"/>
+              <w:bottom w:val="single" w:color="C9D6DA" w:sz="4"/>
+              <w:right w:val="single" w:color="C9D6DA" w:sz="4"/>
+            </w:tcBorders>
+            <w:tcMar>
+              <w:top w:type="dxa" w:w="60"/>
+              <w:left w:type="dxa" w:w="100"/>
+              <w:bottom w:type="dxa" w:w="60"/>
+              <w:right w:type="dxa" w:w="100"/>
+            </w:tcMar>
+          </w:tcPr>
+          <w:p>
+            <w:pPr>
+              <w:spacing w:after="0" w:before="0"/>
+            </w:pPr>
+            <w:r>
+              <w:rPr>
+                <w:color w:val="222222"/>
+                <w:sz w:val="18"/>
+                <w:szCs w:val="18"/>
+              </w:rPr>
+              <w:t xml:space="preserve">BTS 2016; consenso 2021 (criterio operativo)</w:t>
+            </w:r>
+          </w:p>
+        </w:tc>
+      </w:tr>
+      <w:tr>
+        <w:tc>
+          <w:tcPr>
+            <w:tcW w:type="dxa" w:w="2342"/>
+            <w:tcBorders>
+              <w:top w:val="single" w:color="C9D6DA" w:sz="4"/>
+              <w:left w:val="single" w:color="C9D6DA" w:sz="4"/>
+              <w:bottom w:val="single" w:color="C9D6DA" w:sz="4"/>
+              <w:right w:val="single" w:color="C9D6DA" w:sz="4"/>
+            </w:tcBorders>
+            <w:shd w:fill="F5FAFB" w:val="clear"/>
+            <w:tcMar>
+              <w:top w:type="dxa" w:w="60"/>
+              <w:left w:type="dxa" w:w="100"/>
+              <w:bottom w:type="dxa" w:w="60"/>
+              <w:right w:type="dxa" w:w="100"/>
+            </w:tcMar>
+          </w:tcPr>
+          <w:p>
+            <w:pPr>
+              <w:spacing w:after="0" w:before="0"/>
+            </w:pPr>
+            <w:r>
+              <w:rPr>
+                <w:color w:val="222222"/>
+                <w:sz w:val="18"/>
+                <w:szCs w:val="18"/>
+              </w:rPr>
+              <w:t xml:space="preserve">Hipoxémico de novo</w:t>
+            </w:r>
+          </w:p>
+        </w:tc>
+        <w:tc>
+          <w:tcPr>
+            <w:tcW w:type="dxa" w:w="2207"/>
+            <w:tcBorders>
+              <w:top w:val="single" w:color="C9D6DA" w:sz="4"/>
+              <w:left w:val="single" w:color="C9D6DA" w:sz="4"/>
+              <w:bottom w:val="single" w:color="C9D6DA" w:sz="4"/>
+              <w:right w:val="single" w:color="C9D6DA" w:sz="4"/>
+            </w:tcBorders>
+            <w:shd w:fill="F5FAFB" w:val="clear"/>
+            <w:tcMar>
+              <w:top w:type="dxa" w:w="60"/>
+              <w:left w:type="dxa" w:w="100"/>
+              <w:bottom w:type="dxa" w:w="60"/>
+              <w:right w:type="dxa" w:w="100"/>
+            </w:tcMar>
+          </w:tcPr>
+          <w:p>
+            <w:pPr>
+              <w:spacing w:after="0" w:before="0"/>
+            </w:pPr>
+            <w:r>
+              <w:rPr>
+                <w:b/>
+                <w:bCs/>
+                <w:color w:val="222222"/>
+                <w:sz w:val="18"/>
+                <w:szCs w:val="18"/>
+              </w:rPr>
+              <w:t xml:space="preserve">TAFCN</w:t>
+            </w:r>
+            <w:r>
+              <w:rPr>
+                <w:color w:val="222222"/>
+                <w:sz w:val="18"/>
+                <w:szCs w:val="18"/>
+              </w:rPr>
+              <w:t xml:space="preserve"> (1.ª línea)</w:t>
+            </w:r>
+          </w:p>
+        </w:tc>
+        <w:tc>
+          <w:tcPr>
+            <w:tcW w:type="dxa" w:w="2702"/>
+            <w:tcBorders>
+              <w:top w:val="single" w:color="C9D6DA" w:sz="4"/>
+              <w:left w:val="single" w:color="C9D6DA" w:sz="4"/>
+              <w:bottom w:val="single" w:color="C9D6DA" w:sz="4"/>
+              <w:right w:val="single" w:color="C9D6DA" w:sz="4"/>
+            </w:tcBorders>
+            <w:shd w:fill="F5FAFB" w:val="clear"/>
+            <w:tcMar>
+              <w:top w:type="dxa" w:w="60"/>
+              <w:left w:type="dxa" w:w="100"/>
+              <w:bottom w:type="dxa" w:w="60"/>
+              <w:right w:type="dxa" w:w="100"/>
+            </w:tcMar>
+          </w:tcPr>
+          <w:p>
+            <w:pPr>
+              <w:spacing w:after="0" w:before="0"/>
+            </w:pPr>
+            <w:r>
+              <w:rPr>
+                <w:color w:val="222222"/>
+                <w:sz w:val="18"/>
+                <w:szCs w:val="18"/>
+              </w:rPr>
+              <w:t xml:space="preserve">CPAP (mascarilla o helmet) o binivel según antecedentes</w:t>
+            </w:r>
+          </w:p>
+        </w:tc>
+        <w:tc>
+          <w:tcPr>
+            <w:tcW w:type="dxa" w:w="2387"/>
+            <w:tcBorders>
+              <w:top w:val="single" w:color="C9D6DA" w:sz="4"/>
+              <w:left w:val="single" w:color="C9D6DA" w:sz="4"/>
+              <w:bottom w:val="single" w:color="C9D6DA" w:sz="4"/>
+              <w:right w:val="single" w:color="C9D6DA" w:sz="4"/>
+            </w:tcBorders>
+            <w:shd w:fill="F5FAFB" w:val="clear"/>
+            <w:tcMar>
+              <w:top w:type="dxa" w:w="60"/>
+              <w:left w:type="dxa" w:w="100"/>
+              <w:bottom w:type="dxa" w:w="60"/>
+              <w:right w:type="dxa" w:w="100"/>
+            </w:tcMar>
+          </w:tcPr>
+          <w:p>
+            <w:pPr>
+              <w:spacing w:after="0" w:before="0"/>
+            </w:pPr>
+            <w:r>
+              <w:rPr>
+                <w:color w:val="222222"/>
+                <w:sz w:val="18"/>
+                <w:szCs w:val="18"/>
+              </w:rPr>
+              <w:t xml:space="preserve">ATS 2026 PICO1</w:t>
+            </w:r>
+          </w:p>
+        </w:tc>
+      </w:tr>
+    </w:tbl>
+    <w:p>
+      <w:pPr>
+        <w:spacing w:after="120"/>
+      </w:pPr>
+    </w:p>
+    <w:p>
+      <w:pPr>
+        <w:pStyle w:val="Heading3"/>
+        <w:spacing w:after="140" w:before="280"/>
+      </w:pPr>
+      <w:r>
+        <w:t xml:space="preserve">5.4 Cambio de modo según evolución (→ decisión abierta D-18)</w:t>
+      </w:r>
+    </w:p>
+    <w:p>
+      <w:pPr>
+        <w:pStyle w:val="ListParagraph"/>
+        <w:numPr>
+          <w:ilvl w:val="0"/>
+          <w:numId w:val="2"/>
+        </w:numPr>
+        <w:spacing w:after="60"/>
+      </w:pPr>
+      <w:r>
+        <w:rPr>
+          <w:b/>
+          <w:bCs/>
+        </w:rPr>
+        <w:t xml:space="preserve">Asincronía persistente</w:t>
+      </w:r>
+      <w:r>
+        <w:t xml:space="preserve"> pese a optimizar fugas, trigger, rampa y % de ciclado (§10) → valorar </w:t>
+      </w:r>
+      <w:r>
+        <w:rPr>
+          <w:b/>
+          <w:bCs/>
+        </w:rPr>
+        <w:t xml:space="preserve">PCV con Ti fijo</w:t>
+      </w:r>
+      <w:r>
+        <w:t xml:space="preserve"> (el ciclado por tiempo es inmune a la fuga).</w:t>
+      </w:r>
+    </w:p>
+    <w:p>
+      <w:pPr>
+        <w:pStyle w:val="ListParagraph"/>
+        <w:numPr>
+          <w:ilvl w:val="0"/>
+          <w:numId w:val="2"/>
+        </w:numPr>
+        <w:spacing w:after="60"/>
+      </w:pPr>
+      <w:r>
+        <w:rPr>
+          <w:b/>
+          <w:bCs/>
+        </w:rPr>
+        <w:t xml:space="preserve">Vt insuficiente / hipoventilación persistente</w:t>
+      </w:r>
+      <w:r>
+        <w:t xml:space="preserve"> pese a IPAP alta, o </w:t>
+      </w:r>
+      <w:r>
+        <w:rPr>
+          <w:b/>
+          <w:bCs/>
+        </w:rPr>
+        <w:t xml:space="preserve">hipoventilación nocturna</w:t>
+      </w:r>
+      <w:r>
+        <w:t xml:space="preserve"> con necesidad de soporte prolongado (SHO, restrictivo, ENM) → valorar </w:t>
+      </w:r>
+      <w:r>
+        <w:rPr>
+          <w:b/>
+          <w:bCs/>
+        </w:rPr>
+        <w:t xml:space="preserve">volumen asegurado</w:t>
+      </w:r>
+      <w:r>
+        <w:t xml:space="preserve"> (AVAPS en V60; volumen asegurado en Vivo 50/60).</w:t>
+      </w:r>
+    </w:p>
+    <w:p>
+      <w:pPr>
+        <w:pStyle w:val="ListParagraph"/>
+        <w:numPr>
+          <w:ilvl w:val="0"/>
+          <w:numId w:val="2"/>
+        </w:numPr>
+        <w:spacing w:after="60"/>
+      </w:pPr>
+      <w:r>
+        <w:rPr>
+          <w:b/>
+          <w:bCs/>
+        </w:rPr>
+        <w:t xml:space="preserve">Pérdida del estímulo respiratorio</w:t>
+      </w:r>
+      <w:r>
+        <w:t xml:space="preserve"> (sedación, encefalopatía) manteniendo la VNI → </w:t>
+      </w:r>
+      <w:r>
+        <w:rPr>
+          <w:b/>
+          <w:bCs/>
+        </w:rPr>
+        <w:t xml:space="preserve">modo T</w:t>
+      </w:r>
+      <w:r>
+        <w:t xml:space="preserve">, y reevaluar la indicación de IOT.</w:t>
+      </w:r>
+    </w:p>
+    <w:p>
+      <w:pPr>
+        <w:pStyle w:val="ListParagraph"/>
+        <w:numPr>
+          <w:ilvl w:val="0"/>
+          <w:numId w:val="2"/>
+        </w:numPr>
+        <w:spacing w:after="60"/>
+      </w:pPr>
+      <w:r>
+        <w:t xml:space="preserve">El cambio de modo </w:t>
+      </w:r>
+      <w:r>
+        <w:rPr>
+          <w:b/>
+          <w:bCs/>
+        </w:rPr>
+        <w:t xml:space="preserve">nunca sustituye a la escalada</w:t>
+      </w:r>
+      <w:r>
+        <w:t xml:space="preserve">: si se cumplen criterios de fracaso (§8.3), la salida es IOT/UCI, no otro modo.</w:t>
+      </w:r>
     </w:p>
     <w:p>
       <w:pPr>
@@ -17832,6 +19408,577 @@
         <w:spacing w:after="200"/>
       </w:pPr>
     </w:p>
+    <w:tbl>
+      <w:tblPr>
+        <w:tblW w:type="dxa" w:w="9638"/>
+        <w:tblBorders>
+          <w:top w:val="single" w:color="auto" w:sz="4"/>
+          <w:left w:val="single" w:color="auto" w:sz="4"/>
+          <w:bottom w:val="single" w:color="auto" w:sz="4"/>
+          <w:right w:val="single" w:color="auto" w:sz="4"/>
+          <w:insideH w:val="single" w:color="auto" w:sz="4"/>
+          <w:insideV w:val="single" w:color="auto" w:sz="4"/>
+        </w:tblBorders>
+      </w:tblPr>
+      <w:tblGrid>
+        <w:gridCol w:w="9638"/>
+      </w:tblGrid>
+      <w:tr>
+        <w:tc>
+          <w:tcPr>
+            <w:tcW w:type="dxa" w:w="9638"/>
+            <w:tcBorders>
+              <w:top w:val="single" w:color="2A7F8E" w:sz="6"/>
+              <w:left w:val="single" w:color="2A7F8E" w:sz="6"/>
+              <w:bottom w:val="single" w:color="2A7F8E" w:sz="6"/>
+              <w:right w:val="single" w:color="2A7F8E" w:sz="6"/>
+            </w:tcBorders>
+            <w:shd w:fill="0F4C5C" w:val="clear"/>
+            <w:tcMar>
+              <w:top w:type="dxa" w:w="80"/>
+              <w:left w:type="dxa" w:w="140"/>
+              <w:bottom w:type="dxa" w:w="80"/>
+              <w:right w:type="dxa" w:w="140"/>
+            </w:tcMar>
+          </w:tcPr>
+          <w:p>
+            <w:r>
+              <w:rPr>
+                <w:b/>
+                <w:bCs/>
+                <w:color w:val="FFFFFF"/>
+                <w:sz w:val="21"/>
+                <w:szCs w:val="21"/>
+              </w:rPr>
+              <w:t xml:space="preserve">D-17 · </w:t>
+            </w:r>
+            <w:r>
+              <w:rPr>
+                <w:b/>
+                <w:bCs/>
+                <w:color w:val="FFFFFF"/>
+                <w:sz w:val="21"/>
+                <w:szCs w:val="21"/>
+              </w:rPr>
+              <w:t xml:space="preserve">Modo recomendado por escenario</w:t>
+            </w:r>
+          </w:p>
+        </w:tc>
+      </w:tr>
+      <w:tr>
+        <w:tc>
+          <w:tcPr>
+            <w:tcW w:type="dxa" w:w="9638"/>
+            <w:tcBorders>
+              <w:top w:val="single" w:color="2A7F8E" w:sz="6"/>
+              <w:left w:val="single" w:color="2A7F8E" w:sz="6"/>
+              <w:bottom w:val="single" w:color="2A7F8E" w:sz="6"/>
+              <w:right w:val="single" w:color="2A7F8E" w:sz="6"/>
+            </w:tcBorders>
+            <w:tcMar>
+              <w:top w:type="dxa" w:w="100"/>
+              <w:left w:type="dxa" w:w="140"/>
+              <w:bottom w:type="dxa" w:w="100"/>
+              <w:right w:type="dxa" w:w="140"/>
+            </w:tcMar>
+          </w:tcPr>
+          <w:p>
+            <w:pPr>
+              <w:spacing w:after="120"/>
+            </w:pPr>
+            <w:r>
+              <w:rPr>
+                <w:b/>
+                <w:bCs/>
+                <w:color w:val="16697A"/>
+                <w:sz w:val="19"/>
+                <w:szCs w:val="19"/>
+              </w:rPr>
+              <w:t xml:space="preserve">Propuesta: </w:t>
+            </w:r>
+            <w:r>
+              <w:rPr>
+                <w:sz w:val="19"/>
+                <w:szCs w:val="19"/>
+              </w:rPr>
+              <w:t xml:space="preserve">Tabla §5.3 (EAP → CPAP con binivel equivalente; hipercápnico → S/T; restrictivo/ENM → S/T o PCV con Ti largo ± volumen asegurado; sin estímulo → T; hipoxémico → TAFCN), limitada al parque real y mostrada en la evaluación de la app. ¿Se valida la tabla y la disponibilidad por equipo?</w:t>
+            </w:r>
+          </w:p>
+          <w:p>
+            <w:pPr>
+              <w:spacing w:after="60" w:before="60"/>
+            </w:pPr>
+            <w:r>
+              <w:rPr>
+                <w:rFonts w:ascii="Arial Unicode MS" w:cs="Arial Unicode MS" w:eastAsia="Arial Unicode MS" w:hAnsi="Arial Unicode MS"/>
+                <w:color w:val="0F4C5C"/>
+                <w:sz w:val="26"/>
+                <w:szCs w:val="26"/>
+              </w:rPr>
+              <w:t xml:space="preserve">☐</w:t>
+            </w:r>
+            <w:r>
+              <w:rPr>
+                <w:b/>
+                <w:bCs/>
+                <w:sz w:val="20"/>
+                <w:szCs w:val="20"/>
+              </w:rPr>
+              <w:t xml:space="preserve">  Aceptamos la propuesta</w:t>
+            </w:r>
+            <w:r>
+              <w:t xml:space="preserve">        </w:t>
+            </w:r>
+            <w:r>
+              <w:rPr>
+                <w:rFonts w:ascii="Arial Unicode MS" w:cs="Arial Unicode MS" w:eastAsia="Arial Unicode MS" w:hAnsi="Arial Unicode MS"/>
+                <w:color w:val="0F4C5C"/>
+                <w:sz w:val="26"/>
+                <w:szCs w:val="26"/>
+              </w:rPr>
+              <w:t xml:space="preserve">☐</w:t>
+            </w:r>
+            <w:r>
+              <w:rPr>
+                <w:b/>
+                <w:bCs/>
+                <w:sz w:val="20"/>
+                <w:szCs w:val="20"/>
+              </w:rPr>
+              <w:t xml:space="preserve">  La rechazamos</w:t>
+            </w:r>
+          </w:p>
+          <w:p>
+            <w:pPr>
+              <w:spacing w:after="0" w:before="100"/>
+            </w:pPr>
+            <w:r>
+              <w:rPr>
+                <w:b/>
+                <w:bCs/>
+                <w:color w:val="16697A"/>
+                <w:sz w:val="19"/>
+                <w:szCs w:val="19"/>
+              </w:rPr>
+              <w:t xml:space="preserve">Nuestra decisión:</w:t>
+            </w:r>
+          </w:p>
+          <w:p>
+            <w:pPr>
+              <w:pBdr>
+                <w:bottom w:val="dotted" w:color="7A9AA2" w:sz="6"/>
+              </w:pBdr>
+              <w:spacing w:after="0" w:before="260"/>
+            </w:pPr>
+            <w:r>
+              <w:t xml:space="preserve"> </w:t>
+            </w:r>
+          </w:p>
+          <w:p>
+            <w:pPr>
+              <w:pBdr>
+                <w:bottom w:val="dotted" w:color="7A9AA2" w:sz="6"/>
+              </w:pBdr>
+              <w:spacing w:after="0" w:before="260"/>
+            </w:pPr>
+            <w:r>
+              <w:t xml:space="preserve"> </w:t>
+            </w:r>
+          </w:p>
+        </w:tc>
+      </w:tr>
+    </w:tbl>
+    <w:p>
+      <w:pPr>
+        <w:spacing w:after="200"/>
+      </w:pPr>
+    </w:p>
+    <w:tbl>
+      <w:tblPr>
+        <w:tblW w:type="dxa" w:w="9638"/>
+        <w:tblBorders>
+          <w:top w:val="single" w:color="auto" w:sz="4"/>
+          <w:left w:val="single" w:color="auto" w:sz="4"/>
+          <w:bottom w:val="single" w:color="auto" w:sz="4"/>
+          <w:right w:val="single" w:color="auto" w:sz="4"/>
+          <w:insideH w:val="single" w:color="auto" w:sz="4"/>
+          <w:insideV w:val="single" w:color="auto" w:sz="4"/>
+        </w:tblBorders>
+      </w:tblPr>
+      <w:tblGrid>
+        <w:gridCol w:w="9638"/>
+      </w:tblGrid>
+      <w:tr>
+        <w:tc>
+          <w:tcPr>
+            <w:tcW w:type="dxa" w:w="9638"/>
+            <w:tcBorders>
+              <w:top w:val="single" w:color="2A7F8E" w:sz="6"/>
+              <w:left w:val="single" w:color="2A7F8E" w:sz="6"/>
+              <w:bottom w:val="single" w:color="2A7F8E" w:sz="6"/>
+              <w:right w:val="single" w:color="2A7F8E" w:sz="6"/>
+            </w:tcBorders>
+            <w:shd w:fill="0F4C5C" w:val="clear"/>
+            <w:tcMar>
+              <w:top w:type="dxa" w:w="80"/>
+              <w:left w:type="dxa" w:w="140"/>
+              <w:bottom w:type="dxa" w:w="80"/>
+              <w:right w:type="dxa" w:w="140"/>
+            </w:tcMar>
+          </w:tcPr>
+          <w:p>
+            <w:r>
+              <w:rPr>
+                <w:b/>
+                <w:bCs/>
+                <w:color w:val="FFFFFF"/>
+                <w:sz w:val="21"/>
+                <w:szCs w:val="21"/>
+              </w:rPr>
+              <w:t xml:space="preserve">D-18 · </w:t>
+            </w:r>
+            <w:r>
+              <w:rPr>
+                <w:b/>
+                <w:bCs/>
+                <w:color w:val="FFFFFF"/>
+                <w:sz w:val="21"/>
+                <w:szCs w:val="21"/>
+              </w:rPr>
+              <w:t xml:space="preserve">Cambio de modo según evolución</w:t>
+            </w:r>
+          </w:p>
+        </w:tc>
+      </w:tr>
+      <w:tr>
+        <w:tc>
+          <w:tcPr>
+            <w:tcW w:type="dxa" w:w="9638"/>
+            <w:tcBorders>
+              <w:top w:val="single" w:color="2A7F8E" w:sz="6"/>
+              <w:left w:val="single" w:color="2A7F8E" w:sz="6"/>
+              <w:bottom w:val="single" w:color="2A7F8E" w:sz="6"/>
+              <w:right w:val="single" w:color="2A7F8E" w:sz="6"/>
+            </w:tcBorders>
+            <w:tcMar>
+              <w:top w:type="dxa" w:w="100"/>
+              <w:left w:type="dxa" w:w="140"/>
+              <w:bottom w:type="dxa" w:w="100"/>
+              <w:right w:type="dxa" w:w="140"/>
+            </w:tcMar>
+          </w:tcPr>
+          <w:p>
+            <w:pPr>
+              <w:spacing w:after="120"/>
+            </w:pPr>
+            <w:r>
+              <w:rPr>
+                <w:b/>
+                <w:bCs/>
+                <w:color w:val="16697A"/>
+                <w:sz w:val="19"/>
+                <w:szCs w:val="19"/>
+              </w:rPr>
+              <w:t xml:space="preserve">Propuesta: </w:t>
+            </w:r>
+            <w:r>
+              <w:rPr>
+                <w:sz w:val="19"/>
+                <w:szCs w:val="19"/>
+              </w:rPr>
+              <w:t xml:space="preserve">Reglas §5.4 integradas en el seguimiento: asincronía refractaria → PCV con Ti fijo · hipoventilación/Vt insuficiente o soporte prolongado-nocturno → volumen asegurado · sin estímulo → T. El cambio de modo nunca sustituye a la escalada (criterios §8.3)</w:t>
+            </w:r>
+          </w:p>
+          <w:p>
+            <w:pPr>
+              <w:spacing w:after="60" w:before="60"/>
+            </w:pPr>
+            <w:r>
+              <w:rPr>
+                <w:rFonts w:ascii="Arial Unicode MS" w:cs="Arial Unicode MS" w:eastAsia="Arial Unicode MS" w:hAnsi="Arial Unicode MS"/>
+                <w:color w:val="0F4C5C"/>
+                <w:sz w:val="26"/>
+                <w:szCs w:val="26"/>
+              </w:rPr>
+              <w:t xml:space="preserve">☐</w:t>
+            </w:r>
+            <w:r>
+              <w:rPr>
+                <w:b/>
+                <w:bCs/>
+                <w:sz w:val="20"/>
+                <w:szCs w:val="20"/>
+              </w:rPr>
+              <w:t xml:space="preserve">  Aceptamos la propuesta</w:t>
+            </w:r>
+            <w:r>
+              <w:t xml:space="preserve">        </w:t>
+            </w:r>
+            <w:r>
+              <w:rPr>
+                <w:rFonts w:ascii="Arial Unicode MS" w:cs="Arial Unicode MS" w:eastAsia="Arial Unicode MS" w:hAnsi="Arial Unicode MS"/>
+                <w:color w:val="0F4C5C"/>
+                <w:sz w:val="26"/>
+                <w:szCs w:val="26"/>
+              </w:rPr>
+              <w:t xml:space="preserve">☐</w:t>
+            </w:r>
+            <w:r>
+              <w:rPr>
+                <w:b/>
+                <w:bCs/>
+                <w:sz w:val="20"/>
+                <w:szCs w:val="20"/>
+              </w:rPr>
+              <w:t xml:space="preserve">  La rechazamos</w:t>
+            </w:r>
+          </w:p>
+          <w:p>
+            <w:pPr>
+              <w:spacing w:after="0" w:before="100"/>
+            </w:pPr>
+            <w:r>
+              <w:rPr>
+                <w:b/>
+                <w:bCs/>
+                <w:color w:val="16697A"/>
+                <w:sz w:val="19"/>
+                <w:szCs w:val="19"/>
+              </w:rPr>
+              <w:t xml:space="preserve">Nuestra decisión:</w:t>
+            </w:r>
+          </w:p>
+          <w:p>
+            <w:pPr>
+              <w:pBdr>
+                <w:bottom w:val="dotted" w:color="7A9AA2" w:sz="6"/>
+              </w:pBdr>
+              <w:spacing w:after="0" w:before="260"/>
+            </w:pPr>
+            <w:r>
+              <w:t xml:space="preserve"> </w:t>
+            </w:r>
+          </w:p>
+          <w:p>
+            <w:pPr>
+              <w:pBdr>
+                <w:bottom w:val="dotted" w:color="7A9AA2" w:sz="6"/>
+              </w:pBdr>
+              <w:spacing w:after="0" w:before="260"/>
+            </w:pPr>
+            <w:r>
+              <w:t xml:space="preserve"> </w:t>
+            </w:r>
+          </w:p>
+        </w:tc>
+      </w:tr>
+    </w:tbl>
+    <w:p>
+      <w:pPr>
+        <w:spacing w:after="200"/>
+      </w:pPr>
+    </w:p>
+    <w:tbl>
+      <w:tblPr>
+        <w:tblW w:type="dxa" w:w="9638"/>
+        <w:tblBorders>
+          <w:top w:val="single" w:color="auto" w:sz="4"/>
+          <w:left w:val="single" w:color="auto" w:sz="4"/>
+          <w:bottom w:val="single" w:color="auto" w:sz="4"/>
+          <w:right w:val="single" w:color="auto" w:sz="4"/>
+          <w:insideH w:val="single" w:color="auto" w:sz="4"/>
+          <w:insideV w:val="single" w:color="auto" w:sz="4"/>
+        </w:tblBorders>
+      </w:tblPr>
+      <w:tblGrid>
+        <w:gridCol w:w="9638"/>
+      </w:tblGrid>
+      <w:tr>
+        <w:tc>
+          <w:tcPr>
+            <w:tcW w:type="dxa" w:w="9638"/>
+            <w:tcBorders>
+              <w:top w:val="single" w:color="2A7F8E" w:sz="6"/>
+              <w:left w:val="single" w:color="2A7F8E" w:sz="6"/>
+              <w:bottom w:val="single" w:color="2A7F8E" w:sz="6"/>
+              <w:right w:val="single" w:color="2A7F8E" w:sz="6"/>
+            </w:tcBorders>
+            <w:shd w:fill="0F4C5C" w:val="clear"/>
+            <w:tcMar>
+              <w:top w:type="dxa" w:w="80"/>
+              <w:left w:type="dxa" w:w="140"/>
+              <w:bottom w:type="dxa" w:w="80"/>
+              <w:right w:type="dxa" w:w="140"/>
+            </w:tcMar>
+          </w:tcPr>
+          <w:p>
+            <w:r>
+              <w:rPr>
+                <w:b/>
+                <w:bCs/>
+                <w:color w:val="FFFFFF"/>
+                <w:sz w:val="21"/>
+                <w:szCs w:val="21"/>
+              </w:rPr>
+              <w:t xml:space="preserve">D-19 · </w:t>
+            </w:r>
+            <w:r>
+              <w:rPr>
+                <w:b/>
+                <w:bCs/>
+                <w:color w:val="FFFFFF"/>
+                <w:sz w:val="21"/>
+                <w:szCs w:val="21"/>
+              </w:rPr>
+              <w:t xml:space="preserve">Modos avanzados y aviso ASV</w:t>
+            </w:r>
+          </w:p>
+        </w:tc>
+      </w:tr>
+      <w:tr>
+        <w:tc>
+          <w:tcPr>
+            <w:tcW w:type="dxa" w:w="9638"/>
+            <w:tcBorders>
+              <w:top w:val="single" w:color="2A7F8E" w:sz="6"/>
+              <w:left w:val="single" w:color="2A7F8E" w:sz="6"/>
+              <w:bottom w:val="single" w:color="2A7F8E" w:sz="6"/>
+              <w:right w:val="single" w:color="2A7F8E" w:sz="6"/>
+            </w:tcBorders>
+            <w:tcMar>
+              <w:top w:type="dxa" w:w="100"/>
+              <w:left w:type="dxa" w:w="140"/>
+              <w:bottom w:type="dxa" w:w="100"/>
+              <w:right w:type="dxa" w:w="140"/>
+            </w:tcMar>
+          </w:tcPr>
+          <w:p>
+            <w:pPr>
+              <w:spacing w:after="120"/>
+            </w:pPr>
+            <w:r>
+              <w:rPr>
+                <w:b/>
+                <w:bCs/>
+                <w:color w:val="16697A"/>
+                <w:sz w:val="19"/>
+                <w:szCs w:val="19"/>
+              </w:rPr>
+              <w:t xml:space="preserve">Propuesta: </w:t>
+            </w:r>
+            <w:r>
+              <w:rPr>
+                <w:sz w:val="19"/>
+                <w:szCs w:val="19"/>
+              </w:rPr>
+              <w:t xml:space="preserve">Posición propuesta (§5.2): AVAPS/iVAPS no como rescate agudo (ajuste gradual ~1 cmH2O/min; Murphy 2012 sin ventaja sobre PS titulada) · PAV/NAVA solo docente (sin equipos en el área; mejoran sincronía sin beneficio en resultados duros) · PRVC residual · </w:t>
+            </w:r>
+            <w:r>
+              <w:rPr>
+                <w:b/>
+                <w:bCs/>
+                <w:sz w:val="19"/>
+                <w:szCs w:val="19"/>
+              </w:rPr>
+              <w:t xml:space="preserve">aviso SERVE-HF obligatorio</w:t>
+            </w:r>
+            <w:r>
+              <w:rPr>
+                <w:sz w:val="19"/>
+                <w:szCs w:val="19"/>
+              </w:rPr>
+              <w:t xml:space="preserve"> (ASV contraindicada en IC con FEVI ≤45% y apnea central). ¿Se valida?</w:t>
+            </w:r>
+          </w:p>
+          <w:p>
+            <w:pPr>
+              <w:spacing w:after="60" w:before="60"/>
+            </w:pPr>
+            <w:r>
+              <w:rPr>
+                <w:rFonts w:ascii="Arial Unicode MS" w:cs="Arial Unicode MS" w:eastAsia="Arial Unicode MS" w:hAnsi="Arial Unicode MS"/>
+                <w:color w:val="0F4C5C"/>
+                <w:sz w:val="26"/>
+                <w:szCs w:val="26"/>
+              </w:rPr>
+              <w:t xml:space="preserve">☐</w:t>
+            </w:r>
+            <w:r>
+              <w:rPr>
+                <w:b/>
+                <w:bCs/>
+                <w:sz w:val="20"/>
+                <w:szCs w:val="20"/>
+              </w:rPr>
+              <w:t xml:space="preserve">  Aceptamos la propuesta</w:t>
+            </w:r>
+            <w:r>
+              <w:t xml:space="preserve">        </w:t>
+            </w:r>
+            <w:r>
+              <w:rPr>
+                <w:rFonts w:ascii="Arial Unicode MS" w:cs="Arial Unicode MS" w:eastAsia="Arial Unicode MS" w:hAnsi="Arial Unicode MS"/>
+                <w:color w:val="0F4C5C"/>
+                <w:sz w:val="26"/>
+                <w:szCs w:val="26"/>
+              </w:rPr>
+              <w:t xml:space="preserve">☐</w:t>
+            </w:r>
+            <w:r>
+              <w:rPr>
+                <w:b/>
+                <w:bCs/>
+                <w:sz w:val="20"/>
+                <w:szCs w:val="20"/>
+              </w:rPr>
+              <w:t xml:space="preserve">  La rechazamos</w:t>
+            </w:r>
+          </w:p>
+          <w:p>
+            <w:pPr>
+              <w:spacing w:after="0" w:before="100"/>
+            </w:pPr>
+            <w:r>
+              <w:rPr>
+                <w:b/>
+                <w:bCs/>
+                <w:color w:val="16697A"/>
+                <w:sz w:val="19"/>
+                <w:szCs w:val="19"/>
+              </w:rPr>
+              <w:t xml:space="preserve">Nuestra decisión:</w:t>
+            </w:r>
+          </w:p>
+          <w:p>
+            <w:pPr>
+              <w:pBdr>
+                <w:bottom w:val="dotted" w:color="7A9AA2" w:sz="6"/>
+              </w:pBdr>
+              <w:spacing w:after="0" w:before="260"/>
+            </w:pPr>
+            <w:r>
+              <w:t xml:space="preserve"> </w:t>
+            </w:r>
+          </w:p>
+          <w:p>
+            <w:pPr>
+              <w:pBdr>
+                <w:bottom w:val="dotted" w:color="7A9AA2" w:sz="6"/>
+              </w:pBdr>
+              <w:spacing w:after="0" w:before="260"/>
+            </w:pPr>
+            <w:r>
+              <w:t xml:space="preserve"> </w:t>
+            </w:r>
+          </w:p>
+        </w:tc>
+      </w:tr>
+    </w:tbl>
+    <w:p>
+      <w:pPr>
+        <w:spacing w:after="200"/>
+      </w:pPr>
+    </w:p>
     <w:p>
       <w:pPr>
         <w:spacing w:after="120"/>
@@ -18218,6 +20365,58 @@
       </w:pPr>
       <w:r>
         <w:t xml:space="preserve">Quanjer PH et al. Lung volumes and forced ventilatory flows. Official Statement of the European Respiratory Society. Eur Respir J 1993;6(Supl 16):5-40.</w:t>
+      </w:r>
+    </w:p>
+    <w:p>
+      <w:pPr>
+        <w:pStyle w:val="ListParagraph"/>
+        <w:numPr>
+          <w:ilvl w:val="0"/>
+          <w:numId w:val="2"/>
+        </w:numPr>
+        <w:spacing w:after="60"/>
+      </w:pPr>
+      <w:r>
+        <w:t xml:space="preserve">Murphy PB et al. Volume targeted versus pressure support non-invasive ventilation in patients with super obesity and chronic respiratory failure: a randomised controlled trial. Thorax 2012;67:727-734.</w:t>
+      </w:r>
+    </w:p>
+    <w:p>
+      <w:pPr>
+        <w:pStyle w:val="ListParagraph"/>
+        <w:numPr>
+          <w:ilvl w:val="0"/>
+          <w:numId w:val="2"/>
+        </w:numPr>
+        <w:spacing w:after="60"/>
+      </w:pPr>
+      <w:r>
+        <w:t xml:space="preserve">Cowie MR et al. Adaptive servo-ventilation for central sleep apnea in systolic heart failure (SERVE-HF). N Engl J Med 2015;373:1095-1105.</w:t>
+      </w:r>
+    </w:p>
+    <w:p>
+      <w:pPr>
+        <w:pStyle w:val="ListParagraph"/>
+        <w:numPr>
+          <w:ilvl w:val="0"/>
+          <w:numId w:val="2"/>
+        </w:numPr>
+        <w:spacing w:after="60"/>
+      </w:pPr>
+      <w:r>
+        <w:t xml:space="preserve">Piquilloud L et al. Neurally adjusted ventilatory assist improves patient–ventilator interaction during non-invasive ventilation delivered by face mask. Intensive Care Med 2012;38:1624-1631.</w:t>
+      </w:r>
+    </w:p>
+    <w:p>
+      <w:pPr>
+        <w:pStyle w:val="ListParagraph"/>
+        <w:numPr>
+          <w:ilvl w:val="0"/>
+          <w:numId w:val="2"/>
+        </w:numPr>
+        <w:spacing w:after="60"/>
+      </w:pPr>
+      <w:r>
+        <w:t xml:space="preserve">Gay PC, Hess DR, Hill NS. Noninvasive proportional assist ventilation for acute respiratory insufficiency: comparison with pressure support ventilation. Am J Respir Crit Care Med 2001;164:1606-1611.</w:t>
       </w:r>
     </w:p>
     <w:p>
@@ -18625,7 +20824,7 @@
                 <w:sz w:val="18"/>
                 <w:szCs w:val="18"/>
               </w:rPr>
-              <w:t xml:space="preserve">ATS</w:t>
+              <w:t xml:space="preserve">ASV</w:t>
             </w:r>
           </w:p>
         </w:tc>
@@ -18655,7 +20854,7 @@
                 <w:sz w:val="18"/>
                 <w:szCs w:val="18"/>
               </w:rPr>
-              <w:t xml:space="preserve">American Thoracic Society</w:t>
+              <w:t xml:space="preserve">Ventilación servoadaptativa (adaptive servo-ventilation)</w:t>
             </w:r>
           </w:p>
         </w:tc>
@@ -18688,7 +20887,7 @@
                 <w:sz w:val="18"/>
                 <w:szCs w:val="18"/>
               </w:rPr>
-              <w:t xml:space="preserve">AVAPS</w:t>
+              <w:t xml:space="preserve">ATS</w:t>
             </w:r>
           </w:p>
         </w:tc>
@@ -18719,7 +20918,7 @@
                 <w:sz w:val="18"/>
                 <w:szCs w:val="18"/>
               </w:rPr>
-              <w:t xml:space="preserve">Average Volume-Assured Pressure Support (presión de soporte con volumen medio asegurado)</w:t>
+              <w:t xml:space="preserve">American Thoracic Society</w:t>
             </w:r>
           </w:p>
         </w:tc>
@@ -18751,7 +20950,7 @@
                 <w:sz w:val="18"/>
                 <w:szCs w:val="18"/>
               </w:rPr>
-              <w:t xml:space="preserve">BiPAP / binivel</w:t>
+              <w:t xml:space="preserve">AVAPS</w:t>
             </w:r>
           </w:p>
         </w:tc>
@@ -18781,7 +20980,7 @@
                 <w:sz w:val="18"/>
                 <w:szCs w:val="18"/>
               </w:rPr>
-              <w:t xml:space="preserve">Ventilación con doble nivel de presión (IPAP + EPAP)</w:t>
+              <w:t xml:space="preserve">Average Volume-Assured Pressure Support (presión de soporte con volumen medio asegurado)</w:t>
             </w:r>
           </w:p>
         </w:tc>
@@ -18814,7 +21013,7 @@
                 <w:sz w:val="18"/>
                 <w:szCs w:val="18"/>
               </w:rPr>
-              <w:t xml:space="preserve">BTS</w:t>
+              <w:t xml:space="preserve">BiPAP / binivel</w:t>
             </w:r>
           </w:p>
         </w:tc>
@@ -18845,7 +21044,7 @@
                 <w:sz w:val="18"/>
                 <w:szCs w:val="18"/>
               </w:rPr>
-              <w:t xml:space="preserve">British Thoracic Society</w:t>
+              <w:t xml:space="preserve">Ventilación con doble nivel de presión (IPAP + EPAP)</w:t>
             </w:r>
           </w:p>
         </w:tc>
@@ -18877,7 +21076,7 @@
                 <w:sz w:val="18"/>
                 <w:szCs w:val="18"/>
               </w:rPr>
-              <w:t xml:space="preserve">CPAP</w:t>
+              <w:t xml:space="preserve">BTS</w:t>
             </w:r>
           </w:p>
         </w:tc>
@@ -18907,7 +21106,7 @@
                 <w:sz w:val="18"/>
                 <w:szCs w:val="18"/>
               </w:rPr>
-              <w:t xml:space="preserve">Presión positiva continua en la vía aérea</w:t>
+              <w:t xml:space="preserve">British Thoracic Society</w:t>
             </w:r>
           </w:p>
         </w:tc>
@@ -18940,7 +21139,7 @@
                 <w:sz w:val="18"/>
                 <w:szCs w:val="18"/>
               </w:rPr>
-              <w:t xml:space="preserve">DM</w:t>
+              <w:t xml:space="preserve">CPAP</w:t>
             </w:r>
           </w:p>
         </w:tc>
@@ -18971,7 +21170,7 @@
                 <w:sz w:val="18"/>
                 <w:szCs w:val="18"/>
               </w:rPr>
-              <w:t xml:space="preserve">Diferencia de medias (metaanálisis)</w:t>
+              <w:t xml:space="preserve">Presión positiva continua en la vía aérea</w:t>
             </w:r>
           </w:p>
         </w:tc>
@@ -19003,7 +21202,7 @@
                 <w:sz w:val="18"/>
                 <w:szCs w:val="18"/>
               </w:rPr>
-              <w:t xml:space="preserve">EAP</w:t>
+              <w:t xml:space="preserve">DM</w:t>
             </w:r>
           </w:p>
         </w:tc>
@@ -19033,7 +21232,7 @@
                 <w:sz w:val="18"/>
                 <w:szCs w:val="18"/>
               </w:rPr>
-              <w:t xml:space="preserve">Edema agudo de pulmón</w:t>
+              <w:t xml:space="preserve">Diferencia de medias (metaanálisis)</w:t>
             </w:r>
           </w:p>
         </w:tc>
@@ -19066,7 +21265,7 @@
                 <w:sz w:val="18"/>
                 <w:szCs w:val="18"/>
               </w:rPr>
-              <w:t xml:space="preserve">ECA</w:t>
+              <w:t xml:space="preserve">EAP</w:t>
             </w:r>
           </w:p>
         </w:tc>
@@ -19097,7 +21296,7 @@
                 <w:sz w:val="18"/>
                 <w:szCs w:val="18"/>
               </w:rPr>
-              <w:t xml:space="preserve">Ensayo clínico aleatorizado</w:t>
+              <w:t xml:space="preserve">Edema agudo de pulmón</w:t>
             </w:r>
           </w:p>
         </w:tc>
@@ -19129,7 +21328,7 @@
                 <w:sz w:val="18"/>
                 <w:szCs w:val="18"/>
               </w:rPr>
-              <w:t xml:space="preserve">ECCO2R</w:t>
+              <w:t xml:space="preserve">ECA</w:t>
             </w:r>
           </w:p>
         </w:tc>
@@ -19159,7 +21358,7 @@
                 <w:sz w:val="18"/>
                 <w:szCs w:val="18"/>
               </w:rPr>
-              <w:t xml:space="preserve">Eliminación extracorpórea de CO2</w:t>
+              <w:t xml:space="preserve">Ensayo clínico aleatorizado</w:t>
             </w:r>
           </w:p>
         </w:tc>
@@ -19192,7 +21391,7 @@
                 <w:sz w:val="18"/>
                 <w:szCs w:val="18"/>
               </w:rPr>
-              <w:t xml:space="preserve">ENM</w:t>
+              <w:t xml:space="preserve">ECCO2R</w:t>
             </w:r>
           </w:p>
         </w:tc>
@@ -19223,7 +21422,7 @@
                 <w:sz w:val="18"/>
                 <w:szCs w:val="18"/>
               </w:rPr>
-              <w:t xml:space="preserve">Enfermedad neuromuscular</w:t>
+              <w:t xml:space="preserve">Eliminación extracorpórea de CO2</w:t>
             </w:r>
           </w:p>
         </w:tc>
@@ -19255,7 +21454,7 @@
                 <w:sz w:val="18"/>
                 <w:szCs w:val="18"/>
               </w:rPr>
-              <w:t xml:space="preserve">EPAP</w:t>
+              <w:t xml:space="preserve">ENM</w:t>
             </w:r>
           </w:p>
         </w:tc>
@@ -19285,7 +21484,7 @@
                 <w:sz w:val="18"/>
                 <w:szCs w:val="18"/>
               </w:rPr>
-              <w:t xml:space="preserve">Presión positiva espiratoria en la vía aérea</w:t>
+              <w:t xml:space="preserve">Enfermedad neuromuscular</w:t>
             </w:r>
           </w:p>
         </w:tc>
@@ -19318,7 +21517,7 @@
                 <w:sz w:val="18"/>
                 <w:szCs w:val="18"/>
               </w:rPr>
-              <w:t xml:space="preserve">EPOC</w:t>
+              <w:t xml:space="preserve">EPAP</w:t>
             </w:r>
           </w:p>
         </w:tc>
@@ -19349,7 +21548,7 @@
                 <w:sz w:val="18"/>
                 <w:szCs w:val="18"/>
               </w:rPr>
-              <w:t xml:space="preserve">Enfermedad pulmonar obstructiva crónica</w:t>
+              <w:t xml:space="preserve">Presión positiva espiratoria en la vía aérea</w:t>
             </w:r>
           </w:p>
         </w:tc>
@@ -19381,7 +21580,7 @@
                 <w:sz w:val="18"/>
                 <w:szCs w:val="18"/>
               </w:rPr>
-              <w:t xml:space="preserve">ERC</w:t>
+              <w:t xml:space="preserve">EPOC</w:t>
             </w:r>
           </w:p>
         </w:tc>
@@ -19411,7 +21610,7 @@
                 <w:sz w:val="18"/>
                 <w:szCs w:val="18"/>
               </w:rPr>
-              <w:t xml:space="preserve">Enfermedad renal crónica</w:t>
+              <w:t xml:space="preserve">Enfermedad pulmonar obstructiva crónica</w:t>
             </w:r>
           </w:p>
         </w:tc>
@@ -19444,7 +21643,7 @@
                 <w:sz w:val="18"/>
                 <w:szCs w:val="18"/>
               </w:rPr>
-              <w:t xml:space="preserve">ERS</w:t>
+              <w:t xml:space="preserve">ERC</w:t>
             </w:r>
           </w:p>
         </w:tc>
@@ -19475,7 +21674,7 @@
                 <w:sz w:val="18"/>
                 <w:szCs w:val="18"/>
               </w:rPr>
-              <w:t xml:space="preserve">European Respiratory Society</w:t>
+              <w:t xml:space="preserve">Enfermedad renal crónica</w:t>
             </w:r>
           </w:p>
         </w:tc>
@@ -19507,7 +21706,7 @@
                 <w:sz w:val="18"/>
                 <w:szCs w:val="18"/>
               </w:rPr>
-              <w:t xml:space="preserve">ESC</w:t>
+              <w:t xml:space="preserve">ERS</w:t>
             </w:r>
           </w:p>
         </w:tc>
@@ -19537,7 +21736,7 @@
                 <w:sz w:val="18"/>
                 <w:szCs w:val="18"/>
               </w:rPr>
-              <w:t xml:space="preserve">European Society of Cardiology</w:t>
+              <w:t xml:space="preserve">European Respiratory Society</w:t>
             </w:r>
           </w:p>
         </w:tc>
@@ -19570,7 +21769,7 @@
                 <w:sz w:val="18"/>
                 <w:szCs w:val="18"/>
               </w:rPr>
-              <w:t xml:space="preserve">FC</w:t>
+              <w:t xml:space="preserve">ESC</w:t>
             </w:r>
           </w:p>
         </w:tc>
@@ -19601,7 +21800,7 @@
                 <w:sz w:val="18"/>
                 <w:szCs w:val="18"/>
               </w:rPr>
-              <w:t xml:space="preserve">Frecuencia cardiaca</w:t>
+              <w:t xml:space="preserve">European Society of Cardiology</w:t>
             </w:r>
           </w:p>
         </w:tc>
@@ -19633,7 +21832,7 @@
                 <w:sz w:val="18"/>
                 <w:szCs w:val="18"/>
               </w:rPr>
-              <w:t xml:space="preserve">FiO2</w:t>
+              <w:t xml:space="preserve">FC</w:t>
             </w:r>
           </w:p>
         </w:tc>
@@ -19663,7 +21862,7 @@
                 <w:sz w:val="18"/>
                 <w:szCs w:val="18"/>
               </w:rPr>
-              <w:t xml:space="preserve">Fracción inspirada de oxígeno</w:t>
+              <w:t xml:space="preserve">Frecuencia cardiaca</w:t>
             </w:r>
           </w:p>
         </w:tc>
@@ -19696,7 +21895,7 @@
                 <w:sz w:val="18"/>
                 <w:szCs w:val="18"/>
               </w:rPr>
-              <w:t xml:space="preserve">FMO</w:t>
+              <w:t xml:space="preserve">FiO2</w:t>
             </w:r>
           </w:p>
         </w:tc>
@@ -19727,7 +21926,7 @@
                 <w:sz w:val="18"/>
                 <w:szCs w:val="18"/>
               </w:rPr>
-              <w:t xml:space="preserve">Fallo multiorgánico</w:t>
+              <w:t xml:space="preserve">Fracción inspirada de oxígeno</w:t>
             </w:r>
           </w:p>
         </w:tc>
@@ -19759,7 +21958,7 @@
                 <w:sz w:val="18"/>
                 <w:szCs w:val="18"/>
               </w:rPr>
-              <w:t xml:space="preserve">FQ</w:t>
+              <w:t xml:space="preserve">FMO</w:t>
             </w:r>
           </w:p>
         </w:tc>
@@ -19789,7 +21988,7 @@
                 <w:sz w:val="18"/>
                 <w:szCs w:val="18"/>
               </w:rPr>
-              <w:t xml:space="preserve">Fibrosis quística</w:t>
+              <w:t xml:space="preserve">Fallo multiorgánico</w:t>
             </w:r>
           </w:p>
         </w:tc>
@@ -19822,7 +22021,7 @@
                 <w:sz w:val="18"/>
                 <w:szCs w:val="18"/>
               </w:rPr>
-              <w:t xml:space="preserve">FR</w:t>
+              <w:t xml:space="preserve">FQ</w:t>
             </w:r>
           </w:p>
         </w:tc>
@@ -19853,7 +22052,7 @@
                 <w:sz w:val="18"/>
                 <w:szCs w:val="18"/>
               </w:rPr>
-              <w:t xml:space="preserve">Frecuencia respiratoria</w:t>
+              <w:t xml:space="preserve">Fibrosis quística</w:t>
             </w:r>
           </w:p>
         </w:tc>
@@ -19885,7 +22084,7 @@
                 <w:sz w:val="18"/>
                 <w:szCs w:val="18"/>
               </w:rPr>
-              <w:t xml:space="preserve">GA / GV</w:t>
+              <w:t xml:space="preserve">FR</w:t>
             </w:r>
           </w:p>
         </w:tc>
@@ -19915,7 +22114,7 @@
                 <w:sz w:val="18"/>
                 <w:szCs w:val="18"/>
               </w:rPr>
-              <w:t xml:space="preserve">Gasometría arterial / venosa</w:t>
+              <w:t xml:space="preserve">Frecuencia respiratoria</w:t>
             </w:r>
           </w:p>
         </w:tc>
@@ -19948,7 +22147,7 @@
                 <w:sz w:val="18"/>
                 <w:szCs w:val="18"/>
               </w:rPr>
-              <w:t xml:space="preserve">GCS</w:t>
+              <w:t xml:space="preserve">GA / GV</w:t>
             </w:r>
           </w:p>
         </w:tc>
@@ -19979,7 +22178,7 @@
                 <w:sz w:val="18"/>
                 <w:szCs w:val="18"/>
               </w:rPr>
-              <w:t xml:space="preserve">Escala de coma de Glasgow</w:t>
+              <w:t xml:space="preserve">Gasometría arterial / venosa</w:t>
             </w:r>
           </w:p>
         </w:tc>
@@ -20011,7 +22210,7 @@
                 <w:sz w:val="18"/>
                 <w:szCs w:val="18"/>
               </w:rPr>
-              <w:t xml:space="preserve">GN</w:t>
+              <w:t xml:space="preserve">GCS</w:t>
             </w:r>
           </w:p>
         </w:tc>
@@ -20041,7 +22240,7 @@
                 <w:sz w:val="18"/>
                 <w:szCs w:val="18"/>
               </w:rPr>
-              <w:t xml:space="preserve">Gafas nasales</w:t>
+              <w:t xml:space="preserve">Escala de coma de Glasgow</w:t>
             </w:r>
           </w:p>
         </w:tc>
@@ -20074,7 +22273,7 @@
                 <w:sz w:val="18"/>
                 <w:szCs w:val="18"/>
               </w:rPr>
-              <w:t xml:space="preserve">GOLD</w:t>
+              <w:t xml:space="preserve">GN</w:t>
             </w:r>
           </w:p>
         </w:tc>
@@ -20105,7 +22304,7 @@
                 <w:sz w:val="18"/>
                 <w:szCs w:val="18"/>
               </w:rPr>
-              <w:t xml:space="preserve">Global Initiative for Chronic Obstructive Lung Disease</w:t>
+              <w:t xml:space="preserve">Gafas nasales</w:t>
             </w:r>
           </w:p>
         </w:tc>
@@ -20137,7 +22336,7 @@
                 <w:sz w:val="18"/>
                 <w:szCs w:val="18"/>
               </w:rPr>
-              <w:t xml:space="preserve">GRADE</w:t>
+              <w:t xml:space="preserve">GOLD</w:t>
             </w:r>
           </w:p>
         </w:tc>
@@ -20167,7 +22366,7 @@
                 <w:sz w:val="18"/>
                 <w:szCs w:val="18"/>
               </w:rPr>
-              <w:t xml:space="preserve">Sistema de gradación de la certeza de la evidencia</w:t>
+              <w:t xml:space="preserve">Global Initiative for Chronic Obstructive Lung Disease</w:t>
             </w:r>
           </w:p>
         </w:tc>
@@ -20200,7 +22399,7 @@
                 <w:sz w:val="18"/>
                 <w:szCs w:val="18"/>
               </w:rPr>
-              <w:t xml:space="preserve">HACOR</w:t>
+              <w:t xml:space="preserve">GRADE</w:t>
             </w:r>
           </w:p>
         </w:tc>
@@ -20231,7 +22430,7 @@
                 <w:sz w:val="18"/>
                 <w:szCs w:val="18"/>
               </w:rPr>
-              <w:t xml:space="preserve">Heart rate, Acidosis, Consciousness, Oxygenation, Respiratory rate (score de fracaso de VNI)</w:t>
+              <w:t xml:space="preserve">Sistema de gradación de la certeza de la evidencia</w:t>
             </w:r>
           </w:p>
         </w:tc>
@@ -20263,7 +22462,7 @@
                 <w:sz w:val="18"/>
                 <w:szCs w:val="18"/>
               </w:rPr>
-              <w:t xml:space="preserve">HCO3</w:t>
+              <w:t xml:space="preserve">HACOR</w:t>
             </w:r>
           </w:p>
         </w:tc>
@@ -20293,7 +22492,7 @@
                 <w:sz w:val="18"/>
                 <w:szCs w:val="18"/>
               </w:rPr>
-              <w:t xml:space="preserve">Bicarbonato</w:t>
+              <w:t xml:space="preserve">Heart rate, Acidosis, Consciousness, Oxygenation, Respiratory rate (score de fracaso de VNI)</w:t>
             </w:r>
           </w:p>
         </w:tc>
@@ -20326,7 +22525,7 @@
                 <w:sz w:val="18"/>
                 <w:szCs w:val="18"/>
               </w:rPr>
-              <w:t xml:space="preserve">HME</w:t>
+              <w:t xml:space="preserve">HCO3</w:t>
             </w:r>
           </w:p>
         </w:tc>
@@ -20357,7 +22556,7 @@
                 <w:sz w:val="18"/>
                 <w:szCs w:val="18"/>
               </w:rPr>
-              <w:t xml:space="preserve">Intercambiador de calor y humedad (humidificación pasiva)</w:t>
+              <w:t xml:space="preserve">Bicarbonato</w:t>
             </w:r>
           </w:p>
         </w:tc>
@@ -20389,7 +22588,7 @@
                 <w:sz w:val="18"/>
                 <w:szCs w:val="18"/>
               </w:rPr>
-              <w:t xml:space="preserve">HTA</w:t>
+              <w:t xml:space="preserve">HME</w:t>
             </w:r>
           </w:p>
         </w:tc>
@@ -20419,7 +22618,7 @@
                 <w:sz w:val="18"/>
                 <w:szCs w:val="18"/>
               </w:rPr>
-              <w:t xml:space="preserve">Hipertensión arterial</w:t>
+              <w:t xml:space="preserve">Intercambiador de calor y humedad (humidificación pasiva)</w:t>
             </w:r>
           </w:p>
         </w:tc>
@@ -20452,7 +22651,7 @@
                 <w:sz w:val="18"/>
                 <w:szCs w:val="18"/>
               </w:rPr>
-              <w:t xml:space="preserve">HUGCR</w:t>
+              <w:t xml:space="preserve">HTA</w:t>
             </w:r>
           </w:p>
         </w:tc>
@@ -20483,7 +22682,7 @@
                 <w:sz w:val="18"/>
                 <w:szCs w:val="18"/>
               </w:rPr>
-              <w:t xml:space="preserve">Hospital Universitario Gran Canaria Dr. Negrín (manual de VMNI)</w:t>
+              <w:t xml:space="preserve">Hipertensión arterial</w:t>
             </w:r>
           </w:p>
         </w:tc>
@@ -20515,7 +22714,7 @@
                 <w:sz w:val="18"/>
                 <w:szCs w:val="18"/>
               </w:rPr>
-              <w:t xml:space="preserve">IAM</w:t>
+              <w:t xml:space="preserve">HUGCR</w:t>
             </w:r>
           </w:p>
         </w:tc>
@@ -20545,7 +22744,7 @@
                 <w:sz w:val="18"/>
                 <w:szCs w:val="18"/>
               </w:rPr>
-              <w:t xml:space="preserve">Infarto agudo de miocardio</w:t>
+              <w:t xml:space="preserve">Hospital Universitario Gran Canaria Dr. Negrín (manual de VMNI)</w:t>
             </w:r>
           </w:p>
         </w:tc>
@@ -20578,7 +22777,7 @@
                 <w:sz w:val="18"/>
                 <w:szCs w:val="18"/>
               </w:rPr>
-              <w:t xml:space="preserve">IC / ICC</w:t>
+              <w:t xml:space="preserve">IAM</w:t>
             </w:r>
           </w:p>
         </w:tc>
@@ -20609,7 +22808,7 @@
                 <w:sz w:val="18"/>
                 <w:szCs w:val="18"/>
               </w:rPr>
-              <w:t xml:space="preserve">Insuficiencia cardiaca (congestiva)</w:t>
+              <w:t xml:space="preserve">Infarto agudo de miocardio</w:t>
             </w:r>
           </w:p>
         </w:tc>
@@ -20641,7 +22840,7 @@
                 <w:sz w:val="18"/>
                 <w:szCs w:val="18"/>
               </w:rPr>
-              <w:t xml:space="preserve">IC95%</w:t>
+              <w:t xml:space="preserve">IC / ICC</w:t>
             </w:r>
           </w:p>
         </w:tc>
@@ -20671,7 +22870,7 @@
                 <w:sz w:val="18"/>
                 <w:szCs w:val="18"/>
               </w:rPr>
-              <w:t xml:space="preserve">Intervalo de confianza al 95%</w:t>
+              <w:t xml:space="preserve">Insuficiencia cardiaca (congestiva)</w:t>
             </w:r>
           </w:p>
         </w:tc>
@@ -20704,7 +22903,7 @@
                 <w:sz w:val="18"/>
                 <w:szCs w:val="18"/>
               </w:rPr>
-              <w:t xml:space="preserve">IMC</w:t>
+              <w:t xml:space="preserve">IC95%</w:t>
             </w:r>
           </w:p>
         </w:tc>
@@ -20735,7 +22934,7 @@
                 <w:sz w:val="18"/>
                 <w:szCs w:val="18"/>
               </w:rPr>
-              <w:t xml:space="preserve">Índice de masa corporal</w:t>
+              <w:t xml:space="preserve">Intervalo de confianza al 95%</w:t>
             </w:r>
           </w:p>
         </w:tc>
@@ -20767,7 +22966,7 @@
                 <w:sz w:val="18"/>
                 <w:szCs w:val="18"/>
               </w:rPr>
-              <w:t xml:space="preserve">IOT</w:t>
+              <w:t xml:space="preserve">IMC</w:t>
             </w:r>
           </w:p>
         </w:tc>
@@ -20797,7 +22996,7 @@
                 <w:sz w:val="18"/>
                 <w:szCs w:val="18"/>
               </w:rPr>
-              <w:t xml:space="preserve">Intubación orotraqueal</w:t>
+              <w:t xml:space="preserve">Índice de masa corporal</w:t>
             </w:r>
           </w:p>
         </w:tc>
@@ -20830,7 +23029,7 @@
                 <w:sz w:val="18"/>
                 <w:szCs w:val="18"/>
               </w:rPr>
-              <w:t xml:space="preserve">IPAP</w:t>
+              <w:t xml:space="preserve">IOT</w:t>
             </w:r>
           </w:p>
         </w:tc>
@@ -20861,7 +23060,7 @@
                 <w:sz w:val="18"/>
                 <w:szCs w:val="18"/>
               </w:rPr>
-              <w:t xml:space="preserve">Presión positiva inspiratoria en la vía aérea</w:t>
+              <w:t xml:space="preserve">Intubación orotraqueal</w:t>
             </w:r>
           </w:p>
         </w:tc>
@@ -20893,7 +23092,7 @@
                 <w:sz w:val="18"/>
                 <w:szCs w:val="18"/>
               </w:rPr>
-              <w:t xml:space="preserve">I:E</w:t>
+              <w:t xml:space="preserve">IPAP</w:t>
             </w:r>
           </w:p>
         </w:tc>
@@ -20923,7 +23122,7 @@
                 <w:sz w:val="18"/>
                 <w:szCs w:val="18"/>
               </w:rPr>
-              <w:t xml:space="preserve">Relación inspiración:espiración</w:t>
+              <w:t xml:space="preserve">Presión positiva inspiratoria en la vía aérea</w:t>
             </w:r>
           </w:p>
         </w:tc>
@@ -20956,7 +23155,7 @@
                 <w:sz w:val="18"/>
                 <w:szCs w:val="18"/>
               </w:rPr>
-              <w:t xml:space="preserve">IRA / IRC</w:t>
+              <w:t xml:space="preserve">I:E</w:t>
             </w:r>
           </w:p>
         </w:tc>
@@ -20987,7 +23186,7 @@
                 <w:sz w:val="18"/>
                 <w:szCs w:val="18"/>
               </w:rPr>
-              <w:t xml:space="preserve">Insuficiencia respiratoria aguda / crónica</w:t>
+              <w:t xml:space="preserve">Relación inspiración:espiración</w:t>
             </w:r>
           </w:p>
         </w:tc>
@@ -21019,7 +23218,7 @@
                 <w:sz w:val="18"/>
                 <w:szCs w:val="18"/>
               </w:rPr>
-              <w:t xml:space="preserve">LET</w:t>
+              <w:t xml:space="preserve">IRA / IRC</w:t>
             </w:r>
           </w:p>
         </w:tc>
@@ -21049,7 +23248,7 @@
                 <w:sz w:val="18"/>
                 <w:szCs w:val="18"/>
               </w:rPr>
-              <w:t xml:space="preserve">Limitación del esfuerzo terapéutico</w:t>
+              <w:t xml:space="preserve">Insuficiencia respiratoria aguda / crónica</w:t>
             </w:r>
           </w:p>
         </w:tc>
@@ -21082,7 +23281,7 @@
                 <w:sz w:val="18"/>
                 <w:szCs w:val="18"/>
               </w:rPr>
-              <w:t xml:space="preserve">NNT / NNTB</w:t>
+              <w:t xml:space="preserve">iVAPS</w:t>
             </w:r>
           </w:p>
         </w:tc>
@@ -21113,7 +23312,7 @@
                 <w:sz w:val="18"/>
                 <w:szCs w:val="18"/>
               </w:rPr>
-              <w:t xml:space="preserve">Número necesario a tratar (para beneficiar)</w:t>
+              <w:t xml:space="preserve">Intelligent Volume-Assured Pressure Support (ventilación alveolar objetivo, ResMed)</w:t>
             </w:r>
           </w:p>
         </w:tc>
@@ -21145,7 +23344,7 @@
                 <w:sz w:val="18"/>
                 <w:szCs w:val="18"/>
               </w:rPr>
-              <w:t xml:space="preserve">OR</w:t>
+              <w:t xml:space="preserve">LET</w:t>
             </w:r>
           </w:p>
         </w:tc>
@@ -21175,7 +23374,7 @@
                 <w:sz w:val="18"/>
                 <w:szCs w:val="18"/>
               </w:rPr>
-              <w:t xml:space="preserve">Odds ratio</w:t>
+              <w:t xml:space="preserve">Limitación del esfuerzo terapéutico</w:t>
             </w:r>
           </w:p>
         </w:tc>
@@ -21208,7 +23407,7 @@
                 <w:sz w:val="18"/>
                 <w:szCs w:val="18"/>
               </w:rPr>
-              <w:t xml:space="preserve">PaCO2 / pCO2</w:t>
+              <w:t xml:space="preserve">NAVA</w:t>
             </w:r>
           </w:p>
         </w:tc>
@@ -21239,7 +23438,7 @@
                 <w:sz w:val="18"/>
                 <w:szCs w:val="18"/>
               </w:rPr>
-              <w:t xml:space="preserve">Presión parcial de CO2 (arterial)</w:t>
+              <w:t xml:space="preserve">Neurally Adjusted Ventilatory Assist (asistencia ajustada a la actividad eléctrica diafragmática, catéter Edi)</w:t>
             </w:r>
           </w:p>
         </w:tc>
@@ -21271,7 +23470,7 @@
                 <w:sz w:val="18"/>
                 <w:szCs w:val="18"/>
               </w:rPr>
-              <w:t xml:space="preserve">PaFi</w:t>
+              <w:t xml:space="preserve">NNT / NNTB</w:t>
             </w:r>
           </w:p>
         </w:tc>
@@ -21301,7 +23500,7 @@
                 <w:sz w:val="18"/>
                 <w:szCs w:val="18"/>
               </w:rPr>
-              <w:t xml:space="preserve">Cociente PaO2/FiO2</w:t>
+              <w:t xml:space="preserve">Número necesario a tratar (para beneficiar)</w:t>
             </w:r>
           </w:p>
         </w:tc>
@@ -21334,7 +23533,7 @@
                 <w:sz w:val="18"/>
                 <w:szCs w:val="18"/>
               </w:rPr>
-              <w:t xml:space="preserve">PaO2 / pO2</w:t>
+              <w:t xml:space="preserve">OR</w:t>
             </w:r>
           </w:p>
         </w:tc>
@@ -21365,7 +23564,7 @@
                 <w:sz w:val="18"/>
                 <w:szCs w:val="18"/>
               </w:rPr>
-              <w:t xml:space="preserve">Presión parcial de O2 (arterial)</w:t>
+              <w:t xml:space="preserve">Odds ratio</w:t>
             </w:r>
           </w:p>
         </w:tc>
@@ -21397,7 +23596,7 @@
                 <w:sz w:val="18"/>
                 <w:szCs w:val="18"/>
               </w:rPr>
-              <w:t xml:space="preserve">PAV</w:t>
+              <w:t xml:space="preserve">PaCO2 / pCO2</w:t>
             </w:r>
           </w:p>
         </w:tc>
@@ -21427,7 +23626,7 @@
                 <w:sz w:val="18"/>
                 <w:szCs w:val="18"/>
               </w:rPr>
-              <w:t xml:space="preserve">Ventilación asistida proporcional</w:t>
+              <w:t xml:space="preserve">Presión parcial de CO2 (arterial)</w:t>
             </w:r>
           </w:p>
         </w:tc>
@@ -21460,7 +23659,7 @@
                 <w:sz w:val="18"/>
                 <w:szCs w:val="18"/>
               </w:rPr>
-              <w:t xml:space="preserve">PC / PCV</w:t>
+              <w:t xml:space="preserve">PaFi</w:t>
             </w:r>
           </w:p>
         </w:tc>
@@ -21491,7 +23690,7 @@
                 <w:sz w:val="18"/>
                 <w:szCs w:val="18"/>
               </w:rPr>
-              <w:t xml:space="preserve">Ventilación controlada por presión</w:t>
+              <w:t xml:space="preserve">Cociente PaO2/FiO2</w:t>
             </w:r>
           </w:p>
         </w:tc>
@@ -21523,6 +23722,195 @@
                 <w:sz w:val="18"/>
                 <w:szCs w:val="18"/>
               </w:rPr>
+              <w:t xml:space="preserve">PaO2 / pO2</w:t>
+            </w:r>
+          </w:p>
+        </w:tc>
+        <w:tc>
+          <w:tcPr>
+            <w:tcW w:type="dxa" w:w="5029"/>
+            <w:tcBorders>
+              <w:top w:val="single" w:color="C9D6DA" w:sz="4"/>
+              <w:left w:val="single" w:color="C9D6DA" w:sz="4"/>
+              <w:bottom w:val="single" w:color="C9D6DA" w:sz="4"/>
+              <w:right w:val="single" w:color="C9D6DA" w:sz="4"/>
+            </w:tcBorders>
+            <w:tcMar>
+              <w:top w:type="dxa" w:w="60"/>
+              <w:left w:type="dxa" w:w="100"/>
+              <w:bottom w:type="dxa" w:w="60"/>
+              <w:right w:type="dxa" w:w="100"/>
+            </w:tcMar>
+          </w:tcPr>
+          <w:p>
+            <w:pPr>
+              <w:spacing w:after="0" w:before="0"/>
+            </w:pPr>
+            <w:r>
+              <w:rPr>
+                <w:color w:val="222222"/>
+                <w:sz w:val="18"/>
+                <w:szCs w:val="18"/>
+              </w:rPr>
+              <w:t xml:space="preserve">Presión parcial de O2 (arterial)</w:t>
+            </w:r>
+          </w:p>
+        </w:tc>
+      </w:tr>
+      <w:tr>
+        <w:tc>
+          <w:tcPr>
+            <w:tcW w:type="dxa" w:w="4609"/>
+            <w:tcBorders>
+              <w:top w:val="single" w:color="C9D6DA" w:sz="4"/>
+              <w:left w:val="single" w:color="C9D6DA" w:sz="4"/>
+              <w:bottom w:val="single" w:color="C9D6DA" w:sz="4"/>
+              <w:right w:val="single" w:color="C9D6DA" w:sz="4"/>
+            </w:tcBorders>
+            <w:shd w:fill="F5FAFB" w:val="clear"/>
+            <w:tcMar>
+              <w:top w:type="dxa" w:w="60"/>
+              <w:left w:type="dxa" w:w="100"/>
+              <w:bottom w:type="dxa" w:w="60"/>
+              <w:right w:type="dxa" w:w="100"/>
+            </w:tcMar>
+          </w:tcPr>
+          <w:p>
+            <w:pPr>
+              <w:spacing w:after="0" w:before="0"/>
+            </w:pPr>
+            <w:r>
+              <w:rPr>
+                <w:color w:val="222222"/>
+                <w:sz w:val="18"/>
+                <w:szCs w:val="18"/>
+              </w:rPr>
+              <w:t xml:space="preserve">PAV</w:t>
+            </w:r>
+          </w:p>
+        </w:tc>
+        <w:tc>
+          <w:tcPr>
+            <w:tcW w:type="dxa" w:w="5029"/>
+            <w:tcBorders>
+              <w:top w:val="single" w:color="C9D6DA" w:sz="4"/>
+              <w:left w:val="single" w:color="C9D6DA" w:sz="4"/>
+              <w:bottom w:val="single" w:color="C9D6DA" w:sz="4"/>
+              <w:right w:val="single" w:color="C9D6DA" w:sz="4"/>
+            </w:tcBorders>
+            <w:shd w:fill="F5FAFB" w:val="clear"/>
+            <w:tcMar>
+              <w:top w:type="dxa" w:w="60"/>
+              <w:left w:type="dxa" w:w="100"/>
+              <w:bottom w:type="dxa" w:w="60"/>
+              <w:right w:type="dxa" w:w="100"/>
+            </w:tcMar>
+          </w:tcPr>
+          <w:p>
+            <w:pPr>
+              <w:spacing w:after="0" w:before="0"/>
+            </w:pPr>
+            <w:r>
+              <w:rPr>
+                <w:color w:val="222222"/>
+                <w:sz w:val="18"/>
+                <w:szCs w:val="18"/>
+              </w:rPr>
+              <w:t xml:space="preserve">Ventilación asistida proporcional</w:t>
+            </w:r>
+          </w:p>
+        </w:tc>
+      </w:tr>
+      <w:tr>
+        <w:tc>
+          <w:tcPr>
+            <w:tcW w:type="dxa" w:w="4609"/>
+            <w:tcBorders>
+              <w:top w:val="single" w:color="C9D6DA" w:sz="4"/>
+              <w:left w:val="single" w:color="C9D6DA" w:sz="4"/>
+              <w:bottom w:val="single" w:color="C9D6DA" w:sz="4"/>
+              <w:right w:val="single" w:color="C9D6DA" w:sz="4"/>
+            </w:tcBorders>
+            <w:tcMar>
+              <w:top w:type="dxa" w:w="60"/>
+              <w:left w:type="dxa" w:w="100"/>
+              <w:bottom w:type="dxa" w:w="60"/>
+              <w:right w:type="dxa" w:w="100"/>
+            </w:tcMar>
+          </w:tcPr>
+          <w:p>
+            <w:pPr>
+              <w:spacing w:after="0" w:before="0"/>
+            </w:pPr>
+            <w:r>
+              <w:rPr>
+                <w:color w:val="222222"/>
+                <w:sz w:val="18"/>
+                <w:szCs w:val="18"/>
+              </w:rPr>
+              <w:t xml:space="preserve">PC / PCV</w:t>
+            </w:r>
+          </w:p>
+        </w:tc>
+        <w:tc>
+          <w:tcPr>
+            <w:tcW w:type="dxa" w:w="5029"/>
+            <w:tcBorders>
+              <w:top w:val="single" w:color="C9D6DA" w:sz="4"/>
+              <w:left w:val="single" w:color="C9D6DA" w:sz="4"/>
+              <w:bottom w:val="single" w:color="C9D6DA" w:sz="4"/>
+              <w:right w:val="single" w:color="C9D6DA" w:sz="4"/>
+            </w:tcBorders>
+            <w:tcMar>
+              <w:top w:type="dxa" w:w="60"/>
+              <w:left w:type="dxa" w:w="100"/>
+              <w:bottom w:type="dxa" w:w="60"/>
+              <w:right w:type="dxa" w:w="100"/>
+            </w:tcMar>
+          </w:tcPr>
+          <w:p>
+            <w:pPr>
+              <w:spacing w:after="0" w:before="0"/>
+            </w:pPr>
+            <w:r>
+              <w:rPr>
+                <w:color w:val="222222"/>
+                <w:sz w:val="18"/>
+                <w:szCs w:val="18"/>
+              </w:rPr>
+              <w:t xml:space="preserve">Ventilación controlada por presión</w:t>
+            </w:r>
+          </w:p>
+        </w:tc>
+      </w:tr>
+      <w:tr>
+        <w:tc>
+          <w:tcPr>
+            <w:tcW w:type="dxa" w:w="4609"/>
+            <w:tcBorders>
+              <w:top w:val="single" w:color="C9D6DA" w:sz="4"/>
+              <w:left w:val="single" w:color="C9D6DA" w:sz="4"/>
+              <w:bottom w:val="single" w:color="C9D6DA" w:sz="4"/>
+              <w:right w:val="single" w:color="C9D6DA" w:sz="4"/>
+            </w:tcBorders>
+            <w:shd w:fill="F5FAFB" w:val="clear"/>
+            <w:tcMar>
+              <w:top w:type="dxa" w:w="60"/>
+              <w:left w:type="dxa" w:w="100"/>
+              <w:bottom w:type="dxa" w:w="60"/>
+              <w:right w:type="dxa" w:w="100"/>
+            </w:tcMar>
+          </w:tcPr>
+          <w:p>
+            <w:pPr>
+              <w:spacing w:after="0" w:before="0"/>
+            </w:pPr>
+            <w:r>
+              <w:rPr>
+                <w:color w:val="222222"/>
+                <w:sz w:val="18"/>
+                <w:szCs w:val="18"/>
+              </w:rPr>
               <w:t xml:space="preserve">PEEP / autoPEEP (PEEPi)</w:t>
             </w:r>
           </w:p>
@@ -21536,6 +23924,7 @@
               <w:bottom w:val="single" w:color="C9D6DA" w:sz="4"/>
               <w:right w:val="single" w:color="C9D6DA" w:sz="4"/>
             </w:tcBorders>
+            <w:shd w:fill="F5FAFB" w:val="clear"/>
             <w:tcMar>
               <w:top w:type="dxa" w:w="60"/>
               <w:left w:type="dxa" w:w="100"/>
@@ -21554,6 +23943,68 @@
                 <w:szCs w:val="18"/>
               </w:rPr>
               <w:t xml:space="preserve">Presión positiva al final de la espiración / PEEP intrínseca</w:t>
+            </w:r>
+          </w:p>
+        </w:tc>
+      </w:tr>
+      <w:tr>
+        <w:tc>
+          <w:tcPr>
+            <w:tcW w:type="dxa" w:w="4609"/>
+            <w:tcBorders>
+              <w:top w:val="single" w:color="C9D6DA" w:sz="4"/>
+              <w:left w:val="single" w:color="C9D6DA" w:sz="4"/>
+              <w:bottom w:val="single" w:color="C9D6DA" w:sz="4"/>
+              <w:right w:val="single" w:color="C9D6DA" w:sz="4"/>
+            </w:tcBorders>
+            <w:tcMar>
+              <w:top w:type="dxa" w:w="60"/>
+              <w:left w:type="dxa" w:w="100"/>
+              <w:bottom w:type="dxa" w:w="60"/>
+              <w:right w:type="dxa" w:w="100"/>
+            </w:tcMar>
+          </w:tcPr>
+          <w:p>
+            <w:pPr>
+              <w:spacing w:after="0" w:before="0"/>
+            </w:pPr>
+            <w:r>
+              <w:rPr>
+                <w:color w:val="222222"/>
+                <w:sz w:val="18"/>
+                <w:szCs w:val="18"/>
+              </w:rPr>
+              <w:t xml:space="preserve">PRVC</w:t>
+            </w:r>
+          </w:p>
+        </w:tc>
+        <w:tc>
+          <w:tcPr>
+            <w:tcW w:type="dxa" w:w="5029"/>
+            <w:tcBorders>
+              <w:top w:val="single" w:color="C9D6DA" w:sz="4"/>
+              <w:left w:val="single" w:color="C9D6DA" w:sz="4"/>
+              <w:bottom w:val="single" w:color="C9D6DA" w:sz="4"/>
+              <w:right w:val="single" w:color="C9D6DA" w:sz="4"/>
+            </w:tcBorders>
+            <w:tcMar>
+              <w:top w:type="dxa" w:w="60"/>
+              <w:left w:type="dxa" w:w="100"/>
+              <w:bottom w:type="dxa" w:w="60"/>
+              <w:right w:type="dxa" w:w="100"/>
+            </w:tcMar>
+          </w:tcPr>
+          <w:p>
+            <w:pPr>
+              <w:spacing w:after="0" w:before="0"/>
+            </w:pPr>
+            <w:r>
+              <w:rPr>
+                <w:color w:val="222222"/>
+                <w:sz w:val="18"/>
+                <w:szCs w:val="18"/>
+              </w:rPr>
+              <w:t xml:space="preserve">Presión regulada con volumen garantizado (pressure-regulated volume control)</w:t>
             </w:r>
           </w:p>
         </w:tc>

</xml_diff>